<commit_message>
docs (main): fill in TFG sections 2.2.2, 2.2.3 and draft 2.3 outline
- Add content for 2.2.2 (suites and benchmark comparisons: QASMbench,
  MQT Bench, SupermarQ, QED-C, Lubinski, Jamadagni, Q2Chemistry)
- Add content for 2.2.3 (limitations: missing Rust libs, HPC-only
  reproducibility, synthetic workloads, memory/fidelity gaps, staleness)
- Word document updated with Estado del Arte section 2.2 complete

Co-Authored-By: Claude Sonnet 4.6 <noreply@anthropic.com>
</commit_message>
<xml_diff>
--- a/Plantilla_TFG-PROYECTO(1).docx
+++ b/Plantilla_TFG-PROYECTO(1).docx
@@ -4235,7 +4235,7 @@
       <w:pPr>
         <w:pStyle w:val="Heading1"/>
       </w:pPr>
-      <w:bookmarkStart w:id="0" w:name="_Toc232007420"/>
+      <w:bookmarkStart w:id="0" w:name="_Toc232350247"/>
       <w:r>
         <w:lastRenderedPageBreak/>
         <w:t>Índice</w:t>
@@ -4282,7 +4282,7 @@
           <w:r>
             <w:fldChar w:fldCharType="separate"/>
           </w:r>
-          <w:hyperlink w:anchor="_Toc232007420" w:history="1">
+          <w:hyperlink w:anchor="_Toc232350247" w:history="1">
             <w:r>
               <w:rPr>
                 <w:rStyle w:val="Hyperlink"/>
@@ -4309,7 +4309,7 @@
                 <w:noProof/>
                 <w:webHidden/>
               </w:rPr>
-              <w:instrText xml:space="preserve"> PAGEREF _Toc232007420 \h </w:instrText>
+              <w:instrText xml:space="preserve"> PAGEREF _Toc232350247 \h </w:instrText>
             </w:r>
             <w:r>
               <w:rPr>
@@ -4356,7 +4356,7 @@
               <w14:ligatures w14:val="standardContextual"/>
             </w:rPr>
           </w:pPr>
-          <w:hyperlink w:anchor="_Toc232007421" w:history="1">
+          <w:hyperlink w:anchor="_Toc232350248" w:history="1">
             <w:r>
               <w:rPr>
                 <w:rStyle w:val="Hyperlink"/>
@@ -4383,7 +4383,7 @@
                 <w:noProof/>
                 <w:webHidden/>
               </w:rPr>
-              <w:instrText xml:space="preserve"> PAGEREF _Toc232007421 \h </w:instrText>
+              <w:instrText xml:space="preserve"> PAGEREF _Toc232350248 \h </w:instrText>
             </w:r>
             <w:r>
               <w:rPr>
@@ -4430,7 +4430,7 @@
               <w14:ligatures w14:val="standardContextual"/>
             </w:rPr>
           </w:pPr>
-          <w:hyperlink w:anchor="_Toc232007422" w:history="1">
+          <w:hyperlink w:anchor="_Toc232350249" w:history="1">
             <w:r>
               <w:rPr>
                 <w:rStyle w:val="Hyperlink"/>
@@ -4457,7 +4457,7 @@
                 <w:noProof/>
                 <w:webHidden/>
               </w:rPr>
-              <w:instrText xml:space="preserve"> PAGEREF _Toc232007422 \h </w:instrText>
+              <w:instrText xml:space="preserve"> PAGEREF _Toc232350249 \h </w:instrText>
             </w:r>
             <w:r>
               <w:rPr>
@@ -4504,7 +4504,7 @@
               <w14:ligatures w14:val="standardContextual"/>
             </w:rPr>
           </w:pPr>
-          <w:hyperlink w:anchor="_Toc232007423" w:history="1">
+          <w:hyperlink w:anchor="_Toc232350250" w:history="1">
             <w:r>
               <w:rPr>
                 <w:rStyle w:val="Hyperlink"/>
@@ -4531,7 +4531,7 @@
                 <w:noProof/>
                 <w:webHidden/>
               </w:rPr>
-              <w:instrText xml:space="preserve"> PAGEREF _Toc232007423 \h </w:instrText>
+              <w:instrText xml:space="preserve"> PAGEREF _Toc232350250 \h </w:instrText>
             </w:r>
             <w:r>
               <w:rPr>
@@ -4578,7 +4578,7 @@
               <w14:ligatures w14:val="standardContextual"/>
             </w:rPr>
           </w:pPr>
-          <w:hyperlink w:anchor="_Toc232007424" w:history="1">
+          <w:hyperlink w:anchor="_Toc232350251" w:history="1">
             <w:r>
               <w:rPr>
                 <w:rStyle w:val="Hyperlink"/>
@@ -4605,7 +4605,7 @@
                 <w:noProof/>
                 <w:webHidden/>
               </w:rPr>
-              <w:instrText xml:space="preserve"> PAGEREF _Toc232007424 \h </w:instrText>
+              <w:instrText xml:space="preserve"> PAGEREF _Toc232350251 \h </w:instrText>
             </w:r>
             <w:r>
               <w:rPr>
@@ -4652,7 +4652,7 @@
               <w14:ligatures w14:val="standardContextual"/>
             </w:rPr>
           </w:pPr>
-          <w:hyperlink w:anchor="_Toc232007425" w:history="1">
+          <w:hyperlink w:anchor="_Toc232350252" w:history="1">
             <w:r>
               <w:rPr>
                 <w:rStyle w:val="Hyperlink"/>
@@ -4680,7 +4680,7 @@
                 <w:noProof/>
                 <w:webHidden/>
               </w:rPr>
-              <w:instrText xml:space="preserve"> PAGEREF _Toc232007425 \h </w:instrText>
+              <w:instrText xml:space="preserve"> PAGEREF _Toc232350252 \h </w:instrText>
             </w:r>
             <w:r>
               <w:rPr>
@@ -4728,7 +4728,7 @@
               <w14:ligatures w14:val="standardContextual"/>
             </w:rPr>
           </w:pPr>
-          <w:hyperlink w:anchor="_Toc232007426" w:history="1">
+          <w:hyperlink w:anchor="_Toc232350253" w:history="1">
             <w:r>
               <w:rPr>
                 <w:rStyle w:val="Hyperlink"/>
@@ -4776,7 +4776,7 @@
                 <w:noProof/>
                 <w:webHidden/>
               </w:rPr>
-              <w:instrText xml:space="preserve"> PAGEREF _Toc232007426 \h </w:instrText>
+              <w:instrText xml:space="preserve"> PAGEREF _Toc232350253 \h </w:instrText>
             </w:r>
             <w:r>
               <w:rPr>
@@ -4824,7 +4824,7 @@
               <w14:ligatures w14:val="standardContextual"/>
             </w:rPr>
           </w:pPr>
-          <w:hyperlink w:anchor="_Toc232007427" w:history="1">
+          <w:hyperlink w:anchor="_Toc232350254" w:history="1">
             <w:r>
               <w:rPr>
                 <w:rStyle w:val="Hyperlink"/>
@@ -4872,7 +4872,7 @@
                 <w:noProof/>
                 <w:webHidden/>
               </w:rPr>
-              <w:instrText xml:space="preserve"> PAGEREF _Toc232007427 \h </w:instrText>
+              <w:instrText xml:space="preserve"> PAGEREF _Toc232350254 \h </w:instrText>
             </w:r>
             <w:r>
               <w:rPr>
@@ -4920,7 +4920,7 @@
               <w14:ligatures w14:val="standardContextual"/>
             </w:rPr>
           </w:pPr>
-          <w:hyperlink w:anchor="_Toc232007428" w:history="1">
+          <w:hyperlink w:anchor="_Toc232350255" w:history="1">
             <w:r>
               <w:rPr>
                 <w:rStyle w:val="Hyperlink"/>
@@ -4968,7 +4968,7 @@
                 <w:noProof/>
                 <w:webHidden/>
               </w:rPr>
-              <w:instrText xml:space="preserve"> PAGEREF _Toc232007428 \h </w:instrText>
+              <w:instrText xml:space="preserve"> PAGEREF _Toc232350255 \h </w:instrText>
             </w:r>
             <w:r>
               <w:rPr>
@@ -5016,7 +5016,7 @@
               <w14:ligatures w14:val="standardContextual"/>
             </w:rPr>
           </w:pPr>
-          <w:hyperlink w:anchor="_Toc232007429" w:history="1">
+          <w:hyperlink w:anchor="_Toc232350256" w:history="1">
             <w:r>
               <w:rPr>
                 <w:rStyle w:val="Hyperlink"/>
@@ -5064,7 +5064,7 @@
                 <w:noProof/>
                 <w:webHidden/>
               </w:rPr>
-              <w:instrText xml:space="preserve"> PAGEREF _Toc232007429 \h </w:instrText>
+              <w:instrText xml:space="preserve"> PAGEREF _Toc232350256 \h </w:instrText>
             </w:r>
             <w:r>
               <w:rPr>
@@ -5112,7 +5112,7 @@
               <w14:ligatures w14:val="standardContextual"/>
             </w:rPr>
           </w:pPr>
-          <w:hyperlink w:anchor="_Toc232007430" w:history="1">
+          <w:hyperlink w:anchor="_Toc232350257" w:history="1">
             <w:r>
               <w:rPr>
                 <w:rStyle w:val="Hyperlink"/>
@@ -5160,7 +5160,7 @@
                 <w:noProof/>
                 <w:webHidden/>
               </w:rPr>
-              <w:instrText xml:space="preserve"> PAGEREF _Toc232007430 \h </w:instrText>
+              <w:instrText xml:space="preserve"> PAGEREF _Toc232350257 \h </w:instrText>
             </w:r>
             <w:r>
               <w:rPr>
@@ -5208,7 +5208,7 @@
               <w14:ligatures w14:val="standardContextual"/>
             </w:rPr>
           </w:pPr>
-          <w:hyperlink w:anchor="_Toc232007431" w:history="1">
+          <w:hyperlink w:anchor="_Toc232350258" w:history="1">
             <w:r>
               <w:rPr>
                 <w:rStyle w:val="Hyperlink"/>
@@ -5256,7 +5256,7 @@
                 <w:noProof/>
                 <w:webHidden/>
               </w:rPr>
-              <w:instrText xml:space="preserve"> PAGEREF _Toc232007431 \h </w:instrText>
+              <w:instrText xml:space="preserve"> PAGEREF _Toc232350258 \h </w:instrText>
             </w:r>
             <w:r>
               <w:rPr>
@@ -5304,7 +5304,7 @@
               <w14:ligatures w14:val="standardContextual"/>
             </w:rPr>
           </w:pPr>
-          <w:hyperlink w:anchor="_Toc232007432" w:history="1">
+          <w:hyperlink w:anchor="_Toc232350259" w:history="1">
             <w:r>
               <w:rPr>
                 <w:rStyle w:val="Hyperlink"/>
@@ -5352,7 +5352,7 @@
                 <w:noProof/>
                 <w:webHidden/>
               </w:rPr>
-              <w:instrText xml:space="preserve"> PAGEREF _Toc232007432 \h </w:instrText>
+              <w:instrText xml:space="preserve"> PAGEREF _Toc232350259 \h </w:instrText>
             </w:r>
             <w:r>
               <w:rPr>
@@ -5400,7 +5400,7 @@
               <w14:ligatures w14:val="standardContextual"/>
             </w:rPr>
           </w:pPr>
-          <w:hyperlink w:anchor="_Toc232007433" w:history="1">
+          <w:hyperlink w:anchor="_Toc232350260" w:history="1">
             <w:r>
               <w:rPr>
                 <w:rStyle w:val="Hyperlink"/>
@@ -5448,7 +5448,7 @@
                 <w:noProof/>
                 <w:webHidden/>
               </w:rPr>
-              <w:instrText xml:space="preserve"> PAGEREF _Toc232007433 \h </w:instrText>
+              <w:instrText xml:space="preserve"> PAGEREF _Toc232350260 \h </w:instrText>
             </w:r>
             <w:r>
               <w:rPr>
@@ -5496,7 +5496,7 @@
               <w14:ligatures w14:val="standardContextual"/>
             </w:rPr>
           </w:pPr>
-          <w:hyperlink w:anchor="_Toc232007434" w:history="1">
+          <w:hyperlink w:anchor="_Toc232350261" w:history="1">
             <w:r>
               <w:rPr>
                 <w:rStyle w:val="Hyperlink"/>
@@ -5544,7 +5544,7 @@
                 <w:noProof/>
                 <w:webHidden/>
               </w:rPr>
-              <w:instrText xml:space="preserve"> PAGEREF _Toc232007434 \h </w:instrText>
+              <w:instrText xml:space="preserve"> PAGEREF _Toc232350261 \h </w:instrText>
             </w:r>
             <w:r>
               <w:rPr>
@@ -5592,7 +5592,7 @@
               <w14:ligatures w14:val="standardContextual"/>
             </w:rPr>
           </w:pPr>
-          <w:hyperlink w:anchor="_Toc232007435" w:history="1">
+          <w:hyperlink w:anchor="_Toc232350262" w:history="1">
             <w:r>
               <w:rPr>
                 <w:rStyle w:val="Hyperlink"/>
@@ -5640,7 +5640,7 @@
                 <w:noProof/>
                 <w:webHidden/>
               </w:rPr>
-              <w:instrText xml:space="preserve"> PAGEREF _Toc232007435 \h </w:instrText>
+              <w:instrText xml:space="preserve"> PAGEREF _Toc232350262 \h </w:instrText>
             </w:r>
             <w:r>
               <w:rPr>
@@ -5688,7 +5688,7 @@
               <w14:ligatures w14:val="standardContextual"/>
             </w:rPr>
           </w:pPr>
-          <w:hyperlink w:anchor="_Toc232007436" w:history="1">
+          <w:hyperlink w:anchor="_Toc232350263" w:history="1">
             <w:r>
               <w:rPr>
                 <w:rStyle w:val="Hyperlink"/>
@@ -5736,7 +5736,7 @@
                 <w:noProof/>
                 <w:webHidden/>
               </w:rPr>
-              <w:instrText xml:space="preserve"> PAGEREF _Toc232007436 \h </w:instrText>
+              <w:instrText xml:space="preserve"> PAGEREF _Toc232350263 \h </w:instrText>
             </w:r>
             <w:r>
               <w:rPr>
@@ -5784,7 +5784,7 @@
               <w14:ligatures w14:val="standardContextual"/>
             </w:rPr>
           </w:pPr>
-          <w:hyperlink w:anchor="_Toc232007437" w:history="1">
+          <w:hyperlink w:anchor="_Toc232350264" w:history="1">
             <w:r>
               <w:rPr>
                 <w:rStyle w:val="Hyperlink"/>
@@ -5832,7 +5832,7 @@
                 <w:noProof/>
                 <w:webHidden/>
               </w:rPr>
-              <w:instrText xml:space="preserve"> PAGEREF _Toc232007437 \h </w:instrText>
+              <w:instrText xml:space="preserve"> PAGEREF _Toc232350264 \h </w:instrText>
             </w:r>
             <w:r>
               <w:rPr>
@@ -5880,7 +5880,7 @@
               <w14:ligatures w14:val="standardContextual"/>
             </w:rPr>
           </w:pPr>
-          <w:hyperlink w:anchor="_Toc232007438" w:history="1">
+          <w:hyperlink w:anchor="_Toc232350265" w:history="1">
             <w:r>
               <w:rPr>
                 <w:rStyle w:val="Hyperlink"/>
@@ -5928,7 +5928,7 @@
                 <w:noProof/>
                 <w:webHidden/>
               </w:rPr>
-              <w:instrText xml:space="preserve"> PAGEREF _Toc232007438 \h </w:instrText>
+              <w:instrText xml:space="preserve"> PAGEREF _Toc232350265 \h </w:instrText>
             </w:r>
             <w:r>
               <w:rPr>
@@ -5949,6 +5949,294 @@
                 <w:webHidden/>
               </w:rPr>
               <w:t>12</w:t>
+            </w:r>
+            <w:r>
+              <w:rPr>
+                <w:noProof/>
+                <w:webHidden/>
+              </w:rPr>
+              <w:fldChar w:fldCharType="end"/>
+            </w:r>
+          </w:hyperlink>
+        </w:p>
+        <w:p>
+          <w:pPr>
+            <w:pStyle w:val="TOC3"/>
+            <w:tabs>
+              <w:tab w:val="left" w:pos="1200"/>
+              <w:tab w:val="right" w:leader="dot" w:pos="8494"/>
+            </w:tabs>
+            <w:rPr>
+              <w:rFonts w:eastAsiaTheme="minorEastAsia"/>
+              <w:noProof/>
+              <w:kern w:val="2"/>
+              <w:sz w:val="24"/>
+              <w:szCs w:val="24"/>
+              <w:lang w:val="en-US"/>
+              <w14:ligatures w14:val="standardContextual"/>
+            </w:rPr>
+          </w:pPr>
+          <w:hyperlink w:anchor="_Toc232350266" w:history="1">
+            <w:r>
+              <w:rPr>
+                <w:rStyle w:val="Hyperlink"/>
+                <w:noProof/>
+                <w:lang w:eastAsia="es-ES"/>
+              </w:rPr>
+              <w:t>2.2.1</w:t>
+            </w:r>
+            <w:r>
+              <w:rPr>
+                <w:rFonts w:eastAsiaTheme="minorEastAsia"/>
+                <w:noProof/>
+                <w:kern w:val="2"/>
+                <w:sz w:val="24"/>
+                <w:szCs w:val="24"/>
+                <w:lang w:val="en-US"/>
+                <w14:ligatures w14:val="standardContextual"/>
+              </w:rPr>
+              <w:tab/>
+            </w:r>
+            <w:r>
+              <w:rPr>
+                <w:rStyle w:val="Hyperlink"/>
+                <w:noProof/>
+                <w:lang w:eastAsia="es-ES"/>
+              </w:rPr>
+              <w:t>Métricas de evaluación de simuladores</w:t>
+            </w:r>
+            <w:r>
+              <w:rPr>
+                <w:noProof/>
+                <w:webHidden/>
+              </w:rPr>
+              <w:tab/>
+            </w:r>
+            <w:r>
+              <w:rPr>
+                <w:noProof/>
+                <w:webHidden/>
+              </w:rPr>
+              <w:fldChar w:fldCharType="begin"/>
+            </w:r>
+            <w:r>
+              <w:rPr>
+                <w:noProof/>
+                <w:webHidden/>
+              </w:rPr>
+              <w:instrText xml:space="preserve"> PAGEREF _Toc232350266 \h </w:instrText>
+            </w:r>
+            <w:r>
+              <w:rPr>
+                <w:noProof/>
+                <w:webHidden/>
+              </w:rPr>
+            </w:r>
+            <w:r>
+              <w:rPr>
+                <w:noProof/>
+                <w:webHidden/>
+              </w:rPr>
+              <w:fldChar w:fldCharType="separate"/>
+            </w:r>
+            <w:r>
+              <w:rPr>
+                <w:noProof/>
+                <w:webHidden/>
+              </w:rPr>
+              <w:t>12</w:t>
+            </w:r>
+            <w:r>
+              <w:rPr>
+                <w:noProof/>
+                <w:webHidden/>
+              </w:rPr>
+              <w:fldChar w:fldCharType="end"/>
+            </w:r>
+          </w:hyperlink>
+        </w:p>
+        <w:p>
+          <w:pPr>
+            <w:pStyle w:val="TOC3"/>
+            <w:tabs>
+              <w:tab w:val="left" w:pos="1200"/>
+              <w:tab w:val="right" w:leader="dot" w:pos="8494"/>
+            </w:tabs>
+            <w:rPr>
+              <w:rFonts w:eastAsiaTheme="minorEastAsia"/>
+              <w:noProof/>
+              <w:kern w:val="2"/>
+              <w:sz w:val="24"/>
+              <w:szCs w:val="24"/>
+              <w:lang w:val="en-US"/>
+              <w14:ligatures w14:val="standardContextual"/>
+            </w:rPr>
+          </w:pPr>
+          <w:hyperlink w:anchor="_Toc232350267" w:history="1">
+            <w:r>
+              <w:rPr>
+                <w:rStyle w:val="Hyperlink"/>
+                <w:noProof/>
+                <w:lang w:eastAsia="es-ES"/>
+              </w:rPr>
+              <w:t>2.2.2</w:t>
+            </w:r>
+            <w:r>
+              <w:rPr>
+                <w:rFonts w:eastAsiaTheme="minorEastAsia"/>
+                <w:noProof/>
+                <w:kern w:val="2"/>
+                <w:sz w:val="24"/>
+                <w:szCs w:val="24"/>
+                <w:lang w:val="en-US"/>
+                <w14:ligatures w14:val="standardContextual"/>
+              </w:rPr>
+              <w:tab/>
+            </w:r>
+            <w:r>
+              <w:rPr>
+                <w:rStyle w:val="Hyperlink"/>
+                <w:noProof/>
+                <w:lang w:eastAsia="es-ES"/>
+              </w:rPr>
+              <w:t>Suites y comparaciones entre benchmarks existentes</w:t>
+            </w:r>
+            <w:r>
+              <w:rPr>
+                <w:noProof/>
+                <w:webHidden/>
+              </w:rPr>
+              <w:tab/>
+            </w:r>
+            <w:r>
+              <w:rPr>
+                <w:noProof/>
+                <w:webHidden/>
+              </w:rPr>
+              <w:fldChar w:fldCharType="begin"/>
+            </w:r>
+            <w:r>
+              <w:rPr>
+                <w:noProof/>
+                <w:webHidden/>
+              </w:rPr>
+              <w:instrText xml:space="preserve"> PAGEREF _Toc232350267 \h </w:instrText>
+            </w:r>
+            <w:r>
+              <w:rPr>
+                <w:noProof/>
+                <w:webHidden/>
+              </w:rPr>
+            </w:r>
+            <w:r>
+              <w:rPr>
+                <w:noProof/>
+                <w:webHidden/>
+              </w:rPr>
+              <w:fldChar w:fldCharType="separate"/>
+            </w:r>
+            <w:r>
+              <w:rPr>
+                <w:noProof/>
+                <w:webHidden/>
+              </w:rPr>
+              <w:t>13</w:t>
+            </w:r>
+            <w:r>
+              <w:rPr>
+                <w:noProof/>
+                <w:webHidden/>
+              </w:rPr>
+              <w:fldChar w:fldCharType="end"/>
+            </w:r>
+          </w:hyperlink>
+        </w:p>
+        <w:p>
+          <w:pPr>
+            <w:pStyle w:val="TOC3"/>
+            <w:tabs>
+              <w:tab w:val="left" w:pos="1200"/>
+              <w:tab w:val="right" w:leader="dot" w:pos="8494"/>
+            </w:tabs>
+            <w:rPr>
+              <w:rFonts w:eastAsiaTheme="minorEastAsia"/>
+              <w:noProof/>
+              <w:kern w:val="2"/>
+              <w:sz w:val="24"/>
+              <w:szCs w:val="24"/>
+              <w:lang w:val="en-US"/>
+              <w14:ligatures w14:val="standardContextual"/>
+            </w:rPr>
+          </w:pPr>
+          <w:hyperlink w:anchor="_Toc232350268" w:history="1">
+            <w:r>
+              <w:rPr>
+                <w:rStyle w:val="Hyperlink"/>
+                <w:noProof/>
+                <w:lang w:eastAsia="es-ES"/>
+              </w:rPr>
+              <w:t>2.2.3</w:t>
+            </w:r>
+            <w:r>
+              <w:rPr>
+                <w:rFonts w:eastAsiaTheme="minorEastAsia"/>
+                <w:noProof/>
+                <w:kern w:val="2"/>
+                <w:sz w:val="24"/>
+                <w:szCs w:val="24"/>
+                <w:lang w:val="en-US"/>
+                <w14:ligatures w14:val="standardContextual"/>
+              </w:rPr>
+              <w:tab/>
+            </w:r>
+            <w:r>
+              <w:rPr>
+                <w:rStyle w:val="Hyperlink"/>
+                <w:noProof/>
+                <w:lang w:eastAsia="es-ES"/>
+              </w:rPr>
+              <w:t>Limitaciones de los benchmarks previos</w:t>
+            </w:r>
+            <w:r>
+              <w:rPr>
+                <w:noProof/>
+                <w:webHidden/>
+              </w:rPr>
+              <w:tab/>
+            </w:r>
+            <w:r>
+              <w:rPr>
+                <w:noProof/>
+                <w:webHidden/>
+              </w:rPr>
+              <w:fldChar w:fldCharType="begin"/>
+            </w:r>
+            <w:r>
+              <w:rPr>
+                <w:noProof/>
+                <w:webHidden/>
+              </w:rPr>
+              <w:instrText xml:space="preserve"> PAGEREF _Toc232350268 \h </w:instrText>
+            </w:r>
+            <w:r>
+              <w:rPr>
+                <w:noProof/>
+                <w:webHidden/>
+              </w:rPr>
+            </w:r>
+            <w:r>
+              <w:rPr>
+                <w:noProof/>
+                <w:webHidden/>
+              </w:rPr>
+              <w:fldChar w:fldCharType="separate"/>
+            </w:r>
+            <w:r>
+              <w:rPr>
+                <w:noProof/>
+                <w:webHidden/>
+              </w:rPr>
+              <w:t>13</w:t>
             </w:r>
             <w:r>
               <w:rPr>
@@ -5976,7 +6264,7 @@
               <w14:ligatures w14:val="standardContextual"/>
             </w:rPr>
           </w:pPr>
-          <w:hyperlink w:anchor="_Toc232007439" w:history="1">
+          <w:hyperlink w:anchor="_Toc232350269" w:history="1">
             <w:r>
               <w:rPr>
                 <w:rStyle w:val="Hyperlink"/>
@@ -6024,7 +6312,7 @@
                 <w:noProof/>
                 <w:webHidden/>
               </w:rPr>
-              <w:instrText xml:space="preserve"> PAGEREF _Toc232007439 \h </w:instrText>
+              <w:instrText xml:space="preserve"> PAGEREF _Toc232350269 \h </w:instrText>
             </w:r>
             <w:r>
               <w:rPr>
@@ -6044,7 +6332,311 @@
                 <w:noProof/>
                 <w:webHidden/>
               </w:rPr>
-              <w:t>12</w:t>
+              <w:t>14</w:t>
+            </w:r>
+            <w:r>
+              <w:rPr>
+                <w:noProof/>
+                <w:webHidden/>
+              </w:rPr>
+              <w:fldChar w:fldCharType="end"/>
+            </w:r>
+          </w:hyperlink>
+        </w:p>
+        <w:p>
+          <w:pPr>
+            <w:pStyle w:val="TOC3"/>
+            <w:tabs>
+              <w:tab w:val="left" w:pos="1200"/>
+              <w:tab w:val="right" w:leader="dot" w:pos="8494"/>
+            </w:tabs>
+            <w:rPr>
+              <w:rFonts w:eastAsiaTheme="minorEastAsia"/>
+              <w:noProof/>
+              <w:kern w:val="2"/>
+              <w:sz w:val="24"/>
+              <w:szCs w:val="24"/>
+              <w:lang w:val="en-US"/>
+              <w14:ligatures w14:val="standardContextual"/>
+            </w:rPr>
+          </w:pPr>
+          <w:hyperlink w:anchor="_Toc232350270" w:history="1">
+            <w:r>
+              <w:rPr>
+                <w:rStyle w:val="Hyperlink"/>
+                <w:noProof/>
+                <w:lang w:eastAsia="es-ES"/>
+              </w:rPr>
+              <w:t>2.3.1</w:t>
+            </w:r>
+            <w:r>
+              <w:rPr>
+                <w:rFonts w:eastAsiaTheme="minorEastAsia"/>
+                <w:noProof/>
+                <w:kern w:val="2"/>
+                <w:sz w:val="24"/>
+                <w:szCs w:val="24"/>
+                <w:lang w:val="en-US"/>
+                <w14:ligatures w14:val="standardContextual"/>
+              </w:rPr>
+              <w:tab/>
+            </w:r>
+            <w:r>
+              <w:rPr>
+                <w:rStyle w:val="Hyperlink"/>
+                <w:noProof/>
+                <w:lang w:eastAsia="es-ES"/>
+              </w:rPr>
+              <w:t>Rust como lenguaje de sistemas moderno</w:t>
+            </w:r>
+            <w:r>
+              <w:rPr>
+                <w:noProof/>
+                <w:webHidden/>
+              </w:rPr>
+              <w:tab/>
+            </w:r>
+            <w:r>
+              <w:rPr>
+                <w:noProof/>
+                <w:webHidden/>
+              </w:rPr>
+              <w:fldChar w:fldCharType="begin"/>
+            </w:r>
+            <w:r>
+              <w:rPr>
+                <w:noProof/>
+                <w:webHidden/>
+              </w:rPr>
+              <w:instrText xml:space="preserve"> PAGEREF _Toc232350270 \h </w:instrText>
+            </w:r>
+            <w:r>
+              <w:rPr>
+                <w:noProof/>
+                <w:webHidden/>
+              </w:rPr>
+            </w:r>
+            <w:r>
+              <w:rPr>
+                <w:noProof/>
+                <w:webHidden/>
+              </w:rPr>
+              <w:fldChar w:fldCharType="separate"/>
+            </w:r>
+            <w:r>
+              <w:rPr>
+                <w:noProof/>
+                <w:webHidden/>
+              </w:rPr>
+              <w:t>14</w:t>
+            </w:r>
+            <w:r>
+              <w:rPr>
+                <w:noProof/>
+                <w:webHidden/>
+              </w:rPr>
+              <w:fldChar w:fldCharType="end"/>
+            </w:r>
+          </w:hyperlink>
+        </w:p>
+        <w:p>
+          <w:pPr>
+            <w:pStyle w:val="TOC3"/>
+            <w:tabs>
+              <w:tab w:val="left" w:pos="1200"/>
+              <w:tab w:val="right" w:leader="dot" w:pos="8494"/>
+            </w:tabs>
+            <w:rPr>
+              <w:rFonts w:eastAsiaTheme="minorEastAsia"/>
+              <w:noProof/>
+              <w:kern w:val="2"/>
+              <w:sz w:val="24"/>
+              <w:szCs w:val="24"/>
+              <w:lang w:val="en-US"/>
+              <w14:ligatures w14:val="standardContextual"/>
+            </w:rPr>
+          </w:pPr>
+          <w:hyperlink w:anchor="_Toc232350271" w:history="1">
+            <w:r>
+              <w:rPr>
+                <w:rStyle w:val="Hyperlink"/>
+                <w:noProof/>
+                <w:lang w:eastAsia="es-ES"/>
+              </w:rPr>
+              <w:t>2.3.2</w:t>
+            </w:r>
+            <w:r>
+              <w:rPr>
+                <w:rFonts w:eastAsiaTheme="minorEastAsia"/>
+                <w:noProof/>
+                <w:kern w:val="2"/>
+                <w:sz w:val="24"/>
+                <w:szCs w:val="24"/>
+                <w:lang w:val="en-US"/>
+                <w14:ligatures w14:val="standardContextual"/>
+              </w:rPr>
+              <w:tab/>
+            </w:r>
+            <w:r>
+              <w:rPr>
+                <w:rStyle w:val="Hyperlink"/>
+                <w:noProof/>
+                <w:lang w:eastAsia="es-ES"/>
+              </w:rPr>
+              <w:t>Adopción en computación científica y HPC</w:t>
+            </w:r>
+            <w:r>
+              <w:rPr>
+                <w:noProof/>
+                <w:webHidden/>
+              </w:rPr>
+              <w:tab/>
+            </w:r>
+            <w:r>
+              <w:rPr>
+                <w:noProof/>
+                <w:webHidden/>
+              </w:rPr>
+              <w:fldChar w:fldCharType="begin"/>
+            </w:r>
+            <w:r>
+              <w:rPr>
+                <w:noProof/>
+                <w:webHidden/>
+              </w:rPr>
+              <w:instrText xml:space="preserve"> PAGEREF _Toc232350271 \h </w:instrText>
+            </w:r>
+            <w:r>
+              <w:rPr>
+                <w:noProof/>
+                <w:webHidden/>
+              </w:rPr>
+            </w:r>
+            <w:r>
+              <w:rPr>
+                <w:noProof/>
+                <w:webHidden/>
+              </w:rPr>
+              <w:fldChar w:fldCharType="separate"/>
+            </w:r>
+            <w:r>
+              <w:rPr>
+                <w:noProof/>
+                <w:webHidden/>
+              </w:rPr>
+              <w:t>14</w:t>
+            </w:r>
+            <w:r>
+              <w:rPr>
+                <w:noProof/>
+                <w:webHidden/>
+              </w:rPr>
+              <w:fldChar w:fldCharType="end"/>
+            </w:r>
+          </w:hyperlink>
+        </w:p>
+        <w:p>
+          <w:pPr>
+            <w:pStyle w:val="TOC3"/>
+            <w:tabs>
+              <w:tab w:val="left" w:pos="1200"/>
+              <w:tab w:val="right" w:leader="dot" w:pos="8494"/>
+            </w:tabs>
+            <w:rPr>
+              <w:rFonts w:eastAsiaTheme="minorEastAsia"/>
+              <w:noProof/>
+              <w:kern w:val="2"/>
+              <w:sz w:val="24"/>
+              <w:szCs w:val="24"/>
+              <w:lang w:val="en-US"/>
+              <w14:ligatures w14:val="standardContextual"/>
+            </w:rPr>
+          </w:pPr>
+          <w:hyperlink w:anchor="_Toc232350272" w:history="1">
+            <w:r>
+              <w:rPr>
+                <w:rStyle w:val="Hyperlink"/>
+                <w:noProof/>
+                <w:lang w:eastAsia="es-ES"/>
+              </w:rPr>
+              <w:t>2.3.3</w:t>
+            </w:r>
+            <w:r>
+              <w:rPr>
+                <w:rFonts w:eastAsiaTheme="minorEastAsia"/>
+                <w:noProof/>
+                <w:kern w:val="2"/>
+                <w:sz w:val="24"/>
+                <w:szCs w:val="24"/>
+                <w:lang w:val="en-US"/>
+                <w14:ligatures w14:val="standardContextual"/>
+              </w:rPr>
+              <w:tab/>
+            </w:r>
+            <w:r>
+              <w:rPr>
+                <w:rStyle w:val="Hyperlink"/>
+                <w:noProof/>
+                <w:lang w:eastAsia="es-ES"/>
+              </w:rPr>
+              <w:t xml:space="preserve">El patrón </w:t>
+            </w:r>
+            <w:r>
+              <w:rPr>
+                <w:rStyle w:val="Hyperlink"/>
+                <w:noProof/>
+                <w:lang w:eastAsia="es-ES"/>
+              </w:rPr>
+              <w:t>R</w:t>
+            </w:r>
+            <w:r>
+              <w:rPr>
+                <w:rStyle w:val="Hyperlink"/>
+                <w:noProof/>
+                <w:lang w:eastAsia="es-ES"/>
+              </w:rPr>
+              <w:t>ust + Python</w:t>
+            </w:r>
+            <w:r>
+              <w:rPr>
+                <w:noProof/>
+                <w:webHidden/>
+              </w:rPr>
+              <w:tab/>
+            </w:r>
+            <w:r>
+              <w:rPr>
+                <w:noProof/>
+                <w:webHidden/>
+              </w:rPr>
+              <w:fldChar w:fldCharType="begin"/>
+            </w:r>
+            <w:r>
+              <w:rPr>
+                <w:noProof/>
+                <w:webHidden/>
+              </w:rPr>
+              <w:instrText xml:space="preserve"> PAGEREF _Toc232350272 \h </w:instrText>
+            </w:r>
+            <w:r>
+              <w:rPr>
+                <w:noProof/>
+                <w:webHidden/>
+              </w:rPr>
+            </w:r>
+            <w:r>
+              <w:rPr>
+                <w:noProof/>
+                <w:webHidden/>
+              </w:rPr>
+              <w:fldChar w:fldCharType="separate"/>
+            </w:r>
+            <w:r>
+              <w:rPr>
+                <w:noProof/>
+                <w:webHidden/>
+              </w:rPr>
+              <w:t>14</w:t>
             </w:r>
             <w:r>
               <w:rPr>
@@ -6072,7 +6664,7 @@
               <w14:ligatures w14:val="standardContextual"/>
             </w:rPr>
           </w:pPr>
-          <w:hyperlink w:anchor="_Toc232007440" w:history="1">
+          <w:hyperlink w:anchor="_Toc232350273" w:history="1">
             <w:r>
               <w:rPr>
                 <w:rStyle w:val="Hyperlink"/>
@@ -6120,7 +6712,7 @@
                 <w:noProof/>
                 <w:webHidden/>
               </w:rPr>
-              <w:instrText xml:space="preserve"> PAGEREF _Toc232007440 \h </w:instrText>
+              <w:instrText xml:space="preserve"> PAGEREF _Toc232350273 \h </w:instrText>
             </w:r>
             <w:r>
               <w:rPr>
@@ -6140,7 +6732,7 @@
                 <w:noProof/>
                 <w:webHidden/>
               </w:rPr>
-              <w:t>12</w:t>
+              <w:t>14</w:t>
             </w:r>
             <w:r>
               <w:rPr>
@@ -6168,7 +6760,7 @@
               <w14:ligatures w14:val="standardContextual"/>
             </w:rPr>
           </w:pPr>
-          <w:hyperlink w:anchor="_Toc232007444" w:history="1">
+          <w:hyperlink w:anchor="_Toc232350277" w:history="1">
             <w:r>
               <w:rPr>
                 <w:rStyle w:val="Hyperlink"/>
@@ -6216,7 +6808,7 @@
                 <w:noProof/>
                 <w:webHidden/>
               </w:rPr>
-              <w:instrText xml:space="preserve"> PAGEREF _Toc232007444 \h </w:instrText>
+              <w:instrText xml:space="preserve"> PAGEREF _Toc232350277 \h </w:instrText>
             </w:r>
             <w:r>
               <w:rPr>
@@ -6236,7 +6828,7 @@
                 <w:noProof/>
                 <w:webHidden/>
               </w:rPr>
-              <w:t>13</w:t>
+              <w:t>14</w:t>
             </w:r>
             <w:r>
               <w:rPr>
@@ -6264,7 +6856,7 @@
               <w14:ligatures w14:val="standardContextual"/>
             </w:rPr>
           </w:pPr>
-          <w:hyperlink w:anchor="_Toc232007445" w:history="1">
+          <w:hyperlink w:anchor="_Toc232350278" w:history="1">
             <w:r>
               <w:rPr>
                 <w:rStyle w:val="Hyperlink"/>
@@ -6312,7 +6904,7 @@
                 <w:noProof/>
                 <w:webHidden/>
               </w:rPr>
-              <w:instrText xml:space="preserve"> PAGEREF _Toc232007445 \h </w:instrText>
+              <w:instrText xml:space="preserve"> PAGEREF _Toc232350278 \h </w:instrText>
             </w:r>
             <w:r>
               <w:rPr>
@@ -6332,7 +6924,7 @@
                 <w:noProof/>
                 <w:webHidden/>
               </w:rPr>
-              <w:t>13</w:t>
+              <w:t>14</w:t>
             </w:r>
             <w:r>
               <w:rPr>
@@ -6360,7 +6952,7 @@
               <w14:ligatures w14:val="standardContextual"/>
             </w:rPr>
           </w:pPr>
-          <w:hyperlink w:anchor="_Toc232007446" w:history="1">
+          <w:hyperlink w:anchor="_Toc232350279" w:history="1">
             <w:r>
               <w:rPr>
                 <w:rStyle w:val="Hyperlink"/>
@@ -6408,7 +7000,7 @@
                 <w:noProof/>
                 <w:webHidden/>
               </w:rPr>
-              <w:instrText xml:space="preserve"> PAGEREF _Toc232007446 \h </w:instrText>
+              <w:instrText xml:space="preserve"> PAGEREF _Toc232350279 \h </w:instrText>
             </w:r>
             <w:r>
               <w:rPr>
@@ -6428,7 +7020,7 @@
                 <w:noProof/>
                 <w:webHidden/>
               </w:rPr>
-              <w:t>13</w:t>
+              <w:t>14</w:t>
             </w:r>
             <w:r>
               <w:rPr>
@@ -6456,7 +7048,7 @@
               <w14:ligatures w14:val="standardContextual"/>
             </w:rPr>
           </w:pPr>
-          <w:hyperlink w:anchor="_Toc232007447" w:history="1">
+          <w:hyperlink w:anchor="_Toc232350280" w:history="1">
             <w:r>
               <w:rPr>
                 <w:rStyle w:val="Hyperlink"/>
@@ -6504,7 +7096,7 @@
                 <w:noProof/>
                 <w:webHidden/>
               </w:rPr>
-              <w:instrText xml:space="preserve"> PAGEREF _Toc232007447 \h </w:instrText>
+              <w:instrText xml:space="preserve"> PAGEREF _Toc232350280 \h </w:instrText>
             </w:r>
             <w:r>
               <w:rPr>
@@ -6524,7 +7116,7 @@
                 <w:noProof/>
                 <w:webHidden/>
               </w:rPr>
-              <w:t>13</w:t>
+              <w:t>14</w:t>
             </w:r>
             <w:r>
               <w:rPr>
@@ -6552,7 +7144,7 @@
               <w14:ligatures w14:val="standardContextual"/>
             </w:rPr>
           </w:pPr>
-          <w:hyperlink w:anchor="_Toc232007448" w:history="1">
+          <w:hyperlink w:anchor="_Toc232350281" w:history="1">
             <w:r>
               <w:rPr>
                 <w:rStyle w:val="Hyperlink"/>
@@ -6600,7 +7192,7 @@
                 <w:noProof/>
                 <w:webHidden/>
               </w:rPr>
-              <w:instrText xml:space="preserve"> PAGEREF _Toc232007448 \h </w:instrText>
+              <w:instrText xml:space="preserve"> PAGEREF _Toc232350281 \h </w:instrText>
             </w:r>
             <w:r>
               <w:rPr>
@@ -6620,7 +7212,7 @@
                 <w:noProof/>
                 <w:webHidden/>
               </w:rPr>
-              <w:t>13</w:t>
+              <w:t>14</w:t>
             </w:r>
             <w:r>
               <w:rPr>
@@ -6648,7 +7240,7 @@
               <w14:ligatures w14:val="standardContextual"/>
             </w:rPr>
           </w:pPr>
-          <w:hyperlink w:anchor="_Toc232007449" w:history="1">
+          <w:hyperlink w:anchor="_Toc232350282" w:history="1">
             <w:r>
               <w:rPr>
                 <w:rStyle w:val="Hyperlink"/>
@@ -6696,7 +7288,7 @@
                 <w:noProof/>
                 <w:webHidden/>
               </w:rPr>
-              <w:instrText xml:space="preserve"> PAGEREF _Toc232007449 \h </w:instrText>
+              <w:instrText xml:space="preserve"> PAGEREF _Toc232350282 \h </w:instrText>
             </w:r>
             <w:r>
               <w:rPr>
@@ -6716,7 +7308,7 @@
                 <w:noProof/>
                 <w:webHidden/>
               </w:rPr>
-              <w:t>13</w:t>
+              <w:t>14</w:t>
             </w:r>
             <w:r>
               <w:rPr>
@@ -6744,7 +7336,7 @@
               <w14:ligatures w14:val="standardContextual"/>
             </w:rPr>
           </w:pPr>
-          <w:hyperlink w:anchor="_Toc232007450" w:history="1">
+          <w:hyperlink w:anchor="_Toc232350283" w:history="1">
             <w:r>
               <w:rPr>
                 <w:rStyle w:val="Hyperlink"/>
@@ -6792,7 +7384,7 @@
                 <w:noProof/>
                 <w:webHidden/>
               </w:rPr>
-              <w:instrText xml:space="preserve"> PAGEREF _Toc232007450 \h </w:instrText>
+              <w:instrText xml:space="preserve"> PAGEREF _Toc232350283 \h </w:instrText>
             </w:r>
             <w:r>
               <w:rPr>
@@ -6812,7 +7404,7 @@
                 <w:noProof/>
                 <w:webHidden/>
               </w:rPr>
-              <w:t>13</w:t>
+              <w:t>14</w:t>
             </w:r>
             <w:r>
               <w:rPr>
@@ -6840,7 +7432,7 @@
               <w14:ligatures w14:val="standardContextual"/>
             </w:rPr>
           </w:pPr>
-          <w:hyperlink w:anchor="_Toc232007451" w:history="1">
+          <w:hyperlink w:anchor="_Toc232350284" w:history="1">
             <w:r>
               <w:rPr>
                 <w:rStyle w:val="Hyperlink"/>
@@ -6888,7 +7480,7 @@
                 <w:noProof/>
                 <w:webHidden/>
               </w:rPr>
-              <w:instrText xml:space="preserve"> PAGEREF _Toc232007451 \h </w:instrText>
+              <w:instrText xml:space="preserve"> PAGEREF _Toc232350284 \h </w:instrText>
             </w:r>
             <w:r>
               <w:rPr>
@@ -6908,7 +7500,7 @@
                 <w:noProof/>
                 <w:webHidden/>
               </w:rPr>
-              <w:t>13</w:t>
+              <w:t>14</w:t>
             </w:r>
             <w:r>
               <w:rPr>
@@ -6936,7 +7528,7 @@
               <w14:ligatures w14:val="standardContextual"/>
             </w:rPr>
           </w:pPr>
-          <w:hyperlink w:anchor="_Toc232007452" w:history="1">
+          <w:hyperlink w:anchor="_Toc232350285" w:history="1">
             <w:r>
               <w:rPr>
                 <w:rStyle w:val="Hyperlink"/>
@@ -6984,7 +7576,7 @@
                 <w:noProof/>
                 <w:webHidden/>
               </w:rPr>
-              <w:instrText xml:space="preserve"> PAGEREF _Toc232007452 \h </w:instrText>
+              <w:instrText xml:space="preserve"> PAGEREF _Toc232350285 \h </w:instrText>
             </w:r>
             <w:r>
               <w:rPr>
@@ -7004,7 +7596,7 @@
                 <w:noProof/>
                 <w:webHidden/>
               </w:rPr>
-              <w:t>13</w:t>
+              <w:t>14</w:t>
             </w:r>
             <w:r>
               <w:rPr>
@@ -7032,7 +7624,7 @@
               <w14:ligatures w14:val="standardContextual"/>
             </w:rPr>
           </w:pPr>
-          <w:hyperlink w:anchor="_Toc232007453" w:history="1">
+          <w:hyperlink w:anchor="_Toc232350286" w:history="1">
             <w:r>
               <w:rPr>
                 <w:rStyle w:val="Hyperlink"/>
@@ -7080,7 +7672,7 @@
                 <w:noProof/>
                 <w:webHidden/>
               </w:rPr>
-              <w:instrText xml:space="preserve"> PAGEREF _Toc232007453 \h </w:instrText>
+              <w:instrText xml:space="preserve"> PAGEREF _Toc232350286 \h </w:instrText>
             </w:r>
             <w:r>
               <w:rPr>
@@ -7100,7 +7692,7 @@
                 <w:noProof/>
                 <w:webHidden/>
               </w:rPr>
-              <w:t>13</w:t>
+              <w:t>15</w:t>
             </w:r>
             <w:r>
               <w:rPr>
@@ -7128,7 +7720,7 @@
               <w14:ligatures w14:val="standardContextual"/>
             </w:rPr>
           </w:pPr>
-          <w:hyperlink w:anchor="_Toc232007454" w:history="1">
+          <w:hyperlink w:anchor="_Toc232350287" w:history="1">
             <w:r>
               <w:rPr>
                 <w:rStyle w:val="Hyperlink"/>
@@ -7176,7 +7768,7 @@
                 <w:noProof/>
                 <w:webHidden/>
               </w:rPr>
-              <w:instrText xml:space="preserve"> PAGEREF _Toc232007454 \h </w:instrText>
+              <w:instrText xml:space="preserve"> PAGEREF _Toc232350287 \h </w:instrText>
             </w:r>
             <w:r>
               <w:rPr>
@@ -7196,7 +7788,7 @@
                 <w:noProof/>
                 <w:webHidden/>
               </w:rPr>
-              <w:t>13</w:t>
+              <w:t>15</w:t>
             </w:r>
             <w:r>
               <w:rPr>
@@ -7224,7 +7816,7 @@
               <w14:ligatures w14:val="standardContextual"/>
             </w:rPr>
           </w:pPr>
-          <w:hyperlink w:anchor="_Toc232007455" w:history="1">
+          <w:hyperlink w:anchor="_Toc232350288" w:history="1">
             <w:r>
               <w:rPr>
                 <w:rStyle w:val="Hyperlink"/>
@@ -7272,7 +7864,7 @@
                 <w:noProof/>
                 <w:webHidden/>
               </w:rPr>
-              <w:instrText xml:space="preserve"> PAGEREF _Toc232007455 \h </w:instrText>
+              <w:instrText xml:space="preserve"> PAGEREF _Toc232350288 \h </w:instrText>
             </w:r>
             <w:r>
               <w:rPr>
@@ -7292,7 +7884,7 @@
                 <w:noProof/>
                 <w:webHidden/>
               </w:rPr>
-              <w:t>13</w:t>
+              <w:t>15</w:t>
             </w:r>
             <w:r>
               <w:rPr>
@@ -7320,7 +7912,7 @@
               <w14:ligatures w14:val="standardContextual"/>
             </w:rPr>
           </w:pPr>
-          <w:hyperlink w:anchor="_Toc232007456" w:history="1">
+          <w:hyperlink w:anchor="_Toc232350289" w:history="1">
             <w:r>
               <w:rPr>
                 <w:rStyle w:val="Hyperlink"/>
@@ -7368,7 +7960,7 @@
                 <w:noProof/>
                 <w:webHidden/>
               </w:rPr>
-              <w:instrText xml:space="preserve"> PAGEREF _Toc232007456 \h </w:instrText>
+              <w:instrText xml:space="preserve"> PAGEREF _Toc232350289 \h </w:instrText>
             </w:r>
             <w:r>
               <w:rPr>
@@ -7388,7 +7980,7 @@
                 <w:noProof/>
                 <w:webHidden/>
               </w:rPr>
-              <w:t>13</w:t>
+              <w:t>15</w:t>
             </w:r>
             <w:r>
               <w:rPr>
@@ -7416,7 +8008,7 @@
               <w14:ligatures w14:val="standardContextual"/>
             </w:rPr>
           </w:pPr>
-          <w:hyperlink w:anchor="_Toc232007457" w:history="1">
+          <w:hyperlink w:anchor="_Toc232350290" w:history="1">
             <w:r>
               <w:rPr>
                 <w:rStyle w:val="Hyperlink"/>
@@ -7464,7 +8056,7 @@
                 <w:noProof/>
                 <w:webHidden/>
               </w:rPr>
-              <w:instrText xml:space="preserve"> PAGEREF _Toc232007457 \h </w:instrText>
+              <w:instrText xml:space="preserve"> PAGEREF _Toc232350290 \h </w:instrText>
             </w:r>
             <w:r>
               <w:rPr>
@@ -7484,7 +8076,7 @@
                 <w:noProof/>
                 <w:webHidden/>
               </w:rPr>
-              <w:t>13</w:t>
+              <w:t>15</w:t>
             </w:r>
             <w:r>
               <w:rPr>
@@ -7512,7 +8104,7 @@
               <w14:ligatures w14:val="standardContextual"/>
             </w:rPr>
           </w:pPr>
-          <w:hyperlink w:anchor="_Toc232007458" w:history="1">
+          <w:hyperlink w:anchor="_Toc232350291" w:history="1">
             <w:r>
               <w:rPr>
                 <w:rStyle w:val="Hyperlink"/>
@@ -7560,7 +8152,7 @@
                 <w:noProof/>
                 <w:webHidden/>
               </w:rPr>
-              <w:instrText xml:space="preserve"> PAGEREF _Toc232007458 \h </w:instrText>
+              <w:instrText xml:space="preserve"> PAGEREF _Toc232350291 \h </w:instrText>
             </w:r>
             <w:r>
               <w:rPr>
@@ -7580,7 +8172,7 @@
                 <w:noProof/>
                 <w:webHidden/>
               </w:rPr>
-              <w:t>13</w:t>
+              <w:t>15</w:t>
             </w:r>
             <w:r>
               <w:rPr>
@@ -7607,7 +8199,7 @@
               <w14:ligatures w14:val="standardContextual"/>
             </w:rPr>
           </w:pPr>
-          <w:hyperlink w:anchor="_Toc232007459" w:history="1">
+          <w:hyperlink w:anchor="_Toc232350292" w:history="1">
             <w:r>
               <w:rPr>
                 <w:rStyle w:val="Hyperlink"/>
@@ -7634,7 +8226,7 @@
                 <w:noProof/>
                 <w:webHidden/>
               </w:rPr>
-              <w:instrText xml:space="preserve"> PAGEREF _Toc232007459 \h </w:instrText>
+              <w:instrText xml:space="preserve"> PAGEREF _Toc232350292 \h </w:instrText>
             </w:r>
             <w:r>
               <w:rPr>
@@ -7654,7 +8246,7 @@
                 <w:noProof/>
                 <w:webHidden/>
               </w:rPr>
-              <w:t>13</w:t>
+              <w:t>15</w:t>
             </w:r>
             <w:r>
               <w:rPr>
@@ -7701,7 +8293,7 @@
       <w:pPr>
         <w:pStyle w:val="Heading1"/>
       </w:pPr>
-      <w:bookmarkStart w:id="1" w:name="_Toc232007421"/>
+      <w:bookmarkStart w:id="1" w:name="_Toc232350248"/>
       <w:r>
         <w:lastRenderedPageBreak/>
         <w:t>Índice de Tablas</w:t>
@@ -7746,7 +8338,7 @@
       <w:pPr>
         <w:pStyle w:val="Heading1"/>
       </w:pPr>
-      <w:bookmarkStart w:id="2" w:name="_Toc232007422"/>
+      <w:bookmarkStart w:id="2" w:name="_Toc232350249"/>
       <w:r>
         <w:lastRenderedPageBreak/>
         <w:t>Índice de Figuras</w:t>
@@ -7778,7 +8370,7 @@
       <w:pPr>
         <w:pStyle w:val="Heading1"/>
       </w:pPr>
-      <w:bookmarkStart w:id="3" w:name="_Toc232007423"/>
+      <w:bookmarkStart w:id="3" w:name="_Toc232350250"/>
       <w:r>
         <w:lastRenderedPageBreak/>
         <w:t>Objetivo</w:t>
@@ -7807,7 +8399,7 @@
       <w:pPr>
         <w:pStyle w:val="Heading1"/>
       </w:pPr>
-      <w:bookmarkStart w:id="4" w:name="_Toc232007424"/>
+      <w:bookmarkStart w:id="4" w:name="_Toc232350251"/>
       <w:r>
         <w:lastRenderedPageBreak/>
         <w:t>Resumen</w:t>
@@ -7840,7 +8432,7 @@
           <w:lang w:val="en-GB"/>
         </w:rPr>
       </w:pPr>
-      <w:bookmarkStart w:id="5" w:name="_Toc232007425"/>
+      <w:bookmarkStart w:id="5" w:name="_Toc232350252"/>
       <w:commentRangeStart w:id="6"/>
       <w:r>
         <w:rPr>
@@ -7875,7 +8467,8 @@
           <w:lang w:eastAsia="es-ES"/>
         </w:rPr>
         <w:sectPr>
-          <w:footerReference w:type="default" r:id="rId14"/>
+          <w:headerReference w:type="default" r:id="rId14"/>
+          <w:footerReference w:type="default" r:id="rId15"/>
           <w:type w:val="oddPage"/>
           <w:pgSz w:w="11906" w:h="16838"/>
           <w:pgMar w:top="1417" w:right="1701" w:bottom="1417" w:left="1701" w:header="708" w:footer="708" w:gutter="0"/>
@@ -7903,7 +8496,7 @@
           <w:lang w:eastAsia="es-ES"/>
         </w:rPr>
       </w:pPr>
-      <w:bookmarkStart w:id="7" w:name="_Toc232007426"/>
+      <w:bookmarkStart w:id="7" w:name="_Toc232350253"/>
       <w:r>
         <w:rPr>
           <w:lang w:eastAsia="es-ES"/>
@@ -7924,7 +8517,7 @@
           <w:lang w:eastAsia="es-ES"/>
         </w:rPr>
       </w:pPr>
-      <w:bookmarkStart w:id="8" w:name="_Toc232007427"/>
+      <w:bookmarkStart w:id="8" w:name="_Toc232350254"/>
       <w:r>
         <w:rPr>
           <w:lang w:eastAsia="es-ES"/>
@@ -7970,7 +8563,7 @@
           <w:lang w:eastAsia="es-ES"/>
         </w:rPr>
       </w:pPr>
-      <w:bookmarkStart w:id="9" w:name="_Toc232007428"/>
+      <w:bookmarkStart w:id="9" w:name="_Toc232350255"/>
       <w:r>
         <w:rPr>
           <w:lang w:eastAsia="es-ES"/>
@@ -8029,7 +8622,7 @@
           <w:lang w:eastAsia="es-ES"/>
         </w:rPr>
       </w:pPr>
-      <w:bookmarkStart w:id="10" w:name="_Toc232007429"/>
+      <w:bookmarkStart w:id="10" w:name="_Toc232350256"/>
       <w:r>
         <w:rPr>
           <w:lang w:eastAsia="es-ES"/>
@@ -8062,7 +8655,7 @@
           <w:lang w:eastAsia="es-ES"/>
         </w:rPr>
       </w:pPr>
-      <w:bookmarkStart w:id="11" w:name="_Toc232007430"/>
+      <w:bookmarkStart w:id="11" w:name="_Toc232350257"/>
       <w:r>
         <w:rPr>
           <w:lang w:eastAsia="es-ES"/>
@@ -8122,7 +8715,7 @@
           <w:lang w:eastAsia="es-ES"/>
         </w:rPr>
       </w:pPr>
-      <w:bookmarkStart w:id="12" w:name="_Toc232007431"/>
+      <w:bookmarkStart w:id="12" w:name="_Toc232350258"/>
       <w:r>
         <w:rPr>
           <w:lang w:eastAsia="es-ES"/>
@@ -8148,7 +8741,7 @@
           <w:lang w:eastAsia="es-ES"/>
         </w:rPr>
       </w:pPr>
-      <w:bookmarkStart w:id="13" w:name="_Toc232007432"/>
+      <w:bookmarkStart w:id="13" w:name="_Toc232350259"/>
       <w:r>
         <w:rPr>
           <w:lang w:eastAsia="es-ES"/>
@@ -8168,7 +8761,7 @@
           <w:lang w:eastAsia="es-ES"/>
         </w:rPr>
       </w:pPr>
-      <w:bookmarkStart w:id="14" w:name="_Toc232007433"/>
+      <w:bookmarkStart w:id="14" w:name="_Toc232350260"/>
       <w:r>
         <w:rPr>
           <w:lang w:eastAsia="es-ES"/>
@@ -8841,7 +9434,7 @@
           <w:lang w:eastAsia="es-ES"/>
         </w:rPr>
       </w:pPr>
-      <w:bookmarkStart w:id="15" w:name="_Toc232007434"/>
+      <w:bookmarkStart w:id="15" w:name="_Toc232350261"/>
       <w:r>
         <w:rPr>
           <w:lang w:eastAsia="es-ES"/>
@@ -8901,7 +9494,7 @@
           <w:lang w:eastAsia="es-ES"/>
         </w:rPr>
       </w:pPr>
-      <w:bookmarkStart w:id="16" w:name="_Toc232007435"/>
+      <w:bookmarkStart w:id="16" w:name="_Toc232350262"/>
       <w:r>
         <w:rPr>
           <w:lang w:eastAsia="es-ES"/>
@@ -9025,7 +9618,7 @@
           <w:lang w:eastAsia="es-ES"/>
         </w:rPr>
       </w:pPr>
-      <w:bookmarkStart w:id="17" w:name="_Toc232007436"/>
+      <w:bookmarkStart w:id="17" w:name="_Toc232350263"/>
       <w:r>
         <w:rPr>
           <w:lang w:eastAsia="es-ES"/>
@@ -9199,7 +9792,7 @@
           <w:lang w:eastAsia="es-ES"/>
         </w:rPr>
       </w:pPr>
-      <w:bookmarkStart w:id="18" w:name="_Toc232007437"/>
+      <w:bookmarkStart w:id="18" w:name="_Toc232350264"/>
       <w:r>
         <w:rPr>
           <w:lang w:eastAsia="es-ES"/>
@@ -9298,7 +9891,7 @@
           <w:lang w:eastAsia="es-ES"/>
         </w:rPr>
       </w:pPr>
-      <w:bookmarkStart w:id="19" w:name="_Toc232007438"/>
+      <w:bookmarkStart w:id="19" w:name="_Toc232350265"/>
       <w:r>
         <w:rPr>
           <w:lang w:eastAsia="es-ES"/>
@@ -9318,12 +9911,14 @@
           <w:lang w:eastAsia="es-ES"/>
         </w:rPr>
       </w:pPr>
+      <w:bookmarkStart w:id="20" w:name="_Toc232350266"/>
       <w:r>
         <w:rPr>
           <w:lang w:eastAsia="es-ES"/>
         </w:rPr>
         <w:t>Métricas de evaluación de simuladores</w:t>
       </w:r>
+      <w:bookmarkEnd w:id="20"/>
     </w:p>
     <w:p>
       <w:pPr>
@@ -9395,6 +9990,7 @@
           <w:lang w:eastAsia="es-ES"/>
         </w:rPr>
       </w:pPr>
+      <w:bookmarkStart w:id="21" w:name="_Toc232350267"/>
       <w:r>
         <w:rPr>
           <w:lang w:eastAsia="es-ES"/>
@@ -9407,6 +10003,7 @@
         </w:rPr>
         <w:t>entre benchmarks existentes</w:t>
       </w:r>
+      <w:bookmarkEnd w:id="21"/>
     </w:p>
     <w:p>
       <w:pPr>
@@ -9507,12 +10104,14 @@
           <w:lang w:eastAsia="es-ES"/>
         </w:rPr>
       </w:pPr>
+      <w:bookmarkStart w:id="22" w:name="_Toc232350268"/>
       <w:r>
         <w:rPr>
           <w:lang w:eastAsia="es-ES"/>
         </w:rPr>
         <w:t>Limitaciones de los benchmarks previos</w:t>
       </w:r>
+      <w:bookmarkEnd w:id="22"/>
     </w:p>
     <w:p>
       <w:pPr>
@@ -9565,7 +10164,6 @@
           <w:lang w:eastAsia="es-ES"/>
         </w:rPr>
       </w:pPr>
-      <w:bookmarkStart w:id="20" w:name="_Toc232007439"/>
       <w:r>
         <w:rPr>
           <w:lang w:eastAsia="es-ES"/>
@@ -9597,13 +10195,14 @@
           <w:lang w:eastAsia="es-ES"/>
         </w:rPr>
       </w:pPr>
+      <w:bookmarkStart w:id="23" w:name="_Toc232350269"/>
       <w:r>
         <w:rPr>
           <w:lang w:eastAsia="es-ES"/>
         </w:rPr>
         <w:t>Rust en computación de alto rendimiento</w:t>
       </w:r>
-      <w:bookmarkEnd w:id="20"/>
+      <w:bookmarkEnd w:id="23"/>
     </w:p>
     <w:p>
       <w:pPr>
@@ -9616,11 +10215,53 @@
           <w:lang w:eastAsia="es-ES"/>
         </w:rPr>
       </w:pPr>
+      <w:bookmarkStart w:id="24" w:name="_Toc232350270"/>
       <w:r>
         <w:rPr>
           <w:lang w:eastAsia="es-ES"/>
         </w:rPr>
         <w:t>Rust como lenguaje de sistemas moderno</w:t>
+      </w:r>
+      <w:bookmarkEnd w:id="24"/>
+    </w:p>
+    <w:p>
+      <w:pPr>
+        <w:rPr>
+          <w:lang w:eastAsia="es-ES"/>
+        </w:rPr>
+      </w:pPr>
+      <w:bookmarkStart w:id="25" w:name="_Toc232350271"/>
+      <w:r>
+        <w:rPr>
+          <w:lang w:eastAsia="es-ES"/>
+        </w:rPr>
+        <w:t>Rust nació como proyecto personal de Graydon Hoare en 2006 y más tarde fue adoptado por Mozilla en 2010. Nació con el expreso propósito de superar a C++ sin sacrificar rendimiento. Lo consiguió principalmente resolviendo un problema común en los lenguajes de alto nivel: la tensión entre control y seguridad, sin necesidad de utilizar recolector de basura.</w:t>
+      </w:r>
+    </w:p>
+    <w:p>
+      <w:pPr>
+        <w:rPr>
+          <w:lang w:eastAsia="es-ES"/>
+        </w:rPr>
+      </w:pPr>
+      <w:r>
+        <w:rPr>
+          <w:lang w:eastAsia="es-ES"/>
+        </w:rPr>
+        <w:t>Rust usa un modelo de propiedad y préstamo de referencia en el que la memoria se gestiona en tiempo de compilación, lo que elimina problemas comunes como use-after-free, double-free y data races, ya que las variables solo pueden estar en dos estados: o bien solo puede acceder a ellas un proceso y son mutables, o bien pueden acceder a ellas varios procesos y son inmutables. Además, está diseñado de forma que las abstracciones (genéricos, iteradores, etc.) se resuelven en la compilación mediante monomorfismo, por lo que no suponen un coste extra en tiempo de ejecución.</w:t>
+      </w:r>
+    </w:p>
+    <w:p>
+      <w:pPr>
+        <w:rPr>
+          <w:lang w:eastAsia="es-ES"/>
+        </w:rPr>
+      </w:pPr>
+      <w:r>
+        <w:rPr>
+          <w:lang w:eastAsia="es-ES"/>
+        </w:rPr>
+        <w:t>En cuanto a su rendimiento, en los benchmarks de Bugden y Alahmar (2022), este lenguaje gana en dos métricas de CPU y es segundo solo tras C en consumo de memoria.</w:t>
       </w:r>
     </w:p>
     <w:p>
@@ -9640,6 +10281,60 @@
         </w:rPr>
         <w:t>Adopción en computación científica y HPC</w:t>
       </w:r>
+      <w:bookmarkEnd w:id="25"/>
+      <w:r>
+        <w:rPr>
+          <w:lang w:eastAsia="es-ES"/>
+        </w:rPr>
+        <w:t xml:space="preserve"> (High Performance Computing)</w:t>
+      </w:r>
+    </w:p>
+    <w:p>
+      <w:pPr>
+        <w:rPr>
+          <w:lang w:eastAsia="es-ES"/>
+        </w:rPr>
+      </w:pPr>
+      <w:bookmarkStart w:id="26" w:name="_Toc232350272"/>
+      <w:r>
+        <w:rPr>
+          <w:lang w:eastAsia="es-ES"/>
+        </w:rPr>
+        <w:t>Tradicionalmente, Fortran y C han dominado el HPC, pero Rust se presenta como una alternativa al ofrecer seguridad de memoria garantizada en la compilación con un control de memoria equivalente al de C. Se nota que está teniendo una buena acogida por parte de la comunidad, ya que ha ganado el premio «most loved language» de Stack Overflow durante ocho años consecutivos (2016-2023) y ha sido adoptado por Mozilla, Discord, Dropbox y Meta.</w:t>
+      </w:r>
+    </w:p>
+    <w:p>
+      <w:pPr>
+        <w:rPr>
+          <w:lang w:eastAsia="es-ES"/>
+        </w:rPr>
+      </w:pPr>
+      <w:r>
+        <w:rPr>
+          <w:lang w:eastAsia="es-ES"/>
+        </w:rPr>
+        <w:t xml:space="preserve">La clave del HPC es el paralelismo y, aunque Rust lo soporta de forma nativa, su biblioteca Rayon, conocida por convertir elementos secuenciales, como iteradores, en procesos paralelos con work-stealing, lo simplifica tanto que es capaz de competir con C en HPC sin depender de OpenMP. Según el estudio de Constanzo et al. (2021), quienes compararon implementaciones equivalentes de una simulación N-body gravitacional en Rust y C sobre un servidor de 112 hilos, Rust alcanza un rendimiento comparable al de C cuando se aplican las mismas </w:t>
+      </w:r>
+      <w:r>
+        <w:rPr>
+          <w:lang w:eastAsia="es-ES"/>
+        </w:rPr>
+        <w:lastRenderedPageBreak/>
+        <w:t>optimizaciones de paralelismo y vectorización, incluida la librería Rayon, que le proporciona una aceleración de 50x con respecto a su rendimiento en serie.</w:t>
+      </w:r>
+    </w:p>
+    <w:p>
+      <w:pPr>
+        <w:rPr>
+          <w:lang w:eastAsia="es-ES"/>
+        </w:rPr>
+      </w:pPr>
+      <w:r>
+        <w:rPr>
+          <w:lang w:eastAsia="es-ES"/>
+        </w:rPr>
+        <w:t>Como detalle adicional, la eliminación de las carreras de datos es una ventaja directa en el código paralelo de HPC, ya que elimina muchos errores difíciles de solucionar.</w:t>
+      </w:r>
     </w:p>
     <w:p>
       <w:pPr>
@@ -9658,6 +10353,47 @@
         </w:rPr>
         <w:t>El patrón Rust + Python</w:t>
       </w:r>
+      <w:bookmarkEnd w:id="26"/>
+    </w:p>
+    <w:p>
+      <w:pPr>
+        <w:rPr>
+          <w:lang w:eastAsia="es-ES"/>
+        </w:rPr>
+      </w:pPr>
+      <w:bookmarkStart w:id="27" w:name="_Toc232350273"/>
+      <w:r>
+        <w:rPr>
+          <w:lang w:eastAsia="es-ES"/>
+        </w:rPr>
+        <w:t>El ecosistema científico está dominado por Python gracias a sus librerías especializadas (NumPy, SciPy, Qiskit), pero este lenguaje no puede alcanzar nativamente el rendimiento requerido para HPC debido al GIL, que básicamente imposibilita el paralelismo, y a la sobrecarga del intérprete, que es muy alta porque las operaciones resultan más caras que en otros lenguajes.</w:t>
+      </w:r>
+    </w:p>
+    <w:p>
+      <w:pPr>
+        <w:rPr>
+          <w:lang w:eastAsia="es-ES"/>
+        </w:rPr>
+      </w:pPr>
+      <w:r>
+        <w:rPr>
+          <w:lang w:eastAsia="es-ES"/>
+        </w:rPr>
+        <w:t>El estándar de facto para exponer código Rust como módulo Python es Maturin: Py03 define los vínculos y Maturin compila y empaqueta la extensión como un archivo wheel, lo que minimiza el coste de la interoperación y permite que Python ejecute código eficiente sin pasar por el GIL ni por el recolector de basura. De hecho, varias de las librerías de simulación cuántica en Rust que hemos probado en este proyecto (qcgpu y quantr) cuentan con una API de Python construida sobre este patrón.</w:t>
+      </w:r>
+    </w:p>
+    <w:p>
+      <w:pPr>
+        <w:rPr>
+          <w:lang w:eastAsia="es-ES"/>
+        </w:rPr>
+      </w:pPr>
+      <w:r>
+        <w:rPr>
+          <w:lang w:eastAsia="es-ES"/>
+        </w:rPr>
+        <w:t>Sin embargo, en este proyecto no utilizamos este patrón; tanto los simuladores en Python como los de Rust se ejecutan como subprocesos invocados por un orquestador. Los segundos están precompilados como binarios e invocados desde ese estado y se comunican mediante JSON a través de la salida estándar. Si bien es cierto que este enfoque sacrifica la ergonomía, se trata de una decisión deliberada con el objetivo de conseguir un aislamiento total de procesos. De este modo, las mediciones de su rendimiento, como el tiempo de ejecución o el consumo de memoria, reflejan exclusivamente el simulador y evitan la interferencia del orquestador.</w:t>
+      </w:r>
     </w:p>
     <w:p>
       <w:pPr>
@@ -9670,14 +10406,13 @@
           <w:lang w:eastAsia="es-ES"/>
         </w:rPr>
       </w:pPr>
-      <w:bookmarkStart w:id="21" w:name="_Toc232007440"/>
       <w:r>
         <w:rPr>
           <w:lang w:eastAsia="es-ES"/>
         </w:rPr>
         <w:t>Especificaciones y requisitos</w:t>
       </w:r>
-      <w:bookmarkEnd w:id="21"/>
+      <w:bookmarkEnd w:id="27"/>
     </w:p>
     <w:p>
       <w:pPr>
@@ -9715,30 +10450,25 @@
           <w:lang w:eastAsia="es-ES"/>
         </w:rPr>
       </w:pPr>
-      <w:bookmarkStart w:id="22" w:name="_Toc168583625"/>
-      <w:bookmarkStart w:id="23" w:name="_Toc168583821"/>
-      <w:bookmarkStart w:id="24" w:name="_Toc168583866"/>
-      <w:bookmarkStart w:id="25" w:name="_Toc168597653"/>
-      <w:bookmarkStart w:id="26" w:name="_Toc168597721"/>
-      <w:bookmarkStart w:id="27" w:name="_Toc168597809"/>
-      <w:bookmarkStart w:id="28" w:name="_Toc176021962"/>
-      <w:bookmarkStart w:id="29" w:name="_Toc176033754"/>
-      <w:bookmarkStart w:id="30" w:name="_Toc176545420"/>
-      <w:bookmarkStart w:id="31" w:name="_Toc176545538"/>
-      <w:bookmarkStart w:id="32" w:name="_Toc178184322"/>
-      <w:bookmarkStart w:id="33" w:name="_Toc180936425"/>
-      <w:bookmarkStart w:id="34" w:name="_Toc199320919"/>
-      <w:bookmarkStart w:id="35" w:name="_Toc199321317"/>
-      <w:bookmarkStart w:id="36" w:name="_Toc199321529"/>
-      <w:bookmarkStart w:id="37" w:name="_Toc199321566"/>
-      <w:bookmarkStart w:id="38" w:name="_Toc231644271"/>
-      <w:bookmarkStart w:id="39" w:name="_Toc232007441"/>
-      <w:bookmarkEnd w:id="22"/>
-      <w:bookmarkEnd w:id="23"/>
-      <w:bookmarkEnd w:id="24"/>
-      <w:bookmarkEnd w:id="25"/>
-      <w:bookmarkEnd w:id="26"/>
-      <w:bookmarkEnd w:id="27"/>
+      <w:bookmarkStart w:id="28" w:name="_Toc168583625"/>
+      <w:bookmarkStart w:id="29" w:name="_Toc168583821"/>
+      <w:bookmarkStart w:id="30" w:name="_Toc168583866"/>
+      <w:bookmarkStart w:id="31" w:name="_Toc168597653"/>
+      <w:bookmarkStart w:id="32" w:name="_Toc168597721"/>
+      <w:bookmarkStart w:id="33" w:name="_Toc168597809"/>
+      <w:bookmarkStart w:id="34" w:name="_Toc176021962"/>
+      <w:bookmarkStart w:id="35" w:name="_Toc176033754"/>
+      <w:bookmarkStart w:id="36" w:name="_Toc176545420"/>
+      <w:bookmarkStart w:id="37" w:name="_Toc176545538"/>
+      <w:bookmarkStart w:id="38" w:name="_Toc178184322"/>
+      <w:bookmarkStart w:id="39" w:name="_Toc180936425"/>
+      <w:bookmarkStart w:id="40" w:name="_Toc199320919"/>
+      <w:bookmarkStart w:id="41" w:name="_Toc199321317"/>
+      <w:bookmarkStart w:id="42" w:name="_Toc199321529"/>
+      <w:bookmarkStart w:id="43" w:name="_Toc199321566"/>
+      <w:bookmarkStart w:id="44" w:name="_Toc231644271"/>
+      <w:bookmarkStart w:id="45" w:name="_Toc232007441"/>
+      <w:bookmarkStart w:id="46" w:name="_Toc232350274"/>
       <w:bookmarkEnd w:id="28"/>
       <w:bookmarkEnd w:id="29"/>
       <w:bookmarkEnd w:id="30"/>
@@ -9751,6 +10481,13 @@
       <w:bookmarkEnd w:id="37"/>
       <w:bookmarkEnd w:id="38"/>
       <w:bookmarkEnd w:id="39"/>
+      <w:bookmarkEnd w:id="40"/>
+      <w:bookmarkEnd w:id="41"/>
+      <w:bookmarkEnd w:id="42"/>
+      <w:bookmarkEnd w:id="43"/>
+      <w:bookmarkEnd w:id="44"/>
+      <w:bookmarkEnd w:id="45"/>
+      <w:bookmarkEnd w:id="46"/>
     </w:p>
     <w:p>
       <w:pPr>
@@ -9774,31 +10511,25 @@
           <w:lang w:eastAsia="es-ES"/>
         </w:rPr>
       </w:pPr>
-      <w:bookmarkStart w:id="40" w:name="_Toc168583626"/>
-      <w:bookmarkStart w:id="41" w:name="_Toc168583822"/>
-      <w:bookmarkStart w:id="42" w:name="_Toc168583867"/>
-      <w:bookmarkStart w:id="43" w:name="_Toc168597654"/>
-      <w:bookmarkStart w:id="44" w:name="_Toc168597722"/>
-      <w:bookmarkStart w:id="45" w:name="_Toc168597810"/>
-      <w:bookmarkStart w:id="46" w:name="_Toc176021963"/>
-      <w:bookmarkStart w:id="47" w:name="_Toc176033755"/>
-      <w:bookmarkStart w:id="48" w:name="_Toc176545421"/>
-      <w:bookmarkStart w:id="49" w:name="_Toc176545539"/>
-      <w:bookmarkStart w:id="50" w:name="_Toc178184323"/>
-      <w:bookmarkStart w:id="51" w:name="_Toc180936426"/>
-      <w:bookmarkStart w:id="52" w:name="_Toc199320920"/>
-      <w:bookmarkStart w:id="53" w:name="_Toc199321318"/>
-      <w:bookmarkStart w:id="54" w:name="_Toc199321530"/>
-      <w:bookmarkStart w:id="55" w:name="_Toc199321567"/>
-      <w:bookmarkStart w:id="56" w:name="_Toc231644272"/>
-      <w:bookmarkStart w:id="57" w:name="_Toc232007442"/>
-      <w:bookmarkEnd w:id="40"/>
-      <w:bookmarkEnd w:id="41"/>
-      <w:bookmarkEnd w:id="42"/>
-      <w:bookmarkEnd w:id="43"/>
-      <w:bookmarkEnd w:id="44"/>
-      <w:bookmarkEnd w:id="45"/>
-      <w:bookmarkEnd w:id="46"/>
+      <w:bookmarkStart w:id="47" w:name="_Toc168583626"/>
+      <w:bookmarkStart w:id="48" w:name="_Toc168583822"/>
+      <w:bookmarkStart w:id="49" w:name="_Toc168583867"/>
+      <w:bookmarkStart w:id="50" w:name="_Toc168597654"/>
+      <w:bookmarkStart w:id="51" w:name="_Toc168597722"/>
+      <w:bookmarkStart w:id="52" w:name="_Toc168597810"/>
+      <w:bookmarkStart w:id="53" w:name="_Toc176021963"/>
+      <w:bookmarkStart w:id="54" w:name="_Toc176033755"/>
+      <w:bookmarkStart w:id="55" w:name="_Toc176545421"/>
+      <w:bookmarkStart w:id="56" w:name="_Toc176545539"/>
+      <w:bookmarkStart w:id="57" w:name="_Toc178184323"/>
+      <w:bookmarkStart w:id="58" w:name="_Toc180936426"/>
+      <w:bookmarkStart w:id="59" w:name="_Toc199320920"/>
+      <w:bookmarkStart w:id="60" w:name="_Toc199321318"/>
+      <w:bookmarkStart w:id="61" w:name="_Toc199321530"/>
+      <w:bookmarkStart w:id="62" w:name="_Toc199321567"/>
+      <w:bookmarkStart w:id="63" w:name="_Toc231644272"/>
+      <w:bookmarkStart w:id="64" w:name="_Toc232007442"/>
+      <w:bookmarkStart w:id="65" w:name="_Toc232350275"/>
       <w:bookmarkEnd w:id="47"/>
       <w:bookmarkEnd w:id="48"/>
       <w:bookmarkEnd w:id="49"/>
@@ -9810,6 +10541,14 @@
       <w:bookmarkEnd w:id="55"/>
       <w:bookmarkEnd w:id="56"/>
       <w:bookmarkEnd w:id="57"/>
+      <w:bookmarkEnd w:id="58"/>
+      <w:bookmarkEnd w:id="59"/>
+      <w:bookmarkEnd w:id="60"/>
+      <w:bookmarkEnd w:id="61"/>
+      <w:bookmarkEnd w:id="62"/>
+      <w:bookmarkEnd w:id="63"/>
+      <w:bookmarkEnd w:id="64"/>
+      <w:bookmarkEnd w:id="65"/>
     </w:p>
     <w:p>
       <w:pPr>
@@ -9833,32 +10572,25 @@
           <w:lang w:eastAsia="es-ES"/>
         </w:rPr>
       </w:pPr>
-      <w:bookmarkStart w:id="58" w:name="_Toc168583627"/>
-      <w:bookmarkStart w:id="59" w:name="_Toc168583823"/>
-      <w:bookmarkStart w:id="60" w:name="_Toc168583868"/>
-      <w:bookmarkStart w:id="61" w:name="_Toc168597655"/>
-      <w:bookmarkStart w:id="62" w:name="_Toc168597723"/>
-      <w:bookmarkStart w:id="63" w:name="_Toc168597811"/>
-      <w:bookmarkStart w:id="64" w:name="_Toc176021964"/>
-      <w:bookmarkStart w:id="65" w:name="_Toc176033756"/>
-      <w:bookmarkStart w:id="66" w:name="_Toc176545422"/>
-      <w:bookmarkStart w:id="67" w:name="_Toc176545540"/>
-      <w:bookmarkStart w:id="68" w:name="_Toc178184324"/>
-      <w:bookmarkStart w:id="69" w:name="_Toc180936427"/>
-      <w:bookmarkStart w:id="70" w:name="_Toc199320921"/>
-      <w:bookmarkStart w:id="71" w:name="_Toc199321319"/>
-      <w:bookmarkStart w:id="72" w:name="_Toc199321531"/>
-      <w:bookmarkStart w:id="73" w:name="_Toc199321568"/>
-      <w:bookmarkStart w:id="74" w:name="_Toc231644273"/>
-      <w:bookmarkStart w:id="75" w:name="_Toc232007443"/>
-      <w:bookmarkEnd w:id="58"/>
-      <w:bookmarkEnd w:id="59"/>
-      <w:bookmarkEnd w:id="60"/>
-      <w:bookmarkEnd w:id="61"/>
-      <w:bookmarkEnd w:id="62"/>
-      <w:bookmarkEnd w:id="63"/>
-      <w:bookmarkEnd w:id="64"/>
-      <w:bookmarkEnd w:id="65"/>
+      <w:bookmarkStart w:id="66" w:name="_Toc168583627"/>
+      <w:bookmarkStart w:id="67" w:name="_Toc168583823"/>
+      <w:bookmarkStart w:id="68" w:name="_Toc168583868"/>
+      <w:bookmarkStart w:id="69" w:name="_Toc168597655"/>
+      <w:bookmarkStart w:id="70" w:name="_Toc168597723"/>
+      <w:bookmarkStart w:id="71" w:name="_Toc168597811"/>
+      <w:bookmarkStart w:id="72" w:name="_Toc176021964"/>
+      <w:bookmarkStart w:id="73" w:name="_Toc176033756"/>
+      <w:bookmarkStart w:id="74" w:name="_Toc176545422"/>
+      <w:bookmarkStart w:id="75" w:name="_Toc176545540"/>
+      <w:bookmarkStart w:id="76" w:name="_Toc178184324"/>
+      <w:bookmarkStart w:id="77" w:name="_Toc180936427"/>
+      <w:bookmarkStart w:id="78" w:name="_Toc199320921"/>
+      <w:bookmarkStart w:id="79" w:name="_Toc199321319"/>
+      <w:bookmarkStart w:id="80" w:name="_Toc199321531"/>
+      <w:bookmarkStart w:id="81" w:name="_Toc199321568"/>
+      <w:bookmarkStart w:id="82" w:name="_Toc231644273"/>
+      <w:bookmarkStart w:id="83" w:name="_Toc232007443"/>
+      <w:bookmarkStart w:id="84" w:name="_Toc232350276"/>
       <w:bookmarkEnd w:id="66"/>
       <w:bookmarkEnd w:id="67"/>
       <w:bookmarkEnd w:id="68"/>
@@ -9869,6 +10601,15 @@
       <w:bookmarkEnd w:id="73"/>
       <w:bookmarkEnd w:id="74"/>
       <w:bookmarkEnd w:id="75"/>
+      <w:bookmarkEnd w:id="76"/>
+      <w:bookmarkEnd w:id="77"/>
+      <w:bookmarkEnd w:id="78"/>
+      <w:bookmarkEnd w:id="79"/>
+      <w:bookmarkEnd w:id="80"/>
+      <w:bookmarkEnd w:id="81"/>
+      <w:bookmarkEnd w:id="82"/>
+      <w:bookmarkEnd w:id="83"/>
+      <w:bookmarkEnd w:id="84"/>
     </w:p>
     <w:p>
       <w:pPr>
@@ -9881,14 +10622,14 @@
           <w:lang w:eastAsia="es-ES"/>
         </w:rPr>
       </w:pPr>
-      <w:bookmarkStart w:id="76" w:name="_Toc232007444"/>
+      <w:bookmarkStart w:id="85" w:name="_Toc232350277"/>
       <w:r>
         <w:rPr>
           <w:lang w:eastAsia="es-ES"/>
         </w:rPr>
         <w:t>Especificaciones del sistema</w:t>
       </w:r>
-      <w:bookmarkEnd w:id="76"/>
+      <w:bookmarkEnd w:id="85"/>
     </w:p>
     <w:p>
       <w:pPr>
@@ -9901,14 +10642,14 @@
           <w:lang w:eastAsia="es-ES"/>
         </w:rPr>
       </w:pPr>
-      <w:bookmarkStart w:id="77" w:name="_Toc232007445"/>
+      <w:bookmarkStart w:id="86" w:name="_Toc232350278"/>
       <w:r>
         <w:rPr>
           <w:lang w:eastAsia="es-ES"/>
         </w:rPr>
         <w:t>Requisitos del sistema</w:t>
       </w:r>
-      <w:bookmarkEnd w:id="77"/>
+      <w:bookmarkEnd w:id="86"/>
     </w:p>
     <w:p>
       <w:pPr>
@@ -9921,14 +10662,14 @@
           <w:lang w:eastAsia="es-ES"/>
         </w:rPr>
       </w:pPr>
-      <w:bookmarkStart w:id="78" w:name="_Toc232007446"/>
+      <w:bookmarkStart w:id="87" w:name="_Toc232350279"/>
       <w:r>
         <w:rPr>
           <w:lang w:eastAsia="es-ES"/>
         </w:rPr>
         <w:t>Especificación de las pruebas</w:t>
       </w:r>
-      <w:bookmarkEnd w:id="78"/>
+      <w:bookmarkEnd w:id="87"/>
     </w:p>
     <w:p>
       <w:pPr>
@@ -9941,14 +10682,14 @@
           <w:lang w:eastAsia="es-ES"/>
         </w:rPr>
       </w:pPr>
-      <w:bookmarkStart w:id="79" w:name="_Toc232007447"/>
+      <w:bookmarkStart w:id="88" w:name="_Toc232350280"/>
       <w:r>
         <w:rPr>
           <w:lang w:eastAsia="es-ES"/>
         </w:rPr>
         <w:t>Herramientas utilizadas</w:t>
       </w:r>
-      <w:bookmarkEnd w:id="79"/>
+      <w:bookmarkEnd w:id="88"/>
     </w:p>
     <w:p>
       <w:pPr>
@@ -9961,14 +10702,14 @@
           <w:lang w:eastAsia="es-ES"/>
         </w:rPr>
       </w:pPr>
-      <w:bookmarkStart w:id="80" w:name="_Toc232007448"/>
+      <w:bookmarkStart w:id="89" w:name="_Toc232350281"/>
       <w:r>
         <w:rPr>
           <w:lang w:eastAsia="es-ES"/>
         </w:rPr>
         <w:t>Desarrollo del Proyecto</w:t>
       </w:r>
-      <w:bookmarkEnd w:id="80"/>
+      <w:bookmarkEnd w:id="89"/>
     </w:p>
     <w:p>
       <w:pPr>
@@ -9981,7 +10722,7 @@
           <w:lang w:eastAsia="es-ES"/>
         </w:rPr>
       </w:pPr>
-      <w:bookmarkStart w:id="81" w:name="_Toc232007449"/>
+      <w:bookmarkStart w:id="90" w:name="_Toc232350282"/>
       <w:r>
         <w:rPr>
           <w:lang w:eastAsia="es-ES"/>
@@ -9994,7 +10735,7 @@
         </w:rPr>
         <w:t>1:</w:t>
       </w:r>
-      <w:bookmarkEnd w:id="81"/>
+      <w:bookmarkEnd w:id="90"/>
       <w:r>
         <w:rPr>
           <w:lang w:eastAsia="es-ES"/>
@@ -10013,7 +10754,7 @@
           <w:lang w:eastAsia="es-ES"/>
         </w:rPr>
       </w:pPr>
-      <w:bookmarkStart w:id="82" w:name="_Toc232007450"/>
+      <w:bookmarkStart w:id="91" w:name="_Toc232350283"/>
       <w:r>
         <w:rPr>
           <w:lang w:eastAsia="es-ES"/>
@@ -10026,7 +10767,7 @@
         </w:rPr>
         <w:t>2:</w:t>
       </w:r>
-      <w:bookmarkEnd w:id="82"/>
+      <w:bookmarkEnd w:id="91"/>
     </w:p>
     <w:p>
       <w:pPr>
@@ -10039,14 +10780,14 @@
           <w:lang w:eastAsia="es-ES"/>
         </w:rPr>
       </w:pPr>
-      <w:bookmarkStart w:id="83" w:name="_Toc232007451"/>
+      <w:bookmarkStart w:id="92" w:name="_Toc232350284"/>
       <w:r>
         <w:rPr>
           <w:lang w:eastAsia="es-ES"/>
         </w:rPr>
         <w:t>Hito (añadir los hitos necesarios)</w:t>
       </w:r>
-      <w:bookmarkEnd w:id="83"/>
+      <w:bookmarkEnd w:id="92"/>
     </w:p>
     <w:p>
       <w:pPr>
@@ -10059,7 +10800,7 @@
           <w:lang w:eastAsia="es-ES"/>
         </w:rPr>
       </w:pPr>
-      <w:bookmarkStart w:id="84" w:name="_Toc232007452"/>
+      <w:bookmarkStart w:id="93" w:name="_Toc232350285"/>
       <w:r>
         <w:rPr>
           <w:lang w:eastAsia="es-ES"/>
@@ -10072,7 +10813,7 @@
         </w:rPr>
         <w:t>alidación del proyecto</w:t>
       </w:r>
-      <w:bookmarkEnd w:id="84"/>
+      <w:bookmarkEnd w:id="93"/>
     </w:p>
     <w:p>
       <w:pPr>
@@ -10092,12 +10833,11 @@
           <w:lang w:eastAsia="es-ES"/>
         </w:rPr>
       </w:pPr>
-      <w:bookmarkStart w:id="85" w:name="_Toc232007453"/>
+      <w:bookmarkStart w:id="94" w:name="_Toc232350286"/>
       <w:r>
         <w:rPr>
           <w:lang w:eastAsia="es-ES"/>
         </w:rPr>
-        <w:lastRenderedPageBreak/>
         <w:t>Planificación</w:t>
       </w:r>
       <w:r>
@@ -10142,7 +10882,7 @@
         </w:rPr>
         <w:t xml:space="preserve"> proyecto</w:t>
       </w:r>
-      <w:bookmarkEnd w:id="85"/>
+      <w:bookmarkEnd w:id="94"/>
     </w:p>
     <w:p>
       <w:pPr>
@@ -10155,14 +10895,14 @@
           <w:lang w:eastAsia="es-ES"/>
         </w:rPr>
       </w:pPr>
-      <w:bookmarkStart w:id="86" w:name="_Toc232007454"/>
+      <w:bookmarkStart w:id="95" w:name="_Toc232350287"/>
       <w:r>
         <w:rPr>
           <w:lang w:eastAsia="es-ES"/>
         </w:rPr>
         <w:t>Impacto social y medioambiental</w:t>
       </w:r>
-      <w:bookmarkEnd w:id="86"/>
+      <w:bookmarkEnd w:id="95"/>
     </w:p>
     <w:p>
       <w:pPr>
@@ -10175,14 +10915,14 @@
           <w:lang w:eastAsia="es-ES"/>
         </w:rPr>
       </w:pPr>
-      <w:bookmarkStart w:id="87" w:name="_Toc232007455"/>
+      <w:bookmarkStart w:id="96" w:name="_Toc232350288"/>
       <w:r>
         <w:rPr>
           <w:lang w:eastAsia="es-ES"/>
         </w:rPr>
         <w:t>Conclusiones</w:t>
       </w:r>
-      <w:bookmarkEnd w:id="87"/>
+      <w:bookmarkEnd w:id="96"/>
     </w:p>
     <w:p>
       <w:pPr>
@@ -10195,14 +10935,14 @@
           <w:lang w:eastAsia="es-ES"/>
         </w:rPr>
       </w:pPr>
-      <w:bookmarkStart w:id="88" w:name="_Toc232007456"/>
+      <w:bookmarkStart w:id="97" w:name="_Toc232350289"/>
       <w:r>
         <w:rPr>
           <w:lang w:eastAsia="es-ES"/>
         </w:rPr>
         <w:t>Líneas futuras</w:t>
       </w:r>
-      <w:bookmarkEnd w:id="88"/>
+      <w:bookmarkEnd w:id="97"/>
     </w:p>
     <w:p>
       <w:pPr>
@@ -10215,14 +10955,14 @@
           <w:lang w:eastAsia="es-ES"/>
         </w:rPr>
       </w:pPr>
-      <w:bookmarkStart w:id="89" w:name="_Toc232007457"/>
+      <w:bookmarkStart w:id="98" w:name="_Toc232350290"/>
       <w:r>
         <w:rPr>
           <w:lang w:eastAsia="es-ES"/>
         </w:rPr>
         <w:t>Glosario de términos</w:t>
       </w:r>
-      <w:bookmarkEnd w:id="89"/>
+      <w:bookmarkEnd w:id="98"/>
     </w:p>
     <w:p>
       <w:pPr>
@@ -10235,16 +10975,16 @@
           <w:lang w:eastAsia="es-ES"/>
         </w:rPr>
       </w:pPr>
-      <w:bookmarkStart w:id="90" w:name="_Toc232007458"/>
+      <w:bookmarkStart w:id="99" w:name="_Toc232350291"/>
       <w:r>
         <w:rPr>
           <w:lang w:eastAsia="es-ES"/>
         </w:rPr>
         <w:t>Anexos</w:t>
       </w:r>
-      <w:bookmarkEnd w:id="90"/>
+      <w:bookmarkEnd w:id="99"/>
     </w:p>
-    <w:bookmarkStart w:id="91" w:name="_Toc232007459" w:displacedByCustomXml="next"/>
+    <w:bookmarkStart w:id="100" w:name="_Toc232350292" w:displacedByCustomXml="next"/>
     <w:sdt>
       <w:sdtPr>
         <w:rPr>
@@ -10268,7 +11008,7 @@
           <w:r>
             <w:t>Bibliografía</w:t>
           </w:r>
-          <w:bookmarkEnd w:id="91"/>
+          <w:bookmarkEnd w:id="100"/>
         </w:p>
         <w:sdt>
           <w:sdtPr>
@@ -10276,7 +11016,7 @@
             <w:bibliography/>
           </w:sdtPr>
           <w:sdtContent>
-            <w:commentRangeStart w:id="92" w:displacedByCustomXml="prev"/>
+            <w:commentRangeStart w:id="101" w:displacedByCustomXml="prev"/>
             <w:p>
               <w:pPr>
                 <w:rPr>
@@ -10438,6 +11178,7 @@
                       <w:rPr>
                         <w:noProof/>
                       </w:rPr>
+                      <w:lastRenderedPageBreak/>
                       <w:t xml:space="preserve">[3] </w:t>
                     </w:r>
                   </w:p>
@@ -10534,14 +11275,14 @@
                 </w:rPr>
                 <w:fldChar w:fldCharType="end"/>
               </w:r>
-              <w:commentRangeEnd w:id="92"/>
+              <w:commentRangeEnd w:id="101"/>
               <w:r>
                 <w:rPr>
                   <w:rStyle w:val="CommentReference"/>
                   <w:sz w:val="22"/>
                   <w:szCs w:val="22"/>
                 </w:rPr>
-                <w:commentReference w:id="92"/>
+                <w:commentReference w:id="101"/>
               </w:r>
             </w:p>
           </w:sdtContent>
@@ -10602,7 +11343,7 @@
       </w:r>
     </w:p>
   </w:comment>
-  <w:comment w:id="92" w:author="SERGIO GIL BORRAS" w:date="2024-09-07T10:27:00Z" w:initials="SGB">
+  <w:comment w:id="101" w:author="SERGIO GIL BORRAS" w:date="2024-09-07T10:27:00Z" w:initials="SGB">
     <w:p>
       <w:pPr>
         <w:pStyle w:val="CommentText"/>
@@ -10838,6 +11579,16 @@
     </w:p>
   </w:footnote>
 </w:footnotes>
+</file>
+
+<file path=word/header1.xml><?xml version="1.0" encoding="utf-8"?>
+<w:hdr xmlns:wpc="http://schemas.microsoft.com/office/word/2010/wordprocessingCanvas" xmlns:cx="http://schemas.microsoft.com/office/drawing/2014/chartex" xmlns:cx1="http://schemas.microsoft.com/office/drawing/2015/9/8/chartex" xmlns:cx2="http://schemas.microsoft.com/office/drawing/2015/10/21/chartex" xmlns:cx3="http://schemas.microsoft.com/office/drawing/2016/5/9/chartex" xmlns:cx4="http://schemas.microsoft.com/office/drawing/2016/5/10/chartex" xmlns:cx5="http://schemas.microsoft.com/office/drawing/2016/5/11/chartex" xmlns:cx6="http://schemas.microsoft.com/office/drawing/2016/5/12/chartex" xmlns:cx7="http://schemas.microsoft.com/office/drawing/2016/5/13/chartex" xmlns:cx8="http://schemas.microsoft.com/office/drawing/2016/5/14/chartex" xmlns:mc="http://schemas.openxmlformats.org/markup-compatibility/2006" xmlns:aink="http://schemas.microsoft.com/office/drawing/2016/ink" xmlns:am3d="http://schemas.microsoft.com/office/drawing/2017/model3d" xmlns:o="urn:schemas-microsoft-com:office:office" xmlns:oel="http://schemas.microsoft.com/office/2019/extlst" xmlns:r="http://schemas.openxmlformats.org/officeDocument/2006/relationships" xmlns:m="http://schemas.openxmlformats.org/officeDocument/2006/math" xmlns:v="urn:schemas-microsoft-com:vml" xmlns:wp14="http://schemas.microsoft.com/office/word/2010/wordprocessingDrawing" xmlns:wp="http://schemas.openxmlformats.org/drawingml/2006/wordprocessingDrawing" xmlns:w10="urn:schemas-microsoft-com:office:word" xmlns:w="http://schemas.openxmlformats.org/wordprocessingml/2006/main" xmlns:w14="http://schemas.microsoft.com/office/word/2010/wordml" xmlns:w15="http://schemas.microsoft.com/office/word/2012/wordml" xmlns:w16cex="http://schemas.microsoft.com/office/word/2018/wordml/cex" xmlns:w16cid="http://schemas.microsoft.com/office/word/2016/wordml/cid" xmlns:w16="http://schemas.microsoft.com/office/word/2018/wordml" xmlns:w16du="http://schemas.microsoft.com/office/word/2023/wordml/word16du" xmlns:w16sdtdh="http://schemas.microsoft.com/office/word/2020/wordml/sdtdatahash" xmlns:w16sdtfl="http://schemas.microsoft.com/office/word/2024/wordml/sdtformatlock" xmlns:w16se="http://schemas.microsoft.com/office/word/2015/wordml/symex" xmlns:wpg="http://schemas.microsoft.com/office/word/2010/wordprocessingGroup" xmlns:wpi="http://schemas.microsoft.com/office/word/2010/wordprocessingInk" xmlns:wne="http://schemas.microsoft.com/office/word/2006/wordml" xmlns:wps="http://schemas.microsoft.com/office/word/2010/wordprocessingShape" mc:Ignorable="w14 w15 w16se w16cid w16 w16cex w16sdtdh w16sdtfl w16du wp14">
+  <w:p>
+    <w:pPr>
+      <w:pStyle w:val="Header"/>
+    </w:pPr>
+  </w:p>
+</w:hdr>
 </file>
 
 <file path=word/numbering.xml><?xml version="1.0" encoding="utf-8"?>

</xml_diff>

<commit_message>
feat (main): add inter-pass thermal cooldown and raise default reps to 30
- Add sentinel file `results/.last_pass_end` written at end of each run
- On startup, detect if a previous pass ended < 600s ago and sleep the remainder
- Cooldown is automatic for any hardware config combo (GPU/CPU, native/emulated)
- Change --n-reps default from 10 to 30 for statistically substantial results
- Shots remain at 1024 (standard 2^10 quantum measurement count)

Co-Authored-By: Claude Sonnet 4.6 <noreply@anthropic.com>
</commit_message>
<xml_diff>
--- a/Plantilla_TFG-PROYECTO(1).docx
+++ b/Plantilla_TFG-PROYECTO(1).docx
@@ -10349,8 +10349,28 @@
             <w:rFonts w:ascii="Cambria Math" w:hAnsi="Cambria Math"/>
             <w:lang w:eastAsia="es-ES"/>
           </w:rPr>
-          <m:t>O(n)</m:t>
+          <m:t>O</m:t>
         </m:r>
+        <m:d>
+          <m:dPr>
+            <m:ctrlPr>
+              <w:rPr>
+                <w:rFonts w:ascii="Cambria Math" w:hAnsi="Cambria Math"/>
+                <w:i/>
+                <w:lang w:eastAsia="es-ES"/>
+              </w:rPr>
+            </m:ctrlPr>
+          </m:dPr>
+          <m:e>
+            <m:r>
+              <w:rPr>
+                <w:rFonts w:ascii="Cambria Math" w:hAnsi="Cambria Math"/>
+                <w:lang w:eastAsia="es-ES"/>
+              </w:rPr>
+              <m:t>n</m:t>
+            </m:r>
+          </m:e>
+        </m:d>
       </m:oMath>
       <w:r>
         <w:rPr>
@@ -11779,6 +11799,203 @@
     </w:p>
     <w:p>
       <w:pPr>
+        <w:rPr>
+          <w:lang w:eastAsia="es-ES"/>
+        </w:rPr>
+      </w:pPr>
+      <w:r>
+        <w:rPr>
+          <w:lang w:eastAsia="es-ES"/>
+        </w:rPr>
+        <w:t>Qiskit es el framework de computación cuántica de IBM y el simulador de referencia del proyecto. Constituye su columna vertebral. Su modelo permite representar circuitos cuánticos como secuencias de puertas que actúan sobre registros de qubits, traducirlos posteriormente a un formato ejecutable mediante un proceso de transpilación y, por último, simular el resultado sobre hardware convencional sin necesidad de acceder a procesadores cuánticos reales. El proyecto adopta la versión 2.0. Esta versión consolida las primitivas SamplerV2 y EstimatorV2 como la única interfaz de ejecución canónica y traslada el núcleo interno a Rust para mejorar el rendimiento. El simulador se proporciona por separado: qiskit-aer.</w:t>
+      </w:r>
+    </w:p>
+    <w:p>
+      <w:pPr>
+        <w:rPr>
+          <w:lang w:eastAsia="es-ES"/>
+        </w:rPr>
+      </w:pPr>
+      <w:r>
+        <w:rPr>
+          <w:lang w:eastAsia="es-ES"/>
+        </w:rPr>
+        <w:t>El conjunto está compuesto por dos componentes. El paquete qiskit reúne la representación del circuito, las puertas y el sistema de transpilación gobernado por el PassManager, mientras que qiskit-aer es el simulador de alto rendimiento escrito en C++/CUDA que implementa, entre otras cosas, el método del vector de estado. Durante la transpilación, el proyecto fija el nivel de optimización en 1 para que las optimizaciones del compilador no acaben dominando el tiempo medido y emplea SamplerV2 como primitiva de muestreo. Precisamente esa frontera nítida entre la construcción del circuito, la transpilación y la simulación es lo que hace que Qiskit sea idóneo para un benchmark comparativo, ya que cada fase se mide de forma independiente como build_time, startup_time y simulation_time.</w:t>
+      </w:r>
+    </w:p>
+    <w:p>
+      <w:pPr>
+        <w:rPr>
+          <w:lang w:eastAsia="es-ES"/>
+        </w:rPr>
+      </w:pPr>
+      <w:r>
+        <w:rPr>
+          <w:lang w:eastAsia="es-ES"/>
+        </w:rPr>
+        <w:t xml:space="preserve">El método de vector de estado almacena </w:t>
+      </w:r>
+      <m:oMath>
+        <m:sSup>
+          <m:sSupPr>
+            <m:ctrlPr>
+              <w:rPr>
+                <w:rFonts w:ascii="Cambria Math" w:hAnsi="Cambria Math"/>
+                <w:i/>
+                <w:lang w:eastAsia="es-ES"/>
+              </w:rPr>
+            </m:ctrlPr>
+          </m:sSupPr>
+          <m:e>
+            <m:r>
+              <w:rPr>
+                <w:rFonts w:ascii="Cambria Math" w:hAnsi="Cambria Math"/>
+                <w:lang w:eastAsia="es-ES"/>
+              </w:rPr>
+              <m:t>2</m:t>
+            </m:r>
+          </m:e>
+          <m:sup>
+            <m:r>
+              <w:rPr>
+                <w:rFonts w:ascii="Cambria Math" w:hAnsi="Cambria Math"/>
+                <w:lang w:eastAsia="es-ES"/>
+              </w:rPr>
+              <m:t>n</m:t>
+            </m:r>
+          </m:sup>
+        </m:sSup>
+      </m:oMath>
+      <w:r>
+        <w:rPr>
+          <w:lang w:eastAsia="es-ES"/>
+        </w:rPr>
+        <w:t xml:space="preserve"> números complejos de 128 bits. La memoria crece sin freno: 20 qubits requieren 16 MB, 25 qubits necesitan 512 MB y 30 qubits consumen 16 GB. Sin embargo, para Shor, el cuello de botella verdadero reside en la profundidad del circuito, con </w:t>
+      </w:r>
+      <m:oMath>
+        <m:r>
+          <w:rPr>
+            <w:rFonts w:ascii="Cambria Math" w:hAnsi="Cambria Math"/>
+            <w:lang w:eastAsia="es-ES"/>
+          </w:rPr>
+          <m:t>O</m:t>
+        </m:r>
+        <m:d>
+          <m:dPr>
+            <m:ctrlPr>
+              <w:rPr>
+                <w:rFonts w:ascii="Cambria Math" w:hAnsi="Cambria Math"/>
+                <w:i/>
+                <w:lang w:eastAsia="es-ES"/>
+              </w:rPr>
+            </m:ctrlPr>
+          </m:dPr>
+          <m:e>
+            <m:sSup>
+              <m:sSupPr>
+                <m:ctrlPr>
+                  <w:rPr>
+                    <w:rFonts w:ascii="Cambria Math" w:hAnsi="Cambria Math"/>
+                    <w:i/>
+                    <w:lang w:eastAsia="es-ES"/>
+                  </w:rPr>
+                </m:ctrlPr>
+              </m:sSupPr>
+              <m:e>
+                <m:r>
+                  <w:rPr>
+                    <w:rFonts w:ascii="Cambria Math" w:hAnsi="Cambria Math"/>
+                    <w:lang w:eastAsia="es-ES"/>
+                  </w:rPr>
+                  <m:t>n</m:t>
+                </m:r>
+              </m:e>
+              <m:sup>
+                <m:r>
+                  <w:rPr>
+                    <w:rFonts w:ascii="Cambria Math" w:hAnsi="Cambria Math"/>
+                    <w:lang w:eastAsia="es-ES"/>
+                  </w:rPr>
+                  <m:t>3</m:t>
+                </m:r>
+              </m:sup>
+            </m:sSup>
+          </m:e>
+        </m:d>
+        <m:r>
+          <w:rPr>
+            <w:rFonts w:ascii="Cambria Math" w:hAnsi="Cambria Math"/>
+            <w:lang w:eastAsia="es-ES"/>
+          </w:rPr>
+          <m:t xml:space="preserve"> </m:t>
+        </m:r>
+      </m:oMath>
+      <w:r>
+        <w:rPr>
+          <w:lang w:eastAsia="es-ES"/>
+        </w:rPr>
+        <w:t xml:space="preserve">puertas y un coste de </w:t>
+      </w:r>
+      <m:oMath>
+        <m:r>
+          <w:rPr>
+            <w:rFonts w:ascii="Cambria Math" w:hAnsi="Cambria Math"/>
+            <w:lang w:eastAsia="es-ES"/>
+          </w:rPr>
+          <m:t>O</m:t>
+        </m:r>
+        <m:d>
+          <m:dPr>
+            <m:ctrlPr>
+              <w:rPr>
+                <w:rFonts w:ascii="Cambria Math" w:hAnsi="Cambria Math"/>
+                <w:i/>
+                <w:lang w:eastAsia="es-ES"/>
+              </w:rPr>
+            </m:ctrlPr>
+          </m:dPr>
+          <m:e>
+            <m:sSup>
+              <m:sSupPr>
+                <m:ctrlPr>
+                  <w:rPr>
+                    <w:rFonts w:ascii="Cambria Math" w:hAnsi="Cambria Math"/>
+                    <w:i/>
+                    <w:lang w:eastAsia="es-ES"/>
+                  </w:rPr>
+                </m:ctrlPr>
+              </m:sSupPr>
+              <m:e>
+                <m:r>
+                  <w:rPr>
+                    <w:rFonts w:ascii="Cambria Math" w:hAnsi="Cambria Math"/>
+                    <w:lang w:eastAsia="es-ES"/>
+                  </w:rPr>
+                  <m:t>2</m:t>
+                </m:r>
+              </m:e>
+              <m:sup>
+                <m:r>
+                  <w:rPr>
+                    <w:rFonts w:ascii="Cambria Math" w:hAnsi="Cambria Math"/>
+                    <w:lang w:eastAsia="es-ES"/>
+                  </w:rPr>
+                  <m:t>n</m:t>
+                </m:r>
+              </m:sup>
+            </m:sSup>
+          </m:e>
+        </m:d>
+      </m:oMath>
+      <w:r>
+        <w:rPr>
+          <w:lang w:eastAsia="es-ES"/>
+        </w:rPr>
+        <w:t xml:space="preserve"> por cada una sobre el vector de estado, lo que limita de manera significativa los valores de N que pueden factorizarse en un tiempo razonable.</w:t>
+      </w:r>
+    </w:p>
+    <w:p>
+      <w:pPr>
         <w:pStyle w:val="Heading4"/>
         <w:numPr>
           <w:ilvl w:val="3"/>
@@ -11797,6 +12014,156 @@
     </w:p>
     <w:p>
       <w:pPr>
+        <w:rPr>
+          <w:lang w:eastAsia="es-ES"/>
+        </w:rPr>
+      </w:pPr>
+      <w:r>
+        <w:rPr>
+          <w:lang w:eastAsia="es-ES"/>
+        </w:rPr>
+        <w:t>Cirq es el framework de computación cuántica de Google Quantum AI. Su filosofía es NISQ-first. Esto significa que el programador tiene un control explícito sobre la colocación de las puertas y sobre el orden temporal de las operaciones, sin que haya una transpilación implícita entre lo descrito y lo ejecutado. Lo que se escribe es lo que se ejecuta.</w:t>
+      </w:r>
+    </w:p>
+    <w:p>
+      <w:pPr>
+        <w:rPr>
+          <w:lang w:eastAsia="es-ES"/>
+        </w:rPr>
+      </w:pPr>
+      <w:r>
+        <w:rPr>
+          <w:lang w:eastAsia="es-ES"/>
+        </w:rPr>
+        <w:t xml:space="preserve">El Moment es la unidad básica del modelo de circuito: una capa temporal en la que todas las operaciones transcurren de forma simultánea. Los qubits, lejos de ser índices de un registro, son objetos de Python de primera clase, como LineQubit o NamedQubit. Conviene prestar atención a la convención de endianness, ya que Cirq adopta big-endian y trata </w:t>
+      </w:r>
+      <m:oMath>
+        <m:r>
+          <w:rPr>
+            <w:rFonts w:ascii="Cambria Math" w:hAnsi="Cambria Math"/>
+            <w:lang w:eastAsia="es-ES"/>
+          </w:rPr>
+          <m:t>LineQubit</m:t>
+        </m:r>
+        <m:d>
+          <m:dPr>
+            <m:ctrlPr>
+              <w:rPr>
+                <w:rFonts w:ascii="Cambria Math" w:hAnsi="Cambria Math"/>
+                <w:i/>
+                <w:lang w:eastAsia="es-ES"/>
+              </w:rPr>
+            </m:ctrlPr>
+          </m:dPr>
+          <m:e>
+            <m:r>
+              <w:rPr>
+                <w:rFonts w:ascii="Cambria Math" w:hAnsi="Cambria Math"/>
+                <w:lang w:eastAsia="es-ES"/>
+              </w:rPr>
+              <m:t>0</m:t>
+            </m:r>
+          </m:e>
+        </m:d>
+      </m:oMath>
+      <w:r>
+        <w:rPr>
+          <w:lang w:eastAsia="es-ES"/>
+        </w:rPr>
+        <w:t xml:space="preserve"> como el bit más significativo, por lo que para comparar resultados entre frameworks es necesario invertir los bitstrings antes de realizar cualquier contraste. El simulador cirq.Simulator conserva el vector de amplitudes complejo con una precisión de 64 bits y sin ruido, y arranca con un peso mínimo, por debajo de los 5 ms, lo que aísla la fase de simulación dentro de la medición con notable limpieza.</w:t>
+      </w:r>
+    </w:p>
+    <w:p>
+      <w:pPr>
+        <w:rPr>
+          <w:lang w:eastAsia="es-ES"/>
+        </w:rPr>
+      </w:pPr>
+      <w:r>
+        <w:rPr>
+          <w:lang w:eastAsia="es-ES"/>
+        </w:rPr>
+        <w:t>Para Shor, Cirq aporta la función</w:t>
+      </w:r>
+      <w:r>
+        <w:rPr>
+          <w:lang w:eastAsia="es-ES"/>
+        </w:rPr>
+        <w:t xml:space="preserve"> cirq.ArithmeticGate</w:t>
+      </w:r>
+      <w:r>
+        <w:rPr>
+          <w:lang w:eastAsia="es-ES"/>
+        </w:rPr>
+        <w:t xml:space="preserve">, un mecanismo en el que basta con especificar la acción clásica de una puerta para que el simulador cree la puerta unitaria completa por sí mismo, evitando así la necesidad de descomponer la aritmética cuántica en puertas primitivas. Para Grover, la puerta </w:t>
+      </w:r>
+      <m:oMath>
+        <m:r>
+          <w:rPr>
+            <w:rFonts w:ascii="Cambria Math" w:hAnsi="Cambria Math"/>
+            <w:lang w:eastAsia="es-ES"/>
+          </w:rPr>
+          <m:t>cirq.Z.controlled</m:t>
+        </m:r>
+        <m:d>
+          <m:dPr>
+            <m:ctrlPr>
+              <w:rPr>
+                <w:rFonts w:ascii="Cambria Math" w:hAnsi="Cambria Math"/>
+                <w:i/>
+                <w:lang w:eastAsia="es-ES"/>
+              </w:rPr>
+            </m:ctrlPr>
+          </m:dPr>
+          <m:e>
+            <m:sSub>
+              <m:sSubPr>
+                <m:ctrlPr>
+                  <w:rPr>
+                    <w:rFonts w:ascii="Cambria Math" w:hAnsi="Cambria Math"/>
+                    <w:i/>
+                    <w:lang w:eastAsia="es-ES"/>
+                  </w:rPr>
+                </m:ctrlPr>
+              </m:sSubPr>
+              <m:e>
+                <m:r>
+                  <w:rPr>
+                    <w:rFonts w:ascii="Cambria Math" w:hAnsi="Cambria Math"/>
+                    <w:lang w:eastAsia="es-ES"/>
+                  </w:rPr>
+                  <m:t>n</m:t>
+                </m:r>
+              </m:e>
+              <m:sub>
+                <m:r>
+                  <w:rPr>
+                    <w:rFonts w:ascii="Cambria Math" w:hAnsi="Cambria Math"/>
+                    <w:lang w:eastAsia="es-ES"/>
+                  </w:rPr>
+                  <m:t>controls</m:t>
+                </m:r>
+              </m:sub>
+            </m:sSub>
+            <m:r>
+              <w:rPr>
+                <w:rFonts w:ascii="Cambria Math" w:hAnsi="Cambria Math"/>
+                <w:lang w:eastAsia="es-ES"/>
+              </w:rPr>
+              <m:t>=n-1</m:t>
+            </m:r>
+          </m:e>
+        </m:d>
+      </m:oMath>
+      <w:r>
+        <w:rPr>
+          <w:lang w:eastAsia="es-ES"/>
+        </w:rPr>
+        <w:t xml:space="preserve"> levanta la Z multi-controlada sin necesidad de qubits ancilla y reduce el recuento de qubits en una unidad frente al enfoque habitual. Sin transpilación automática de por medio, el tiempo de construcción solo refleja la creación de estructuras Python.</w:t>
+      </w:r>
+    </w:p>
+    <w:p>
+      <w:pPr>
         <w:pStyle w:val="Heading4"/>
         <w:numPr>
           <w:ilvl w:val="3"/>
@@ -11810,7 +12177,97 @@
         <w:rPr>
           <w:lang w:eastAsia="es-ES"/>
         </w:rPr>
+        <w:lastRenderedPageBreak/>
         <w:t>CudaQ</w:t>
+      </w:r>
+    </w:p>
+    <w:p>
+      <w:pPr>
+        <w:rPr>
+          <w:lang w:eastAsia="es-ES"/>
+        </w:rPr>
+      </w:pPr>
+      <w:r>
+        <w:rPr>
+          <w:lang w:eastAsia="es-ES"/>
+        </w:rPr>
+        <w:t>CUDA-Q es el framework de simulación cuántica de NVIDIA. Ha sido diseñado para aprovechar al máximo la GPU. Su propósito es acelerar de forma masiva la simulación de circuitos apoyándose en el hardware gráfico. Para ello, se apoya en la biblioteca cuQuantum, concretamente en cuStateVec para vectores de estado, e intercala un compilador MLIR que opera como representación intermedia del programa.</w:t>
+      </w:r>
+    </w:p>
+    <w:p>
+      <w:pPr>
+        <w:rPr>
+          <w:lang w:eastAsia="es-ES"/>
+        </w:rPr>
+      </w:pPr>
+      <w:r>
+        <w:rPr>
+          <w:lang w:eastAsia="es-ES"/>
+        </w:rPr>
+        <w:t xml:space="preserve">El modelo de ejecución es AOT (de compilación anticipada). El circuito se traduce a IR en el momento de su definición, nunca en el de la ejecución, por lo que la compilación solo sucede una vez y las ejecuciones posteriores reaprovechan el código generado. El proyecto hace uso de la API </w:t>
+      </w:r>
+      <m:oMath>
+        <m:r>
+          <w:rPr>
+            <w:rFonts w:ascii="Cambria Math" w:hAnsi="Cambria Math"/>
+            <w:lang w:eastAsia="es-ES"/>
+          </w:rPr>
+          <m:t>make_kernel</m:t>
+        </m:r>
+        <m:d>
+          <m:dPr>
+            <m:ctrlPr>
+              <w:rPr>
+                <w:rFonts w:ascii="Cambria Math" w:hAnsi="Cambria Math"/>
+                <w:i/>
+                <w:lang w:eastAsia="es-ES"/>
+              </w:rPr>
+            </m:ctrlPr>
+          </m:dPr>
+          <m:e>
+            <m:r>
+              <w:rPr>
+                <w:rFonts w:ascii="Cambria Math" w:hAnsi="Cambria Math"/>
+                <w:lang w:eastAsia="es-ES"/>
+              </w:rPr>
+              <m:t xml:space="preserve"> </m:t>
+            </m:r>
+          </m:e>
+        </m:d>
+      </m:oMath>
+      <w:r>
+        <w:rPr>
+          <w:lang w:eastAsia="es-ES"/>
+        </w:rPr>
+        <w:t>, que ofrece un mayor control programático a la hora de construir de forma dinámica circuitos parametrizados en n qubits. Hay varios backends. Entre ellos se encuentran qpp-cpu, que sirve de referencia para la CPU y no requiere GPU, nvidia, custatevec-fp32 para GPU NVIDIA con float32 y máximo rendimiento y custatevec-fp64 con float64 reservado para la validación. La selección del backend es global y persiste en el proceso, por lo que el benchmark la configura una única vez al arrancar y mide el tiempo de inicio por separado, ya que inicializar el contexto CUDA puede superar los cientos de milisegundos.</w:t>
+      </w:r>
+    </w:p>
+    <w:p>
+      <w:pPr>
+        <w:rPr>
+          <w:lang w:eastAsia="es-ES"/>
+        </w:rPr>
+      </w:pPr>
+      <w:r>
+        <w:rPr>
+          <w:lang w:eastAsia="es-ES"/>
+        </w:rPr>
+        <w:t xml:space="preserve">La ganancia se nota con </w:t>
+      </w:r>
+      <m:oMath>
+        <m:r>
+          <w:rPr>
+            <w:rFonts w:ascii="Cambria Math" w:hAnsi="Cambria Math"/>
+            <w:lang w:eastAsia="es-ES"/>
+          </w:rPr>
+          <m:t>n&gt;18-20</m:t>
+        </m:r>
+      </m:oMath>
+      <w:r>
+        <w:rPr>
+          <w:lang w:eastAsia="es-ES"/>
+        </w:rPr>
+        <w:t xml:space="preserve"> qubits. En el rango de 24 a 28 qubits, se estima una aceleración de entre 5 y 20 veces superior a la de una CPU de 8 núcleos en una A100. Por debajo de ese umbral, el sobrecoste de la inicialización y de la transferencia de la CPU a la GPU anula la ventaja. También pesan las restricciones de la plataforma: CUDA-Q solo acelera por GPU en Linux x86_64, y no tiene soporte oficial para ARM ni para Windows, por lo que este proyecto lo descarta automáticamente en ARM64 y Windows mediante la importación condicional del trabajador.</w:t>
       </w:r>
     </w:p>
     <w:p>
@@ -11833,6 +12290,224 @@
     </w:p>
     <w:p>
       <w:pPr>
+        <w:rPr>
+          <w:lang w:eastAsia="es-ES"/>
+        </w:rPr>
+      </w:pPr>
+      <w:r>
+        <w:rPr>
+          <w:lang w:eastAsia="es-ES"/>
+        </w:rPr>
+        <w:t>QDisLib, abreviatura de Quantum Distributed Library, es un framework de computación cuántica distribuida desarrollado por el Barcelona Supercomputing Center. Su función principal consiste en fragmentar circuitos cuánticos en subcircuitos mediante la técnica de «circuit cutting», ejecutar esas piezas de manera distribuida y recomponer después los resultados por vía clásica. No sustituye a Qiskit. Interviene directamente en la capa de ejecución de objetos QuantumCircuit de Qiskit.</w:t>
+      </w:r>
+    </w:p>
+    <w:p>
+      <w:pPr>
+        <w:rPr>
+          <w:lang w:eastAsia="es-ES"/>
+        </w:rPr>
+      </w:pPr>
+      <w:r>
+        <w:rPr>
+          <w:lang w:eastAsia="es-ES"/>
+        </w:rPr>
+        <w:t xml:space="preserve">El mecanismo de partición que implementa es wire cutting, con el parámetro </w:t>
+      </w:r>
+      <m:oMath>
+        <m:r>
+          <w:rPr>
+            <w:rFonts w:ascii="Cambria Math" w:hAnsi="Cambria Math"/>
+            <w:lang w:eastAsia="es-ES"/>
+          </w:rPr>
+          <m:t>gate_cut=False</m:t>
+        </m:r>
+      </m:oMath>
+      <w:r>
+        <w:rPr>
+          <w:lang w:eastAsia="es-ES"/>
+        </w:rPr>
+        <w:t xml:space="preserve"> fijado de forma invariable a lo largo de todo el benchmark. La API expone dos funciones principales: </w:t>
+      </w:r>
+      <m:oMath>
+        <m:r>
+          <w:rPr>
+            <w:rFonts w:ascii="Cambria Math" w:hAnsi="Cambria Math"/>
+            <w:lang w:eastAsia="es-ES"/>
+          </w:rPr>
+          <m:t>find_cut</m:t>
+        </m:r>
+        <m:d>
+          <m:dPr>
+            <m:ctrlPr>
+              <w:rPr>
+                <w:rFonts w:ascii="Cambria Math" w:hAnsi="Cambria Math"/>
+                <w:i/>
+                <w:lang w:eastAsia="es-ES"/>
+              </w:rPr>
+            </m:ctrlPr>
+          </m:dPr>
+          <m:e>
+            <m:r>
+              <w:rPr>
+                <w:rFonts w:ascii="Cambria Math" w:hAnsi="Cambria Math"/>
+                <w:lang w:eastAsia="es-ES"/>
+              </w:rPr>
+              <m:t xml:space="preserve"> </m:t>
+            </m:r>
+          </m:e>
+        </m:d>
+      </m:oMath>
+      <w:r>
+        <w:rPr>
+          <w:lang w:eastAsia="es-ES"/>
+        </w:rPr>
+        <w:t xml:space="preserve">, encargada de resolver el problema de optimización combinatoria que supone hallar la partición óptima del circuito, y </w:t>
+      </w:r>
+      <m:oMath>
+        <m:r>
+          <w:rPr>
+            <w:rFonts w:ascii="Cambria Math" w:hAnsi="Cambria Math"/>
+            <w:lang w:eastAsia="es-ES"/>
+          </w:rPr>
+          <m:t>wire_cutting</m:t>
+        </m:r>
+        <m:d>
+          <m:dPr>
+            <m:ctrlPr>
+              <w:rPr>
+                <w:rFonts w:ascii="Cambria Math" w:hAnsi="Cambria Math"/>
+                <w:i/>
+                <w:lang w:eastAsia="es-ES"/>
+              </w:rPr>
+            </m:ctrlPr>
+          </m:dPr>
+          <m:e>
+            <m:r>
+              <w:rPr>
+                <w:rFonts w:ascii="Cambria Math" w:hAnsi="Cambria Math"/>
+                <w:lang w:eastAsia="es-ES"/>
+              </w:rPr>
+              <m:t xml:space="preserve"> </m:t>
+            </m:r>
+          </m:e>
+        </m:d>
+      </m:oMath>
+      <w:r>
+        <w:rPr>
+          <w:lang w:eastAsia="es-ES"/>
+        </w:rPr>
+        <w:t xml:space="preserve">, que genera y ejecuta los subcircuitos y luego recombina sus resultados. La recombinación se basa en una descomposición de quasiprobabilidad, de modo que la salida no es una distribución de probabilidad sobre estados base, sino un valor de expectación escalar real, lo que diferencia fundamentalmente su comportamiento del de una ejecución directa. El sobrecoste crece de forma exponencial. Con k wire cuts surgen </w:t>
+      </w:r>
+      <m:oMath>
+        <m:sSup>
+          <m:sSupPr>
+            <m:ctrlPr>
+              <w:rPr>
+                <w:rFonts w:ascii="Cambria Math" w:hAnsi="Cambria Math"/>
+                <w:i/>
+                <w:lang w:eastAsia="es-ES"/>
+              </w:rPr>
+            </m:ctrlPr>
+          </m:sSupPr>
+          <m:e>
+            <m:r>
+              <w:rPr>
+                <w:rFonts w:ascii="Cambria Math" w:hAnsi="Cambria Math"/>
+                <w:lang w:eastAsia="es-ES"/>
+              </w:rPr>
+              <m:t>4</m:t>
+            </m:r>
+          </m:e>
+          <m:sup>
+            <m:r>
+              <w:rPr>
+                <w:rFonts w:ascii="Cambria Math" w:hAnsi="Cambria Math"/>
+                <w:lang w:eastAsia="es-ES"/>
+              </w:rPr>
+              <m:t>k</m:t>
+            </m:r>
+          </m:sup>
+        </m:sSup>
+      </m:oMath>
+      <w:r>
+        <w:rPr>
+          <w:lang w:eastAsia="es-ES"/>
+        </w:rPr>
+        <w:t xml:space="preserve"> subcircuitos y el benchmark mantiene </w:t>
+      </w:r>
+      <m:oMath>
+        <m:r>
+          <w:rPr>
+            <w:rFonts w:ascii="Cambria Math" w:hAnsi="Cambria Math"/>
+            <w:lang w:eastAsia="es-ES"/>
+          </w:rPr>
+          <m:t>max_cuts=2</m:t>
+        </m:r>
+      </m:oMath>
+      <w:r>
+        <w:rPr>
+          <w:lang w:eastAsia="es-ES"/>
+        </w:rPr>
+        <w:t>, es decir, 16 subcircuitos, como valor predeterminado. El backend elegido es «numpy», una simulación local sostenida por AerSimulator, lo que permite medir el sobrecoste de distribución de forma reproducible.</w:t>
+      </w:r>
+    </w:p>
+    <w:p>
+      <w:pPr>
+        <w:rPr>
+          <w:lang w:eastAsia="es-ES"/>
+        </w:rPr>
+      </w:pPr>
+      <w:r>
+        <w:rPr>
+          <w:lang w:eastAsia="es-ES"/>
+        </w:rPr>
+        <w:t xml:space="preserve">Entre las métricas reportadas se encuentran las variables `cutting_find_time_ms` y `cutting_wall_time_ms`, que desglosan el sobrecoste en coste de planificación y coste de ejecución. En Linux ARM64, la biblioteca no está disponible y el trabajador se detiene </w:t>
+      </w:r>
+      <w:r>
+        <w:rPr>
+          <w:lang w:eastAsia="es-ES"/>
+        </w:rPr>
+        <w:lastRenderedPageBreak/>
+        <w:t xml:space="preserve">correctamente. Además, existe una incompatibilidad de API entre Qiskit y QDisLib, ya que QDisLib reclama .nqubits, mientras que Qiskit publica .num_qubits, que se soluciona mediante un workaround explícito antes de la llamada a </w:t>
+      </w:r>
+      <m:oMath>
+        <m:r>
+          <w:rPr>
+            <w:rFonts w:ascii="Cambria Math" w:hAnsi="Cambria Math"/>
+            <w:lang w:eastAsia="es-ES"/>
+          </w:rPr>
+          <m:t>find_cut</m:t>
+        </m:r>
+        <m:d>
+          <m:dPr>
+            <m:ctrlPr>
+              <w:rPr>
+                <w:rFonts w:ascii="Cambria Math" w:hAnsi="Cambria Math"/>
+                <w:i/>
+                <w:lang w:eastAsia="es-ES"/>
+              </w:rPr>
+            </m:ctrlPr>
+          </m:dPr>
+          <m:e>
+            <m:r>
+              <w:rPr>
+                <w:rFonts w:ascii="Cambria Math" w:hAnsi="Cambria Math"/>
+                <w:lang w:eastAsia="es-ES"/>
+              </w:rPr>
+              <m:t xml:space="preserve"> </m:t>
+            </m:r>
+          </m:e>
+        </m:d>
+      </m:oMath>
+      <w:r>
+        <w:rPr>
+          <w:lang w:eastAsia="es-ES"/>
+        </w:rPr>
+        <w:t>.</w:t>
+      </w:r>
+    </w:p>
+    <w:p>
+      <w:pPr>
         <w:pStyle w:val="Heading4"/>
         <w:numPr>
           <w:ilvl w:val="3"/>
@@ -11851,6 +12526,174 @@
     </w:p>
     <w:p>
       <w:pPr>
+        <w:rPr>
+          <w:lang w:eastAsia="es-ES"/>
+        </w:rPr>
+      </w:pPr>
+      <w:r>
+        <w:rPr>
+          <w:lang w:eastAsia="es-ES"/>
+        </w:rPr>
+        <w:t xml:space="preserve">QCGPU es el único simulador del proyecto con backend OpenCL, por lo que es el único framework capaz de ejecutarse en hardware de AMD, Intel y NVIDIA con un mismo código fuente. La versión utilizada es la 0.1.0. El estado cuántico se aloja como un vector de amplitudes complejas con precisión f32 directamente en un búfer de la GPU OpenCL, sin pasar por la RAM del host durante la simulación. Cada puerta de un qubit se procesa como un kernel OpenCL con </w:t>
+      </w:r>
+      <m:oMath>
+        <m:sSup>
+          <m:sSupPr>
+            <m:ctrlPr>
+              <w:rPr>
+                <w:rFonts w:ascii="Cambria Math" w:hAnsi="Cambria Math"/>
+                <w:i/>
+                <w:lang w:eastAsia="es-ES"/>
+              </w:rPr>
+            </m:ctrlPr>
+          </m:sSupPr>
+          <m:e>
+            <m:r>
+              <w:rPr>
+                <w:rFonts w:ascii="Cambria Math" w:hAnsi="Cambria Math"/>
+                <w:lang w:eastAsia="es-ES"/>
+              </w:rPr>
+              <m:t>2</m:t>
+            </m:r>
+          </m:e>
+          <m:sup>
+            <m:r>
+              <w:rPr>
+                <w:rFonts w:ascii="Cambria Math" w:hAnsi="Cambria Math"/>
+                <w:lang w:eastAsia="es-ES"/>
+              </w:rPr>
+              <m:t>n-1</m:t>
+            </m:r>
+          </m:sup>
+        </m:sSup>
+      </m:oMath>
+      <w:r>
+        <w:rPr>
+          <w:lang w:eastAsia="es-ES"/>
+        </w:rPr>
+        <w:t xml:space="preserve"> hilos en paralelo y sin sincronización entre ellos, ya que cada par de amplitudes (lo, hi) ocupa una posición diferente.</w:t>
+      </w:r>
+    </w:p>
+    <w:p>
+      <w:pPr>
+        <w:rPr>
+          <w:lang w:eastAsia="es-ES"/>
+        </w:rPr>
+      </w:pPr>
+      <w:r>
+        <w:rPr>
+          <w:lang w:eastAsia="es-ES"/>
+        </w:rPr>
+        <w:t xml:space="preserve">Las matrices de puertas se envían al kernel como argumentos escalares, lo que minimiza el sobrecoste de la transferencia de la CPU a la GPU. El muestreo no abandona la GPU, ya que es en este dispositivo donde se genera la distribución de probabilidad acumulada y se envía un histograma al host. La sobriedad es deliberada. El núcleo central de OpenCL apenas alcanza unas decenas de líneas en C, y la envoltura de Rust se queda por debajo de las 500 líneas. Cubre los operadores H, X, Y, Z, S, T, CX, Toffoli, SWAP y la rotación de fase parametrizada </w:t>
+      </w:r>
+      <m:oMath>
+        <m:r>
+          <w:rPr>
+            <w:rFonts w:ascii="Cambria Math" w:hAnsi="Cambria Math"/>
+            <w:lang w:eastAsia="es-ES"/>
+          </w:rPr>
+          <m:t>r</m:t>
+        </m:r>
+        <m:d>
+          <m:dPr>
+            <m:ctrlPr>
+              <w:rPr>
+                <w:rFonts w:ascii="Cambria Math" w:hAnsi="Cambria Math"/>
+                <w:i/>
+                <w:lang w:eastAsia="es-ES"/>
+              </w:rPr>
+            </m:ctrlPr>
+          </m:dPr>
+          <m:e>
+            <m:r>
+              <w:rPr>
+                <w:rFonts w:ascii="Cambria Math" w:hAnsi="Cambria Math"/>
+                <w:lang w:eastAsia="es-ES"/>
+              </w:rPr>
+              <m:t>θ</m:t>
+            </m:r>
+          </m:e>
+        </m:d>
+      </m:oMath>
+      <w:r>
+        <w:rPr>
+          <w:lang w:eastAsia="es-ES"/>
+        </w:rPr>
+        <w:t>, aunque carece de QFT nativa y obliga a desplegar la IQFT puerta a puerta. Las restricciones de la plataforma son importantes: qcgpu solo ofrece garantías en Linux x86_64, ya que Apple desaconsejó OpenCL en 2018 y los controladores de producción estables (AMD ROCm y NVIDIA) solo están disponibles en Linux.</w:t>
+      </w:r>
+    </w:p>
+    <w:p>
+      <w:pPr>
+        <w:rPr>
+          <w:lang w:eastAsia="es-ES"/>
+        </w:rPr>
+      </w:pPr>
+      <w:r>
+        <w:rPr>
+          <w:lang w:eastAsia="es-ES"/>
+        </w:rPr>
+        <w:t xml:space="preserve">El entorno de ejecución es Ubuntu 22.04 en un contenedor Docker sobre una imagen base CUDA 12.6 con ocl-icd-libopencl1, donde el NVIDIA Container Toolkit y la opción —gpus all inyectan automáticamente el ICD de NVIDIA. La inicialización del contexto OpenCL impone una latencia fija de 50-500 ms que domina el tiempo total en circuitos pequeños </w:t>
+      </w:r>
+      <m:oMath>
+        <m:d>
+          <m:dPr>
+            <m:ctrlPr>
+              <w:rPr>
+                <w:rFonts w:ascii="Cambria Math" w:hAnsi="Cambria Math"/>
+                <w:i/>
+                <w:lang w:eastAsia="es-ES"/>
+              </w:rPr>
+            </m:ctrlPr>
+          </m:dPr>
+          <m:e>
+            <m:r>
+              <w:rPr>
+                <w:rFonts w:ascii="Cambria Math" w:hAnsi="Cambria Math"/>
+                <w:lang w:eastAsia="es-ES"/>
+              </w:rPr>
+              <m:t>n=12</m:t>
+            </m:r>
+          </m:e>
+        </m:d>
+      </m:oMath>
+      <w:r>
+        <w:rPr>
+          <w:lang w:eastAsia="es-ES"/>
+        </w:rPr>
+        <w:t xml:space="preserve"> y la precisión f32 puede degradar los ángulos de la IQFT cuando </w:t>
+      </w:r>
+      <m:oMath>
+        <m:r>
+          <w:rPr>
+            <w:rFonts w:ascii="Cambria Math" w:hAnsi="Cambria Math"/>
+            <w:lang w:eastAsia="es-ES"/>
+          </w:rPr>
+          <m:t>N</m:t>
+        </m:r>
+        <m:r>
+          <w:rPr>
+            <w:rFonts w:ascii="Cambria Math" w:hAnsi="Cambria Math"/>
+            <w:lang w:eastAsia="es-ES"/>
+          </w:rPr>
+          <m:t>&gt;</m:t>
+        </m:r>
+        <m:r>
+          <w:rPr>
+            <w:rFonts w:ascii="Cambria Math" w:hAnsi="Cambria Math"/>
+            <w:lang w:eastAsia="es-ES"/>
+          </w:rPr>
+          <m:t>100</m:t>
+        </m:r>
+      </m:oMath>
+      <w:r>
+        <w:rPr>
+          <w:lang w:eastAsia="es-ES"/>
+        </w:rPr>
+        <w:t xml:space="preserve"> en Shor.</w:t>
+      </w:r>
+    </w:p>
+    <w:p>
+      <w:pPr>
         <w:pStyle w:val="Heading4"/>
         <w:numPr>
           <w:ilvl w:val="3"/>
@@ -11869,6 +12712,342 @@
     </w:p>
     <w:p>
       <w:pPr>
+        <w:rPr>
+          <w:lang w:eastAsia="es-ES"/>
+        </w:rPr>
+      </w:pPr>
+      <w:r>
+        <w:rPr>
+          <w:lang w:eastAsia="es-ES"/>
+        </w:rPr>
+        <w:t xml:space="preserve">Quantr es un simulador cuántico de tipo statevector denso, construido en Rust y distribuido como crate dentro del ecosistema Cargo. La versión utilizada es la 0.6. Mantiene en memoria el vector completo de </w:t>
+      </w:r>
+      <m:oMath>
+        <m:sSup>
+          <m:sSupPr>
+            <m:ctrlPr>
+              <w:rPr>
+                <w:rFonts w:ascii="Cambria Math" w:hAnsi="Cambria Math"/>
+                <w:i/>
+                <w:lang w:eastAsia="es-ES"/>
+              </w:rPr>
+            </m:ctrlPr>
+          </m:sSupPr>
+          <m:e>
+            <m:r>
+              <w:rPr>
+                <w:rFonts w:ascii="Cambria Math" w:hAnsi="Cambria Math"/>
+                <w:lang w:eastAsia="es-ES"/>
+              </w:rPr>
+              <m:t>2</m:t>
+            </m:r>
+          </m:e>
+          <m:sup>
+            <m:r>
+              <w:rPr>
+                <w:rFonts w:ascii="Cambria Math" w:hAnsi="Cambria Math"/>
+                <w:lang w:eastAsia="es-ES"/>
+              </w:rPr>
+              <m:t>n</m:t>
+            </m:r>
+          </m:sup>
+        </m:sSup>
+      </m:oMath>
+      <w:r>
+        <w:rPr>
+          <w:lang w:eastAsia="es-ES"/>
+        </w:rPr>
+        <w:t xml:space="preserve"> amplitudes complejas, codificadas como Complexf64, a razón de 16 bytes por amplitud, y aplica cada puerta como una transformación unitaria exacta, lo que da como resultado valores exactos y deterministas. La interfaz adopta el patrón Circuit Builder.</w:t>
+      </w:r>
+    </w:p>
+    <w:p>
+      <w:pPr>
+        <w:rPr>
+          <w:lang w:eastAsia="es-ES"/>
+        </w:rPr>
+      </w:pPr>
+      <w:r>
+        <w:rPr>
+          <w:lang w:eastAsia="es-ES"/>
+        </w:rPr>
+        <w:t xml:space="preserve">En primer lugar, se crea un objeto Circuit; a continuación, se añaden puertas con add_gate y add_repeating_gate; por último, la simulación comienza en un solo paso con </w:t>
+      </w:r>
+      <m:oMath>
+        <m:r>
+          <w:rPr>
+            <w:rFonts w:ascii="Cambria Math" w:hAnsi="Cambria Math"/>
+            <w:lang w:eastAsia="es-ES"/>
+          </w:rPr>
+          <m:t>.simulate</m:t>
+        </m:r>
+        <m:d>
+          <m:dPr>
+            <m:ctrlPr>
+              <w:rPr>
+                <w:rFonts w:ascii="Cambria Math" w:hAnsi="Cambria Math"/>
+                <w:i/>
+                <w:lang w:eastAsia="es-ES"/>
+              </w:rPr>
+            </m:ctrlPr>
+          </m:dPr>
+          <m:e>
+            <m:r>
+              <w:rPr>
+                <w:rFonts w:ascii="Cambria Math" w:hAnsi="Cambria Math"/>
+                <w:lang w:eastAsia="es-ES"/>
+              </w:rPr>
+              <m:t xml:space="preserve"> </m:t>
+            </m:r>
+          </m:e>
+        </m:d>
+      </m:oMath>
+      <w:r>
+        <w:rPr>
+          <w:lang w:eastAsia="es-ES"/>
+        </w:rPr>
+        <w:t xml:space="preserve">, mientras que la gestión de errores sigue la convención idiomática de Rust mediante </w:t>
+      </w:r>
+      <m:oMath>
+        <m:r>
+          <w:rPr>
+            <w:rFonts w:ascii="Cambria Math" w:hAnsi="Cambria Math"/>
+            <w:lang w:eastAsia="es-ES"/>
+          </w:rPr>
+          <m:t>Result</m:t>
+        </m:r>
+        <m:d>
+          <m:dPr>
+            <m:ctrlPr>
+              <w:rPr>
+                <w:rFonts w:ascii="Cambria Math" w:hAnsi="Cambria Math"/>
+                <w:i/>
+                <w:lang w:eastAsia="es-ES"/>
+              </w:rPr>
+            </m:ctrlPr>
+          </m:dPr>
+          <m:e>
+            <m:r>
+              <w:rPr>
+                <w:rFonts w:ascii="Cambria Math" w:hAnsi="Cambria Math"/>
+                <w:lang w:eastAsia="es-ES"/>
+              </w:rPr>
+              <m:t xml:space="preserve"> </m:t>
+            </m:r>
+          </m:e>
+        </m:d>
+      </m:oMath>
+      <w:r>
+        <w:rPr>
+          <w:lang w:eastAsia="es-ES"/>
+        </w:rPr>
+        <w:t xml:space="preserve"> y QuantrError. La simulación y la medición están desacopladas: </w:t>
+      </w:r>
+      <m:oMath>
+        <m:r>
+          <w:rPr>
+            <w:rFonts w:ascii="Cambria Math" w:hAnsi="Cambria Math"/>
+            <w:lang w:eastAsia="es-ES"/>
+          </w:rPr>
+          <m:t>.simulate</m:t>
+        </m:r>
+        <m:d>
+          <m:dPr>
+            <m:ctrlPr>
+              <w:rPr>
+                <w:rFonts w:ascii="Cambria Math" w:hAnsi="Cambria Math"/>
+                <w:i/>
+                <w:lang w:eastAsia="es-ES"/>
+              </w:rPr>
+            </m:ctrlPr>
+          </m:dPr>
+          <m:e>
+            <m:r>
+              <w:rPr>
+                <w:rFonts w:ascii="Cambria Math" w:hAnsi="Cambria Math"/>
+                <w:lang w:eastAsia="es-ES"/>
+              </w:rPr>
+              <m:t xml:space="preserve"> </m:t>
+            </m:r>
+          </m:e>
+        </m:d>
+      </m:oMath>
+      <w:r>
+        <w:rPr>
+          <w:lang w:eastAsia="es-ES"/>
+        </w:rPr>
+        <w:t xml:space="preserve"> devuelve el estado simulado y </w:t>
+      </w:r>
+      <m:oMath>
+        <m:r>
+          <w:rPr>
+            <w:rFonts w:ascii="Cambria Math" w:hAnsi="Cambria Math"/>
+            <w:lang w:eastAsia="es-ES"/>
+          </w:rPr>
+          <m:t>.measure_all</m:t>
+        </m:r>
+        <m:d>
+          <m:dPr>
+            <m:ctrlPr>
+              <w:rPr>
+                <w:rFonts w:ascii="Cambria Math" w:hAnsi="Cambria Math"/>
+                <w:i/>
+                <w:lang w:eastAsia="es-ES"/>
+              </w:rPr>
+            </m:ctrlPr>
+          </m:dPr>
+          <m:e>
+            <m:r>
+              <w:rPr>
+                <w:rFonts w:ascii="Cambria Math" w:hAnsi="Cambria Math"/>
+                <w:lang w:eastAsia="es-ES"/>
+              </w:rPr>
+              <m:t>shots</m:t>
+            </m:r>
+          </m:e>
+        </m:d>
+      </m:oMath>
+      <w:r>
+        <w:rPr>
+          <w:lang w:eastAsia="es-ES"/>
+        </w:rPr>
+        <w:t xml:space="preserve"> entrega un </w:t>
+      </w:r>
+      <m:oMath>
+        <m:r>
+          <w:rPr>
+            <w:rFonts w:ascii="Cambria Math" w:hAnsi="Cambria Math"/>
+            <w:lang w:eastAsia="es-ES"/>
+          </w:rPr>
+          <m:t>HashMap&lt;ProductState, usize&gt;</m:t>
+        </m:r>
+      </m:oMath>
+      <w:r>
+        <w:rPr>
+          <w:lang w:eastAsia="es-ES"/>
+        </w:rPr>
+        <w:t xml:space="preserve"> con el histograma correspondiente. El endianness es MSB-first, por lo que es necesario invertir explícitamente la cadena de bits para preservar la compatibilidad con el resto del banco de pruebas. La falta de puertas multi-controladas nativas, más allá de Toffoli, obliga a utilizar el ancilla ladder, por lo que un MCX con </w:t>
+      </w:r>
+      <m:oMath>
+        <m:r>
+          <w:rPr>
+            <w:rFonts w:ascii="Cambria Math" w:hAnsi="Cambria Math"/>
+            <w:lang w:eastAsia="es-ES"/>
+          </w:rPr>
+          <m:t>k</m:t>
+        </m:r>
+      </m:oMath>
+      <w:r>
+        <w:rPr>
+          <w:lang w:eastAsia="es-ES"/>
+        </w:rPr>
+        <w:t xml:space="preserve"> controles requiere </w:t>
+      </w:r>
+      <m:oMath>
+        <m:r>
+          <w:rPr>
+            <w:rFonts w:ascii="Cambria Math" w:hAnsi="Cambria Math"/>
+            <w:lang w:eastAsia="es-ES"/>
+          </w:rPr>
+          <m:t>k-2</m:t>
+        </m:r>
+      </m:oMath>
+      <w:r>
+        <w:rPr>
+          <w:lang w:eastAsia="es-ES"/>
+        </w:rPr>
+        <w:t xml:space="preserve"> bits auxiliares y </w:t>
+      </w:r>
+      <m:oMath>
+        <m:r>
+          <w:rPr>
+            <w:rFonts w:ascii="Cambria Math" w:hAnsi="Cambria Math"/>
+            <w:lang w:eastAsia="es-ES"/>
+          </w:rPr>
+          <m:t>2k-3</m:t>
+        </m:r>
+      </m:oMath>
+      <w:r>
+        <w:rPr>
+          <w:lang w:eastAsia="es-ES"/>
+        </w:rPr>
+        <w:t xml:space="preserve"> puertas Toffoli dispuestas en patrón forward-central-reverse.</w:t>
+      </w:r>
+    </w:p>
+    <w:p>
+      <w:pPr>
+        <w:rPr>
+          <w:rFonts w:eastAsiaTheme="minorEastAsia"/>
+          <w:lang w:eastAsia="es-ES"/>
+        </w:rPr>
+      </w:pPr>
+      <w:r>
+        <w:rPr>
+          <w:lang w:eastAsia="es-ES"/>
+        </w:rPr>
+        <w:t xml:space="preserve">El coste se paga en qubits. Esta inflación del circuito real explica que el rango de evaluación de Grover se acote a </w:t>
+      </w:r>
+      <m:oMath>
+        <m:r>
+          <w:rPr>
+            <w:rFonts w:ascii="Cambria Math" w:hAnsi="Cambria Math"/>
+            <w:lang w:eastAsia="es-ES"/>
+          </w:rPr>
+          <m:t>n=</m:t>
+        </m:r>
+        <m:d>
+          <m:dPr>
+            <m:begChr m:val="{"/>
+            <m:endChr m:val="}"/>
+            <m:ctrlPr>
+              <w:rPr>
+                <w:rFonts w:ascii="Cambria Math" w:hAnsi="Cambria Math"/>
+                <w:i/>
+                <w:lang w:eastAsia="es-ES"/>
+              </w:rPr>
+            </m:ctrlPr>
+          </m:dPr>
+          <m:e>
+            <m:r>
+              <w:rPr>
+                <w:rFonts w:ascii="Cambria Math" w:hAnsi="Cambria Math"/>
+                <w:lang w:eastAsia="es-ES"/>
+              </w:rPr>
+              <m:t>3, 5, 7, 9, 11</m:t>
+            </m:r>
+          </m:e>
+        </m:d>
+      </m:oMath>
+      <w:r>
+        <w:rPr>
+          <w:lang w:eastAsia="es-ES"/>
+        </w:rPr>
+        <w:t xml:space="preserve">, ya que el siguiente escalón, </w:t>
+      </w:r>
+      <m:oMath>
+        <m:r>
+          <w:rPr>
+            <w:rFonts w:ascii="Cambria Math" w:hAnsi="Cambria Math"/>
+            <w:lang w:eastAsia="es-ES"/>
+          </w:rPr>
+          <m:t>n=13</m:t>
+        </m:r>
+      </m:oMath>
+      <w:r>
+        <w:rPr>
+          <w:lang w:eastAsia="es-ES"/>
+        </w:rPr>
+        <w:t xml:space="preserve">, supondría un total de </w:t>
+      </w:r>
+      <w:r>
+        <w:rPr>
+          <w:lang w:eastAsia="es-ES"/>
+        </w:rPr>
+        <w:lastRenderedPageBreak/>
+        <w:t>24 qubits y 256 MB dedicados únicamente al vector de estado. La ejecución transcurre estrictamente en un solo hilo y sin soporte de GPU.</w:t>
+      </w:r>
+    </w:p>
+    <w:p>
+      <w:pPr>
         <w:pStyle w:val="Heading4"/>
         <w:numPr>
           <w:ilvl w:val="3"/>
@@ -11887,6 +13066,97 @@
     </w:p>
     <w:p>
       <w:pPr>
+        <w:rPr>
+          <w:lang w:eastAsia="es-ES"/>
+        </w:rPr>
+      </w:pPr>
+      <w:r>
+        <w:rPr>
+          <w:lang w:eastAsia="es-ES"/>
+        </w:rPr>
+        <w:t xml:space="preserve">Quantum2 es un simulador de circuitos cuánticos de código abierto, escrito en Rust y basado en una arquitectura multicrate. La versión utilizada es la 0.1.3 y modela el estado cuántico como un vector complejo de longitud </w:t>
+      </w:r>
+      <m:oMath>
+        <m:sSup>
+          <m:sSupPr>
+            <m:ctrlPr>
+              <w:rPr>
+                <w:rFonts w:ascii="Cambria Math" w:hAnsi="Cambria Math"/>
+                <w:i/>
+                <w:lang w:eastAsia="es-ES"/>
+              </w:rPr>
+            </m:ctrlPr>
+          </m:sSupPr>
+          <m:e>
+            <m:r>
+              <w:rPr>
+                <w:rFonts w:ascii="Cambria Math" w:hAnsi="Cambria Math"/>
+                <w:lang w:eastAsia="es-ES"/>
+              </w:rPr>
+              <m:t>2</m:t>
+            </m:r>
+          </m:e>
+          <m:sup>
+            <m:r>
+              <w:rPr>
+                <w:rFonts w:ascii="Cambria Math" w:hAnsi="Cambria Math"/>
+                <w:lang w:eastAsia="es-ES"/>
+              </w:rPr>
+              <m:t>N</m:t>
+            </m:r>
+          </m:sup>
+        </m:sSup>
+      </m:oMath>
+      <w:r>
+        <w:rPr>
+          <w:lang w:eastAsia="es-ES"/>
+        </w:rPr>
+        <w:t>, aplica matrices unitarias por multiplicación densa y muestra un vector de probabilidades brutas en lugar de histogramas de medición.</w:t>
+      </w:r>
+    </w:p>
+    <w:p>
+      <w:pPr>
+        <w:rPr>
+          <w:lang w:eastAsia="es-ES"/>
+        </w:rPr>
+      </w:pPr>
+      <w:r>
+        <w:rPr>
+          <w:lang w:eastAsia="es-ES"/>
+        </w:rPr>
+        <w:t xml:space="preserve">Su característica más destacada son los genéricos const, materializados en </w:t>
+      </w:r>
+      <m:oMath>
+        <m:r>
+          <w:rPr>
+            <w:rFonts w:ascii="Cambria Math" w:hAnsi="Cambria Math"/>
+            <w:lang w:eastAsia="es-ES"/>
+          </w:rPr>
+          <m:t>Circuit&lt;N&gt;</m:t>
+        </m:r>
+      </m:oMath>
+      <w:r>
+        <w:rPr>
+          <w:lang w:eastAsia="es-ES"/>
+        </w:rPr>
+        <w:t>: el número de qubits se codifica como parámetro de tipo en tiempo de compilación, lo que permite la verificación estática de índices y el dimensionamiento del vector de estado sin asignaciones dinámicas. Esto tiene un precio. Los algoritmos cuyo número de qubits solo se conoce durante la ejecución requieren un dispatcher estático, es decir, un bloque match que enumera todos los valores admitidos y genera una instancia compilada distinta para cada uno. La organización multicrate distribuye las responsabilidades entre los componentes: -  quantrs2-core, que gestiona los tipos primitivos; -  quantrs2-circuit, que gestiona el tipo Circuit; -  quantrs2-sim, el simulador, que se puede sustituir mediante el atributo Simulator; -  quantrs2, el crate paraguas. Las características de Cargo controlan la activación del backend CUDA durante la compilación y eliminan como código muerto las rutas inactivas. Sin embargo, faltan puertas compuestas de alto nivel, como MCX de aridad arbitraria o QFT nativa, por lo que es necesario realizar descomposiciones manuales y el benchmark debe poner a prueba la profundidad real del simulador con circuitos de mayor complejidad.</w:t>
+      </w:r>
+    </w:p>
+    <w:p>
+      <w:pPr>
+        <w:rPr>
+          <w:lang w:eastAsia="es-ES"/>
+        </w:rPr>
+      </w:pPr>
+      <w:r>
+        <w:rPr>
+          <w:lang w:eastAsia="es-ES"/>
+        </w:rPr>
+        <w:t>El muestreo es externo. Se resuelve fuera del framework mediante el método WeightedIndex del paquete rand y el backend CUDA, que en este proyecto da paso a una ejecución exclusivamente sobre CPU en el entorno Linux x86_64.</w:t>
+      </w:r>
+    </w:p>
+    <w:p>
+      <w:pPr>
         <w:pStyle w:val="Heading4"/>
         <w:numPr>
           <w:ilvl w:val="3"/>
@@ -11905,6 +13175,283 @@
     </w:p>
     <w:p>
       <w:pPr>
+        <w:rPr>
+          <w:lang w:eastAsia="es-ES"/>
+        </w:rPr>
+      </w:pPr>
+      <w:bookmarkStart w:id="101" w:name="_Toc232954407"/>
+      <w:r>
+        <w:rPr>
+          <w:lang w:eastAsia="es-ES"/>
+        </w:rPr>
+        <w:t>Q1TSIM es una biblioteca de simulación cuántica escrita completamente en Rust y publicada en crates.io por Q1t BV. La versión utilizada es la 0.5.0. Con el fin de aislar el crate del ecosistema moderno de Rust y conseguir una reproducción exacta de la compilación, esta dependencia se incorpora en el directorio «vendor/», lo que congela el entorno y elimina la deriva que introducen las actualizaciones transitivas.</w:t>
+      </w:r>
+    </w:p>
+    <w:p>
+      <w:pPr>
+        <w:rPr>
+          <w:lang w:eastAsia="es-ES"/>
+        </w:rPr>
+      </w:pPr>
+      <w:r>
+        <w:rPr>
+          <w:lang w:eastAsia="es-ES"/>
+        </w:rPr>
+        <w:t xml:space="preserve">El motor central trabaja por vector de estado: el estado de n qubits se representa como un vector complejo de </w:t>
+      </w:r>
+      <m:oMath>
+        <m:sSup>
+          <m:sSupPr>
+            <m:ctrlPr>
+              <w:rPr>
+                <w:rFonts w:ascii="Cambria Math" w:hAnsi="Cambria Math"/>
+                <w:i/>
+                <w:lang w:eastAsia="es-ES"/>
+              </w:rPr>
+            </m:ctrlPr>
+          </m:sSupPr>
+          <m:e>
+            <m:r>
+              <w:rPr>
+                <w:rFonts w:ascii="Cambria Math" w:hAnsi="Cambria Math"/>
+                <w:lang w:eastAsia="es-ES"/>
+              </w:rPr>
+              <m:t>2</m:t>
+            </m:r>
+          </m:e>
+          <m:sup>
+            <m:r>
+              <w:rPr>
+                <w:rFonts w:ascii="Cambria Math" w:hAnsi="Cambria Math"/>
+                <w:lang w:eastAsia="es-ES"/>
+              </w:rPr>
+              <m:t>n</m:t>
+            </m:r>
+          </m:sup>
+        </m:sSup>
+      </m:oMath>
+      <w:r>
+        <w:rPr>
+          <w:lang w:eastAsia="es-ES"/>
+        </w:rPr>
+        <w:t xml:space="preserve"> amplitudes, en el que cada puerta corresponde a una multiplicación matricial. Hay más. La biblioteca incorpora, además, el formalismo de estabilizadores de Gottesman-Knill para circuitos Clifford. No obstante, los algoritmos de Grover y Shor siempre recurren al backend statevector, ya que exigen puertas que no pertenecen al grupo Clifford, como la puerta T o las rotaciones de fase de la QFT. La API se organiza en torno a la función </w:t>
+      </w:r>
+      <m:oMath>
+        <m:r>
+          <w:rPr>
+            <w:rFonts w:ascii="Cambria Math" w:hAnsi="Cambria Math"/>
+            <w:lang w:eastAsia="es-ES"/>
+          </w:rPr>
+          <m:t>Circuit.new</m:t>
+        </m:r>
+        <m:d>
+          <m:dPr>
+            <m:ctrlPr>
+              <w:rPr>
+                <w:rFonts w:ascii="Cambria Math" w:hAnsi="Cambria Math"/>
+                <w:i/>
+                <w:lang w:eastAsia="es-ES"/>
+              </w:rPr>
+            </m:ctrlPr>
+          </m:dPr>
+          <m:e>
+            <m:sSub>
+              <m:sSubPr>
+                <m:ctrlPr>
+                  <w:rPr>
+                    <w:rFonts w:ascii="Cambria Math" w:hAnsi="Cambria Math"/>
+                    <w:i/>
+                    <w:lang w:eastAsia="es-ES"/>
+                  </w:rPr>
+                </m:ctrlPr>
+              </m:sSubPr>
+              <m:e>
+                <m:r>
+                  <w:rPr>
+                    <w:rFonts w:ascii="Cambria Math" w:hAnsi="Cambria Math"/>
+                    <w:lang w:eastAsia="es-ES"/>
+                  </w:rPr>
+                  <m:t>n</m:t>
+                </m:r>
+              </m:e>
+              <m:sub>
+                <m:r>
+                  <w:rPr>
+                    <w:rFonts w:ascii="Cambria Math" w:hAnsi="Cambria Math"/>
+                    <w:lang w:eastAsia="es-ES"/>
+                  </w:rPr>
+                  <m:t>qubits</m:t>
+                </m:r>
+              </m:sub>
+            </m:sSub>
+            <m:r>
+              <w:rPr>
+                <w:rFonts w:ascii="Cambria Math" w:hAnsi="Cambria Math"/>
+                <w:lang w:eastAsia="es-ES"/>
+              </w:rPr>
+              <m:t xml:space="preserve">, </m:t>
+            </m:r>
+            <m:sSub>
+              <m:sSubPr>
+                <m:ctrlPr>
+                  <w:rPr>
+                    <w:rFonts w:ascii="Cambria Math" w:hAnsi="Cambria Math"/>
+                    <w:i/>
+                    <w:lang w:eastAsia="es-ES"/>
+                  </w:rPr>
+                </m:ctrlPr>
+              </m:sSubPr>
+              <m:e>
+                <m:r>
+                  <w:rPr>
+                    <w:rFonts w:ascii="Cambria Math" w:hAnsi="Cambria Math"/>
+                    <w:lang w:eastAsia="es-ES"/>
+                  </w:rPr>
+                  <m:t>n</m:t>
+                </m:r>
+              </m:e>
+              <m:sub>
+                <m:r>
+                  <w:rPr>
+                    <w:rFonts w:ascii="Cambria Math" w:hAnsi="Cambria Math"/>
+                    <w:lang w:eastAsia="es-ES"/>
+                  </w:rPr>
+                  <m:t>cbits</m:t>
+                </m:r>
+              </m:sub>
+            </m:sSub>
+          </m:e>
+        </m:d>
+      </m:oMath>
+      <w:r>
+        <w:rPr>
+          <w:lang w:eastAsia="es-ES"/>
+        </w:rPr>
+        <w:t xml:space="preserve">, que separa explícitamente el registro cuántico del clásico, y las puertas se aplican mediante métodos directos o, cuando no tienen método nativo, a través de </w:t>
+      </w:r>
+      <m:oMath>
+        <m:r>
+          <w:rPr>
+            <w:rFonts w:ascii="Cambria Math" w:hAnsi="Cambria Math"/>
+            <w:lang w:eastAsia="es-ES"/>
+          </w:rPr>
+          <m:t>add_gate&lt;G&gt;</m:t>
+        </m:r>
+        <m:d>
+          <m:dPr>
+            <m:ctrlPr>
+              <w:rPr>
+                <w:rFonts w:ascii="Cambria Math" w:hAnsi="Cambria Math"/>
+                <w:i/>
+                <w:lang w:eastAsia="es-ES"/>
+              </w:rPr>
+            </m:ctrlPr>
+          </m:dPr>
+          <m:e>
+            <m:r>
+              <w:rPr>
+                <w:rFonts w:ascii="Cambria Math" w:hAnsi="Cambria Math"/>
+                <w:lang w:eastAsia="es-ES"/>
+              </w:rPr>
+              <m:t xml:space="preserve"> </m:t>
+            </m:r>
+          </m:e>
+        </m:d>
+      </m:oMath>
+      <w:r>
+        <w:rPr>
+          <w:lang w:eastAsia="es-ES"/>
+        </w:rPr>
+        <w:t xml:space="preserve">. Los resultados se recogen en forma de histograma con </w:t>
+      </w:r>
+      <m:oMath>
+        <m:r>
+          <w:rPr>
+            <w:rFonts w:ascii="Cambria Math" w:hAnsi="Cambria Math"/>
+            <w:lang w:eastAsia="es-ES"/>
+          </w:rPr>
+          <m:t>histogram_string</m:t>
+        </m:r>
+        <m:d>
+          <m:dPr>
+            <m:ctrlPr>
+              <w:rPr>
+                <w:rFonts w:ascii="Cambria Math" w:hAnsi="Cambria Math"/>
+                <w:i/>
+                <w:lang w:eastAsia="es-ES"/>
+              </w:rPr>
+            </m:ctrlPr>
+          </m:dPr>
+          <m:e>
+            <m:r>
+              <w:rPr>
+                <w:rFonts w:ascii="Cambria Math" w:hAnsi="Cambria Math"/>
+                <w:lang w:eastAsia="es-ES"/>
+              </w:rPr>
+              <m:t xml:space="preserve"> </m:t>
+            </m:r>
+          </m:e>
+        </m:d>
+      </m:oMath>
+      <w:r>
+        <w:rPr>
+          <w:lang w:eastAsia="es-ES"/>
+        </w:rPr>
+        <w:t>.</w:t>
+      </w:r>
+    </w:p>
+    <w:p>
+      <w:pPr>
+        <w:rPr>
+          <w:lang w:eastAsia="es-ES"/>
+        </w:rPr>
+      </w:pPr>
+      <w:r>
+        <w:rPr>
+          <w:lang w:eastAsia="es-ES"/>
+        </w:rPr>
+        <w:t xml:space="preserve">En el benchmark cumple un papel concreto. Funciona como referencia limpia, es decir, como un simulador de estado vectorial correcto, desprovisto de fusión de puertas, transpilación o paralelismo, que cuantifica la brecha de rendimiento frente a los frameworks modernos y el impacto acumulado de las optimizaciones del período 2019-2025. La memoria de pico se lee </w:t>
+      </w:r>
+      <w:r>
+        <w:rPr>
+          <w:lang w:eastAsia="es-ES"/>
+        </w:rPr>
+        <w:lastRenderedPageBreak/>
+        <w:t xml:space="preserve">desde /proc/self/status, que solo funciona en Linux, por lo que no es posible utilizarlo en macOS. El límite práctico ronda los 25-27 qubits con 16 GB de RAM, aunque Grover exige </w:t>
+      </w:r>
+      <m:oMath>
+        <m:r>
+          <w:rPr>
+            <w:rFonts w:ascii="Cambria Math" w:hAnsi="Cambria Math"/>
+            <w:lang w:eastAsia="es-ES"/>
+          </w:rPr>
+          <m:t>2n-2</m:t>
+        </m:r>
+      </m:oMath>
+      <w:r>
+        <w:rPr>
+          <w:lang w:eastAsia="es-ES"/>
+        </w:rPr>
+        <w:t xml:space="preserve"> qubits y deja el techo operativo en </w:t>
+      </w:r>
+      <m:oMath>
+        <m:r>
+          <w:rPr>
+            <w:rFonts w:ascii="Cambria Math" w:hAnsi="Cambria Math"/>
+            <w:lang w:eastAsia="es-ES"/>
+          </w:rPr>
+          <m:t>n=14</m:t>
+        </m:r>
+      </m:oMath>
+      <w:r>
+        <w:rPr>
+          <w:lang w:eastAsia="es-ES"/>
+        </w:rPr>
+        <w:t>.</w:t>
+      </w:r>
+    </w:p>
+    <w:p>
+      <w:pPr>
         <w:pStyle w:val="Heading3"/>
         <w:numPr>
           <w:ilvl w:val="2"/>
@@ -11914,7 +13461,6 @@
           <w:lang w:eastAsia="es-ES"/>
         </w:rPr>
       </w:pPr>
-      <w:bookmarkStart w:id="101" w:name="_Toc232954407"/>
       <w:r>
         <w:rPr>
           <w:lang w:eastAsia="es-ES"/>
@@ -13725,7 +15271,6 @@
               <w:rPr>
                 <w:lang w:eastAsia="es-ES"/>
               </w:rPr>
-              <w:lastRenderedPageBreak/>
               <w:t>error</w:t>
             </w:r>
           </w:p>
@@ -13811,6 +15356,7 @@
         <w:rPr>
           <w:lang w:eastAsia="es-ES"/>
         </w:rPr>
+        <w:lastRenderedPageBreak/>
         <w:t>Requisitos del sistema</w:t>
       </w:r>
       <w:bookmarkEnd w:id="103"/>
@@ -14979,7 +16525,6 @@
               <w:rPr>
                 <w:lang w:eastAsia="es-ES"/>
               </w:rPr>
-              <w:lastRenderedPageBreak/>
               <w:t>RE6</w:t>
             </w:r>
           </w:p>
@@ -15083,6 +16628,7 @@
         <w:rPr>
           <w:lang w:eastAsia="es-ES"/>
         </w:rPr>
+        <w:lastRenderedPageBreak/>
         <w:t>Especificación de las pruebas</w:t>
       </w:r>
       <w:bookmarkEnd w:id="107"/>
@@ -15594,7 +17140,6 @@
                       <w:rPr>
                         <w:noProof/>
                       </w:rPr>
-                      <w:lastRenderedPageBreak/>
                       <w:t xml:space="preserve">[3] </w:t>
                     </w:r>
                   </w:p>
@@ -15641,6 +17186,7 @@
                       <w:rPr>
                         <w:noProof/>
                       </w:rPr>
+                      <w:lastRenderedPageBreak/>
                       <w:t xml:space="preserve">[4] </w:t>
                     </w:r>
                   </w:p>
@@ -27194,7 +28740,6 @@
   <w:style w:type="character" w:default="1" w:styleId="DefaultParagraphFont">
     <w:name w:val="Default Paragraph Font"/>
     <w:uiPriority w:val="1"/>
-    <w:semiHidden/>
     <w:unhideWhenUsed/>
   </w:style>
   <w:style w:type="table" w:default="1" w:styleId="TableNormal">

</xml_diff>

<commit_message>
chore (main): reduce benchmark levels for faster execution
- Grover n: [3,5,7,9,11] → [2,3,5]
- Shor N: [15,21,35,77,143] → [15,21,35]
- Repetitions: 30 → 15

Co-Authored-By: Claude Sonnet 4.6 <noreply@anthropic.com>
</commit_message>
<xml_diff>
--- a/Plantilla_TFG-PROYECTO(1).docx
+++ b/Plantilla_TFG-PROYECTO(1).docx
@@ -12461,14 +12461,14 @@
         <w:rPr>
           <w:lang w:eastAsia="es-ES"/>
         </w:rPr>
-        <w:t xml:space="preserve">Entre las métricas reportadas se encuentran las variables `cutting_find_time_ms` y `cutting_wall_time_ms`, que desglosan el sobrecoste en coste de planificación y coste de ejecución. En Linux ARM64, la biblioteca no está disponible y el trabajador se detiene </w:t>
+        <w:t xml:space="preserve">En Linux ARM64, la biblioteca no está disponible y el trabajador se detiene correctamente. Además, existe una incompatibilidad de API entre Qiskit y QDisLib, ya que QDisLib reclama .nqubits, mientras que Qiskit publica .num_qubits, que se soluciona mediante un workaround </w:t>
       </w:r>
       <w:r>
         <w:rPr>
           <w:lang w:eastAsia="es-ES"/>
         </w:rPr>
         <w:lastRenderedPageBreak/>
-        <w:t xml:space="preserve">correctamente. Además, existe una incompatibilidad de API entre Qiskit y QDisLib, ya que QDisLib reclama .nqubits, mientras que Qiskit publica .num_qubits, que se soluciona mediante un workaround explícito antes de la llamada a </w:t>
+        <w:t xml:space="preserve">explícito antes de la llamada a </w:t>
       </w:r>
       <m:oMath>
         <m:r>
@@ -12504,6 +12504,50 @@
           <w:lang w:eastAsia="es-ES"/>
         </w:rPr>
         <w:t>.</w:t>
+      </w:r>
+      <w:r>
+        <w:t xml:space="preserve"> </w:t>
+      </w:r>
+      <w:r>
+        <w:rPr>
+          <w:lang w:eastAsia="es-ES"/>
+        </w:rPr>
+        <w:t xml:space="preserve">En la versión actual del benchmark, la ejecución con corte está deshabilitada. </w:t>
+      </w:r>
+      <m:oMath>
+        <m:r>
+          <w:rPr>
+            <w:rFonts w:ascii="Cambria Math" w:hAnsi="Cambria Math"/>
+            <w:lang w:eastAsia="es-ES"/>
+          </w:rPr>
+          <m:t>find_cut</m:t>
+        </m:r>
+        <m:d>
+          <m:dPr>
+            <m:ctrlPr>
+              <w:rPr>
+                <w:rFonts w:ascii="Cambria Math" w:hAnsi="Cambria Math"/>
+                <w:i/>
+                <w:lang w:eastAsia="es-ES"/>
+              </w:rPr>
+            </m:ctrlPr>
+          </m:dPr>
+          <m:e>
+            <m:r>
+              <w:rPr>
+                <w:rFonts w:ascii="Cambria Math" w:hAnsi="Cambria Math"/>
+                <w:lang w:eastAsia="es-ES"/>
+              </w:rPr>
+              <m:t xml:space="preserve"> </m:t>
+            </m:r>
+          </m:e>
+        </m:d>
+      </m:oMath>
+      <w:r>
+        <w:rPr>
+          <w:lang w:eastAsia="es-ES"/>
+        </w:rPr>
+        <w:t xml:space="preserve"> no converge sobre los circuitos empleados: el oráculo de Grover es demasiado denso para el solver de partición de grafos, y la subred de exponenciación modular de Shor está demasiado conectada para que halle una solución en tiempo acotado. Las implementaciones permanecen en el código como referencia.</w:t>
       </w:r>
     </w:p>
     <w:p>
@@ -12984,6 +13028,7 @@
         <w:rPr>
           <w:lang w:eastAsia="es-ES"/>
         </w:rPr>
+        <w:lastRenderedPageBreak/>
         <w:t xml:space="preserve">El coste se paga en qubits. Esta inflación del circuito real explica que el rango de evaluación de Grover se acote a </w:t>
       </w:r>
       <m:oMath>
@@ -13036,14 +13081,7 @@
         <w:rPr>
           <w:lang w:eastAsia="es-ES"/>
         </w:rPr>
-        <w:t xml:space="preserve">, supondría un total de </w:t>
-      </w:r>
-      <w:r>
-        <w:rPr>
-          <w:lang w:eastAsia="es-ES"/>
-        </w:rPr>
-        <w:lastRenderedPageBreak/>
-        <w:t>24 qubits y 256 MB dedicados únicamente al vector de estado. La ejecución transcurre estrictamente en un solo hilo y sin soporte de GPU.</w:t>
+        <w:t>, supondría un total de 24 qubits y 256 MB dedicados únicamente al vector de estado. La ejecución transcurre estrictamente en un solo hilo y sin soporte de GPU.</w:t>
       </w:r>
     </w:p>
     <w:p>
@@ -13410,14 +13448,14 @@
         <w:rPr>
           <w:lang w:eastAsia="es-ES"/>
         </w:rPr>
-        <w:t xml:space="preserve">En el benchmark cumple un papel concreto. Funciona como referencia limpia, es decir, como un simulador de estado vectorial correcto, desprovisto de fusión de puertas, transpilación o paralelismo, que cuantifica la brecha de rendimiento frente a los frameworks modernos y el impacto acumulado de las optimizaciones del período 2019-2025. La memoria de pico se lee </w:t>
+        <w:t xml:space="preserve">En el benchmark cumple un papel concreto. Funciona como referencia limpia, es decir, como un simulador de estado vectorial correcto, desprovisto de fusión de puertas, transpilación o </w:t>
       </w:r>
       <w:r>
         <w:rPr>
           <w:lang w:eastAsia="es-ES"/>
         </w:rPr>
         <w:lastRenderedPageBreak/>
-        <w:t xml:space="preserve">desde /proc/self/status, que solo funciona en Linux, por lo que no es posible utilizarlo en macOS. El límite práctico ronda los 25-27 qubits con 16 GB de RAM, aunque Grover exige </w:t>
+        <w:t xml:space="preserve">paralelismo, que cuantifica la brecha de rendimiento frente a los frameworks modernos y el impacto acumulado de las optimizaciones del período 2019-2025. La memoria de pico se lee desde /proc/self/status, que solo funciona en Linux, por lo que no es posible utilizarlo en macOS. El límite práctico ronda los 25-27 qubits con 16 GB de RAM, aunque Grover exige </w:t>
       </w:r>
       <m:oMath>
         <m:r>
@@ -13471,6 +13509,59 @@
     </w:p>
     <w:p>
       <w:pPr>
+        <w:rPr>
+          <w:lang w:eastAsia="es-ES"/>
+        </w:rPr>
+      </w:pPr>
+      <w:r>
+        <w:rPr>
+          <w:lang w:eastAsia="es-ES"/>
+        </w:rPr>
+        <w:t>La imagen se construye por fases. Se trata de un proceso multietapa que separa la compilación y la ejecución en seis etapas independientes, de modo que cada una de ellas realiza una tarea específica sobre una base elegida a propósito, sin incluir elementos superfluos. Nada del compilador llega al contenedor final. Esa frontera se mantiene limpia de principio a fin.</w:t>
+      </w:r>
+    </w:p>
+    <w:p>
+      <w:pPr>
+        <w:rPr>
+          <w:lang w:eastAsia="es-ES"/>
+        </w:rPr>
+      </w:pPr>
+      <w:r>
+        <w:rPr>
+          <w:lang w:eastAsia="es-ES"/>
+        </w:rPr>
+        <w:t>Los dos primeros stages, qcgpu-amd64 y rust-builder, comparten la base rust:slim-bookworm y existen con un único cometido: producir binarios. qcgpu-amd64 compila qcgpu por separado y en aislamiento porque necesita las cabeceras de desarrollo de OpenCL durante la compilación y no en tiempo de ejecución, y esta distinción es la que justifica el aislamiento. rust-builder se ocupa del resto. Compila de forma cruzada los demás binarios Rust (esto es, q1tsim, quantr y quantrs2) para las dos arquitecturas desde un mismo host y, cuando el objetivo es amd64, reutiliza los binarios de qcgpu que dejó el stage anterior.</w:t>
+      </w:r>
+    </w:p>
+    <w:p>
+      <w:pPr>
+        <w:rPr>
+          <w:lang w:eastAsia="es-ES"/>
+        </w:rPr>
+      </w:pPr>
+      <w:bookmarkStart w:id="102" w:name="_Toc232954408"/>
+      <w:r>
+        <w:rPr>
+          <w:lang w:eastAsia="es-ES"/>
+        </w:rPr>
+        <w:t>Aquí el camino se bifurca. Para AMD64, la base es nvidia/cuda:12.6.0-runtime-ubuntu22.04, que aporta el entorno de ejecución CUDA que requieren tanto qcgpu como CUDA-Q. Para arm64, basta con la base python:3.12-slim-bookworm, ya que en esa arquitectura ningún framework con aceleración GPU llega a funcionar y cargar el runtime CUDA sería peso muerto. Sobre cada base se levanta una instancia de stage con el nombre «python-deps» que instala las dependencias de Python con «uv». Los extras varían según la arquitectura. En amd64 se activan x86only+gpu, que incluyen consigo qcgpu, cudaq y qdislib. En arm64, solo se conserva el grupo base, sin añadidos. En amd64, por otro lado, es necesario sumar pycompss 3.4, lo que obliga a parchear manualmente el sistema de construcción autotools del paquete. Sin esos parches, sencillamente no compila.</w:t>
+      </w:r>
+    </w:p>
+    <w:p>
+      <w:pPr>
+        <w:rPr>
+          <w:lang w:eastAsia="es-ES"/>
+        </w:rPr>
+      </w:pPr>
+      <w:r>
+        <w:rPr>
+          <w:lang w:eastAsia="es-ES"/>
+        </w:rPr>
+        <w:t>La fase final, «runtime», es la que ensambla todo. Hereda la imagen base de la arquitectura de destino, copia el entorno virtual de Python-deps y los binarios Rust de Rust-builder, configura LD_LIBRARY_PATH y registra las bibliotecas compartidas con ldconfig. El etiquetado exacto de la imagen se guarda en el campo benchmark_image de cada fila de resultados. Esto permite comparar mediciones de colaboradores distintos con la garantía de que todos ejecutaron el mismo sistema de archivos y las mismas dependencias.</w:t>
+      </w:r>
+    </w:p>
+    <w:p>
+      <w:pPr>
         <w:pStyle w:val="Heading3"/>
         <w:numPr>
           <w:ilvl w:val="2"/>
@@ -13480,7 +13571,6 @@
           <w:lang w:eastAsia="es-ES"/>
         </w:rPr>
       </w:pPr>
-      <w:bookmarkStart w:id="102" w:name="_Toc232954408"/>
       <w:r>
         <w:rPr>
           <w:lang w:eastAsia="es-ES"/>
@@ -14038,6 +14128,7 @@
               <w:rPr>
                 <w:lang w:eastAsia="es-ES"/>
               </w:rPr>
+              <w:lastRenderedPageBreak/>
               <w:t>cpu_physical_cores</w:t>
             </w:r>
           </w:p>
@@ -15356,7 +15447,6 @@
         <w:rPr>
           <w:lang w:eastAsia="es-ES"/>
         </w:rPr>
-        <w:lastRenderedPageBreak/>
         <w:t>Requisitos del sistema</w:t>
       </w:r>
       <w:bookmarkEnd w:id="103"/>
@@ -15828,6 +15918,7 @@
         <w:rPr>
           <w:lang w:eastAsia="es-ES"/>
         </w:rPr>
+        <w:lastRenderedPageBreak/>
         <w:t>Requisitos no funcionales</w:t>
       </w:r>
       <w:bookmarkEnd w:id="105"/>
@@ -16628,7 +16719,6 @@
         <w:rPr>
           <w:lang w:eastAsia="es-ES"/>
         </w:rPr>
-        <w:lastRenderedPageBreak/>
         <w:t>Especificación de las pruebas</w:t>
       </w:r>
       <w:bookmarkEnd w:id="107"/>
@@ -16800,6 +16890,7 @@
         <w:rPr>
           <w:lang w:eastAsia="es-ES"/>
         </w:rPr>
+        <w:lastRenderedPageBreak/>
         <w:t>Planificación</w:t>
       </w:r>
       <w:r>
@@ -17186,7 +17277,6 @@
                       <w:rPr>
                         <w:noProof/>
                       </w:rPr>
-                      <w:lastRenderedPageBreak/>
                       <w:t xml:space="preserve">[4] </w:t>
                     </w:r>
                   </w:p>

</xml_diff>

<commit_message>
feat (main): add mathematize skill and document equation patch scripts
- Add .claude/commands/mathematize.md: skill for DeepL typo fixes and
  Spanish math prose -> plain-text symbol conversion (no m:oMath)
- Add patch_doc_equations.py: OMML equation conversion script for Word docx
- Add patch_math_vars.py: word-boundary variable/gate equation conversion
- Add patch_doc_equations_followup.py: follow-up equation patch pass

Co-Authored-By: Claude Sonnet 4.6 <noreply@anthropic.com>
</commit_message>
<xml_diff>
--- a/Plantilla_TFG-PROYECTO(1).docx
+++ b/Plantilla_TFG-PROYECTO(1).docx
@@ -23833,7 +23833,19 @@
         <w:rPr>
           <w:lang w:eastAsia="es-ES"/>
         </w:rPr>
-        <w:t>La suite de pruebas se divide en tres grupos. Los tests de Grover cubren cuatro casos: registros de tres y cuatro qubits con distintos objetivos y el caso límite en el que el objetivo es igual a cero. Los tests de Shor cubren siete casos: el cálculo del orden de dos módulo quince, la detección de bases con gcd mayor que uno, los atajos clásicos para números pares y potencias perfectas, y la factorización completa, marcada como #[ignore] por su duración. Por último, el paquete classical.rs tiene un conjunto propio de cinco pruebas unitarias para mod_pow, los cuatro casos de borde de limit_denominator y la reducción al orden mínimo mediante factores primos, lo que diferencia a QUANTOR del resto, ya que las funciones de postprocesamiento clásico tienen cobertura independiente del circuito cuántico.</w:t>
+        <w:t>La suite de pruebas se divide en tres grupos. Los tests de Grover cubren cuatro casos: registros de tres y cuatro qubits con distintos objetivos y el caso límite en el que el objetivo es igual a cero. Los tests de Shor cubren siete casos: el cálculo del orden de dos módulo</w:t>
+      </w:r>
+      <w:r>
+        <w:rPr>
+          <w:lang w:eastAsia="es-ES"/>
+        </w:rPr>
+        <w:t>/a</w:t>
+      </w:r>
+      <w:r>
+        <w:rPr>
+          <w:lang w:eastAsia="es-ES"/>
+        </w:rPr>
+        <w:t xml:space="preserve"> quince, la detección de bases con gcd mayor que uno, los atajos clásicos para números pares y potencias perfectas, y la factorización completa, marcada como #[ignore] por su duración. Por último, el paquete classical.rs tiene un conjunto propio de cinco pruebas unitarias para mod_pow, los cuatro casos de borde de limit_denominator y la reducción al orden mínimo mediante factores primos, lo que diferencia a QUANTOR del resto, ya que las funciones de postprocesamiento clásico tienen cobertura independiente del circuito cuántico.</w:t>
       </w:r>
     </w:p>
     <w:p>

</xml_diff>

<commit_message>
docs (main): add Docker/CI/CD hito and apply DeepL corrections
- Write hito 5.11: Docker infrastructure (5-stage Dockerfile, multi-arch build, CI/CD workflow, bench script)
- Fix QCGPU/qCGPU capitalization in P558 (3 occurrences)
- Fix Linux-amd64-*/Linux-arm64-* platform names to lowercase in P562
- Fix em dash in --test flag (–test → --test) in P562

Co-Authored-By: Claude Sonnet 4.6 <noreply@anthropic.com>
</commit_message>
<xml_diff>
--- a/Plantilla_TFG-PROYECTO(1).docx
+++ b/Plantilla_TFG-PROYECTO(1).docx
@@ -4235,7 +4235,7 @@
       <w:pPr>
         <w:pStyle w:val="Heading1"/>
       </w:pPr>
-      <w:bookmarkStart w:id="0" w:name="_Toc233913355"/>
+      <w:bookmarkStart w:id="0" w:name="_Toc234000034"/>
       <w:r>
         <w:lastRenderedPageBreak/>
         <w:t>Índice</w:t>
@@ -4282,7 +4282,7 @@
           <w:r>
             <w:fldChar w:fldCharType="separate"/>
           </w:r>
-          <w:hyperlink w:anchor="_Toc233913355" w:history="1">
+          <w:hyperlink w:anchor="_Toc234000034" w:history="1">
             <w:r>
               <w:rPr>
                 <w:rStyle w:val="Hyperlink"/>
@@ -4309,7 +4309,7 @@
                 <w:noProof/>
                 <w:webHidden/>
               </w:rPr>
-              <w:instrText xml:space="preserve"> PAGEREF _Toc233913355 \h </w:instrText>
+              <w:instrText xml:space="preserve"> PAGEREF _Toc234000034 \h </w:instrText>
             </w:r>
             <w:r>
               <w:rPr>
@@ -4356,7 +4356,7 @@
               <w14:ligatures w14:val="standardContextual"/>
             </w:rPr>
           </w:pPr>
-          <w:hyperlink w:anchor="_Toc233913356" w:history="1">
+          <w:hyperlink w:anchor="_Toc234000035" w:history="1">
             <w:r>
               <w:rPr>
                 <w:rStyle w:val="Hyperlink"/>
@@ -4383,7 +4383,7 @@
                 <w:noProof/>
                 <w:webHidden/>
               </w:rPr>
-              <w:instrText xml:space="preserve"> PAGEREF _Toc233913356 \h </w:instrText>
+              <w:instrText xml:space="preserve"> PAGEREF _Toc234000035 \h </w:instrText>
             </w:r>
             <w:r>
               <w:rPr>
@@ -4430,7 +4430,7 @@
               <w14:ligatures w14:val="standardContextual"/>
             </w:rPr>
           </w:pPr>
-          <w:hyperlink w:anchor="_Toc233913357" w:history="1">
+          <w:hyperlink w:anchor="_Toc234000036" w:history="1">
             <w:r>
               <w:rPr>
                 <w:rStyle w:val="Hyperlink"/>
@@ -4457,7 +4457,7 @@
                 <w:noProof/>
                 <w:webHidden/>
               </w:rPr>
-              <w:instrText xml:space="preserve"> PAGEREF _Toc233913357 \h </w:instrText>
+              <w:instrText xml:space="preserve"> PAGEREF _Toc234000036 \h </w:instrText>
             </w:r>
             <w:r>
               <w:rPr>
@@ -4504,7 +4504,7 @@
               <w14:ligatures w14:val="standardContextual"/>
             </w:rPr>
           </w:pPr>
-          <w:hyperlink w:anchor="_Toc233913358" w:history="1">
+          <w:hyperlink w:anchor="_Toc234000037" w:history="1">
             <w:r>
               <w:rPr>
                 <w:rStyle w:val="Hyperlink"/>
@@ -4531,7 +4531,7 @@
                 <w:noProof/>
                 <w:webHidden/>
               </w:rPr>
-              <w:instrText xml:space="preserve"> PAGEREF _Toc233913358 \h </w:instrText>
+              <w:instrText xml:space="preserve"> PAGEREF _Toc234000037 \h </w:instrText>
             </w:r>
             <w:r>
               <w:rPr>
@@ -4578,7 +4578,7 @@
               <w14:ligatures w14:val="standardContextual"/>
             </w:rPr>
           </w:pPr>
-          <w:hyperlink w:anchor="_Toc233913359" w:history="1">
+          <w:hyperlink w:anchor="_Toc234000038" w:history="1">
             <w:r>
               <w:rPr>
                 <w:rStyle w:val="Hyperlink"/>
@@ -4605,7 +4605,7 @@
                 <w:noProof/>
                 <w:webHidden/>
               </w:rPr>
-              <w:instrText xml:space="preserve"> PAGEREF _Toc233913359 \h </w:instrText>
+              <w:instrText xml:space="preserve"> PAGEREF _Toc234000038 \h </w:instrText>
             </w:r>
             <w:r>
               <w:rPr>
@@ -4652,7 +4652,7 @@
               <w14:ligatures w14:val="standardContextual"/>
             </w:rPr>
           </w:pPr>
-          <w:hyperlink w:anchor="_Toc233913360" w:history="1">
+          <w:hyperlink w:anchor="_Toc234000039" w:history="1">
             <w:r>
               <w:rPr>
                 <w:rStyle w:val="Hyperlink"/>
@@ -4680,7 +4680,7 @@
                 <w:noProof/>
                 <w:webHidden/>
               </w:rPr>
-              <w:instrText xml:space="preserve"> PAGEREF _Toc233913360 \h </w:instrText>
+              <w:instrText xml:space="preserve"> PAGEREF _Toc234000039 \h </w:instrText>
             </w:r>
             <w:r>
               <w:rPr>
@@ -4728,7 +4728,7 @@
               <w14:ligatures w14:val="standardContextual"/>
             </w:rPr>
           </w:pPr>
-          <w:hyperlink w:anchor="_Toc233913361" w:history="1">
+          <w:hyperlink w:anchor="_Toc234000040" w:history="1">
             <w:r>
               <w:rPr>
                 <w:rStyle w:val="Hyperlink"/>
@@ -4776,7 +4776,7 @@
                 <w:noProof/>
                 <w:webHidden/>
               </w:rPr>
-              <w:instrText xml:space="preserve"> PAGEREF _Toc233913361 \h </w:instrText>
+              <w:instrText xml:space="preserve"> PAGEREF _Toc234000040 \h </w:instrText>
             </w:r>
             <w:r>
               <w:rPr>
@@ -4824,7 +4824,7 @@
               <w14:ligatures w14:val="standardContextual"/>
             </w:rPr>
           </w:pPr>
-          <w:hyperlink w:anchor="_Toc233913362" w:history="1">
+          <w:hyperlink w:anchor="_Toc234000041" w:history="1">
             <w:r>
               <w:rPr>
                 <w:rStyle w:val="Hyperlink"/>
@@ -4872,7 +4872,7 @@
                 <w:noProof/>
                 <w:webHidden/>
               </w:rPr>
-              <w:instrText xml:space="preserve"> PAGEREF _Toc233913362 \h </w:instrText>
+              <w:instrText xml:space="preserve"> PAGEREF _Toc234000041 \h </w:instrText>
             </w:r>
             <w:r>
               <w:rPr>
@@ -4920,7 +4920,7 @@
               <w14:ligatures w14:val="standardContextual"/>
             </w:rPr>
           </w:pPr>
-          <w:hyperlink w:anchor="_Toc233913363" w:history="1">
+          <w:hyperlink w:anchor="_Toc234000042" w:history="1">
             <w:r>
               <w:rPr>
                 <w:rStyle w:val="Hyperlink"/>
@@ -4968,7 +4968,7 @@
                 <w:noProof/>
                 <w:webHidden/>
               </w:rPr>
-              <w:instrText xml:space="preserve"> PAGEREF _Toc233913363 \h </w:instrText>
+              <w:instrText xml:space="preserve"> PAGEREF _Toc234000042 \h </w:instrText>
             </w:r>
             <w:r>
               <w:rPr>
@@ -5016,7 +5016,7 @@
               <w14:ligatures w14:val="standardContextual"/>
             </w:rPr>
           </w:pPr>
-          <w:hyperlink w:anchor="_Toc233913364" w:history="1">
+          <w:hyperlink w:anchor="_Toc234000043" w:history="1">
             <w:r>
               <w:rPr>
                 <w:rStyle w:val="Hyperlink"/>
@@ -5064,7 +5064,7 @@
                 <w:noProof/>
                 <w:webHidden/>
               </w:rPr>
-              <w:instrText xml:space="preserve"> PAGEREF _Toc233913364 \h </w:instrText>
+              <w:instrText xml:space="preserve"> PAGEREF _Toc234000043 \h </w:instrText>
             </w:r>
             <w:r>
               <w:rPr>
@@ -5112,7 +5112,7 @@
               <w14:ligatures w14:val="standardContextual"/>
             </w:rPr>
           </w:pPr>
-          <w:hyperlink w:anchor="_Toc233913365" w:history="1">
+          <w:hyperlink w:anchor="_Toc234000044" w:history="1">
             <w:r>
               <w:rPr>
                 <w:rStyle w:val="Hyperlink"/>
@@ -5160,7 +5160,7 @@
                 <w:noProof/>
                 <w:webHidden/>
               </w:rPr>
-              <w:instrText xml:space="preserve"> PAGEREF _Toc233913365 \h </w:instrText>
+              <w:instrText xml:space="preserve"> PAGEREF _Toc234000044 \h </w:instrText>
             </w:r>
             <w:r>
               <w:rPr>
@@ -5208,7 +5208,7 @@
               <w14:ligatures w14:val="standardContextual"/>
             </w:rPr>
           </w:pPr>
-          <w:hyperlink w:anchor="_Toc233913366" w:history="1">
+          <w:hyperlink w:anchor="_Toc234000045" w:history="1">
             <w:r>
               <w:rPr>
                 <w:rStyle w:val="Hyperlink"/>
@@ -5256,7 +5256,7 @@
                 <w:noProof/>
                 <w:webHidden/>
               </w:rPr>
-              <w:instrText xml:space="preserve"> PAGEREF _Toc233913366 \h </w:instrText>
+              <w:instrText xml:space="preserve"> PAGEREF _Toc234000045 \h </w:instrText>
             </w:r>
             <w:r>
               <w:rPr>
@@ -5304,7 +5304,7 @@
               <w14:ligatures w14:val="standardContextual"/>
             </w:rPr>
           </w:pPr>
-          <w:hyperlink w:anchor="_Toc233913367" w:history="1">
+          <w:hyperlink w:anchor="_Toc234000046" w:history="1">
             <w:r>
               <w:rPr>
                 <w:rStyle w:val="Hyperlink"/>
@@ -5352,7 +5352,7 @@
                 <w:noProof/>
                 <w:webHidden/>
               </w:rPr>
-              <w:instrText xml:space="preserve"> PAGEREF _Toc233913367 \h </w:instrText>
+              <w:instrText xml:space="preserve"> PAGEREF _Toc234000046 \h </w:instrText>
             </w:r>
             <w:r>
               <w:rPr>
@@ -5400,7 +5400,7 @@
               <w14:ligatures w14:val="standardContextual"/>
             </w:rPr>
           </w:pPr>
-          <w:hyperlink w:anchor="_Toc233913368" w:history="1">
+          <w:hyperlink w:anchor="_Toc234000047" w:history="1">
             <w:r>
               <w:rPr>
                 <w:rStyle w:val="Hyperlink"/>
@@ -5448,7 +5448,7 @@
                 <w:noProof/>
                 <w:webHidden/>
               </w:rPr>
-              <w:instrText xml:space="preserve"> PAGEREF _Toc233913368 \h </w:instrText>
+              <w:instrText xml:space="preserve"> PAGEREF _Toc234000047 \h </w:instrText>
             </w:r>
             <w:r>
               <w:rPr>
@@ -5496,7 +5496,7 @@
               <w14:ligatures w14:val="standardContextual"/>
             </w:rPr>
           </w:pPr>
-          <w:hyperlink w:anchor="_Toc233913369" w:history="1">
+          <w:hyperlink w:anchor="_Toc234000048" w:history="1">
             <w:r>
               <w:rPr>
                 <w:rStyle w:val="Hyperlink"/>
@@ -5544,7 +5544,7 @@
                 <w:noProof/>
                 <w:webHidden/>
               </w:rPr>
-              <w:instrText xml:space="preserve"> PAGEREF _Toc233913369 \h </w:instrText>
+              <w:instrText xml:space="preserve"> PAGEREF _Toc234000048 \h </w:instrText>
             </w:r>
             <w:r>
               <w:rPr>
@@ -5592,7 +5592,7 @@
               <w14:ligatures w14:val="standardContextual"/>
             </w:rPr>
           </w:pPr>
-          <w:hyperlink w:anchor="_Toc233913370" w:history="1">
+          <w:hyperlink w:anchor="_Toc234000049" w:history="1">
             <w:r>
               <w:rPr>
                 <w:rStyle w:val="Hyperlink"/>
@@ -5640,7 +5640,7 @@
                 <w:noProof/>
                 <w:webHidden/>
               </w:rPr>
-              <w:instrText xml:space="preserve"> PAGEREF _Toc233913370 \h </w:instrText>
+              <w:instrText xml:space="preserve"> PAGEREF _Toc234000049 \h </w:instrText>
             </w:r>
             <w:r>
               <w:rPr>
@@ -5688,7 +5688,7 @@
               <w14:ligatures w14:val="standardContextual"/>
             </w:rPr>
           </w:pPr>
-          <w:hyperlink w:anchor="_Toc233913371" w:history="1">
+          <w:hyperlink w:anchor="_Toc234000050" w:history="1">
             <w:r>
               <w:rPr>
                 <w:rStyle w:val="Hyperlink"/>
@@ -5736,7 +5736,7 @@
                 <w:noProof/>
                 <w:webHidden/>
               </w:rPr>
-              <w:instrText xml:space="preserve"> PAGEREF _Toc233913371 \h </w:instrText>
+              <w:instrText xml:space="preserve"> PAGEREF _Toc234000050 \h </w:instrText>
             </w:r>
             <w:r>
               <w:rPr>
@@ -5784,7 +5784,7 @@
               <w14:ligatures w14:val="standardContextual"/>
             </w:rPr>
           </w:pPr>
-          <w:hyperlink w:anchor="_Toc233913372" w:history="1">
+          <w:hyperlink w:anchor="_Toc234000051" w:history="1">
             <w:r>
               <w:rPr>
                 <w:rStyle w:val="Hyperlink"/>
@@ -5832,7 +5832,7 @@
                 <w:noProof/>
                 <w:webHidden/>
               </w:rPr>
-              <w:instrText xml:space="preserve"> PAGEREF _Toc233913372 \h </w:instrText>
+              <w:instrText xml:space="preserve"> PAGEREF _Toc234000051 \h </w:instrText>
             </w:r>
             <w:r>
               <w:rPr>
@@ -5880,7 +5880,7 @@
               <w14:ligatures w14:val="standardContextual"/>
             </w:rPr>
           </w:pPr>
-          <w:hyperlink w:anchor="_Toc233913373" w:history="1">
+          <w:hyperlink w:anchor="_Toc234000052" w:history="1">
             <w:r>
               <w:rPr>
                 <w:rStyle w:val="Hyperlink"/>
@@ -5928,7 +5928,7 @@
                 <w:noProof/>
                 <w:webHidden/>
               </w:rPr>
-              <w:instrText xml:space="preserve"> PAGEREF _Toc233913373 \h </w:instrText>
+              <w:instrText xml:space="preserve"> PAGEREF _Toc234000052 \h </w:instrText>
             </w:r>
             <w:r>
               <w:rPr>
@@ -5976,7 +5976,7 @@
               <w14:ligatures w14:val="standardContextual"/>
             </w:rPr>
           </w:pPr>
-          <w:hyperlink w:anchor="_Toc233913374" w:history="1">
+          <w:hyperlink w:anchor="_Toc234000053" w:history="1">
             <w:r>
               <w:rPr>
                 <w:rStyle w:val="Hyperlink"/>
@@ -6024,7 +6024,7 @@
                 <w:noProof/>
                 <w:webHidden/>
               </w:rPr>
-              <w:instrText xml:space="preserve"> PAGEREF _Toc233913374 \h </w:instrText>
+              <w:instrText xml:space="preserve"> PAGEREF _Toc234000053 \h </w:instrText>
             </w:r>
             <w:r>
               <w:rPr>
@@ -6072,7 +6072,7 @@
               <w14:ligatures w14:val="standardContextual"/>
             </w:rPr>
           </w:pPr>
-          <w:hyperlink w:anchor="_Toc233913375" w:history="1">
+          <w:hyperlink w:anchor="_Toc234000054" w:history="1">
             <w:r>
               <w:rPr>
                 <w:rStyle w:val="Hyperlink"/>
@@ -6120,7 +6120,7 @@
                 <w:noProof/>
                 <w:webHidden/>
               </w:rPr>
-              <w:instrText xml:space="preserve"> PAGEREF _Toc233913375 \h </w:instrText>
+              <w:instrText xml:space="preserve"> PAGEREF _Toc234000054 \h </w:instrText>
             </w:r>
             <w:r>
               <w:rPr>
@@ -6168,7 +6168,7 @@
               <w14:ligatures w14:val="standardContextual"/>
             </w:rPr>
           </w:pPr>
-          <w:hyperlink w:anchor="_Toc233913376" w:history="1">
+          <w:hyperlink w:anchor="_Toc234000055" w:history="1">
             <w:r>
               <w:rPr>
                 <w:rStyle w:val="Hyperlink"/>
@@ -6216,7 +6216,7 @@
                 <w:noProof/>
                 <w:webHidden/>
               </w:rPr>
-              <w:instrText xml:space="preserve"> PAGEREF _Toc233913376 \h </w:instrText>
+              <w:instrText xml:space="preserve"> PAGEREF _Toc234000055 \h </w:instrText>
             </w:r>
             <w:r>
               <w:rPr>
@@ -6264,7 +6264,7 @@
               <w14:ligatures w14:val="standardContextual"/>
             </w:rPr>
           </w:pPr>
-          <w:hyperlink w:anchor="_Toc233913377" w:history="1">
+          <w:hyperlink w:anchor="_Toc234000056" w:history="1">
             <w:r>
               <w:rPr>
                 <w:rStyle w:val="Hyperlink"/>
@@ -6312,7 +6312,7 @@
                 <w:noProof/>
                 <w:webHidden/>
               </w:rPr>
-              <w:instrText xml:space="preserve"> PAGEREF _Toc233913377 \h </w:instrText>
+              <w:instrText xml:space="preserve"> PAGEREF _Toc234000056 \h </w:instrText>
             </w:r>
             <w:r>
               <w:rPr>
@@ -6360,7 +6360,7 @@
               <w14:ligatures w14:val="standardContextual"/>
             </w:rPr>
           </w:pPr>
-          <w:hyperlink w:anchor="_Toc233913378" w:history="1">
+          <w:hyperlink w:anchor="_Toc234000057" w:history="1">
             <w:r>
               <w:rPr>
                 <w:rStyle w:val="Hyperlink"/>
@@ -6408,7 +6408,7 @@
                 <w:noProof/>
                 <w:webHidden/>
               </w:rPr>
-              <w:instrText xml:space="preserve"> PAGEREF _Toc233913378 \h </w:instrText>
+              <w:instrText xml:space="preserve"> PAGEREF _Toc234000057 \h </w:instrText>
             </w:r>
             <w:r>
               <w:rPr>
@@ -6456,7 +6456,7 @@
               <w14:ligatures w14:val="standardContextual"/>
             </w:rPr>
           </w:pPr>
-          <w:hyperlink w:anchor="_Toc233913379" w:history="1">
+          <w:hyperlink w:anchor="_Toc234000058" w:history="1">
             <w:r>
               <w:rPr>
                 <w:rStyle w:val="Hyperlink"/>
@@ -6504,7 +6504,7 @@
                 <w:noProof/>
                 <w:webHidden/>
               </w:rPr>
-              <w:instrText xml:space="preserve"> PAGEREF _Toc233913379 \h </w:instrText>
+              <w:instrText xml:space="preserve"> PAGEREF _Toc234000058 \h </w:instrText>
             </w:r>
             <w:r>
               <w:rPr>
@@ -6552,7 +6552,7 @@
               <w14:ligatures w14:val="standardContextual"/>
             </w:rPr>
           </w:pPr>
-          <w:hyperlink w:anchor="_Toc233913380" w:history="1">
+          <w:hyperlink w:anchor="_Toc234000059" w:history="1">
             <w:r>
               <w:rPr>
                 <w:rStyle w:val="Hyperlink"/>
@@ -6600,7 +6600,7 @@
                 <w:noProof/>
                 <w:webHidden/>
               </w:rPr>
-              <w:instrText xml:space="preserve"> PAGEREF _Toc233913380 \h </w:instrText>
+              <w:instrText xml:space="preserve"> PAGEREF _Toc234000059 \h </w:instrText>
             </w:r>
             <w:r>
               <w:rPr>
@@ -6648,7 +6648,7 @@
               <w14:ligatures w14:val="standardContextual"/>
             </w:rPr>
           </w:pPr>
-          <w:hyperlink w:anchor="_Toc233913381" w:history="1">
+          <w:hyperlink w:anchor="_Toc234000060" w:history="1">
             <w:r>
               <w:rPr>
                 <w:rStyle w:val="Hyperlink"/>
@@ -6696,7 +6696,7 @@
                 <w:noProof/>
                 <w:webHidden/>
               </w:rPr>
-              <w:instrText xml:space="preserve"> PAGEREF _Toc233913381 \h </w:instrText>
+              <w:instrText xml:space="preserve"> PAGEREF _Toc234000060 \h </w:instrText>
             </w:r>
             <w:r>
               <w:rPr>
@@ -6744,7 +6744,7 @@
               <w14:ligatures w14:val="standardContextual"/>
             </w:rPr>
           </w:pPr>
-          <w:hyperlink w:anchor="_Toc233913385" w:history="1">
+          <w:hyperlink w:anchor="_Toc234000064" w:history="1">
             <w:r>
               <w:rPr>
                 <w:rStyle w:val="Hyperlink"/>
@@ -6792,7 +6792,7 @@
                 <w:noProof/>
                 <w:webHidden/>
               </w:rPr>
-              <w:instrText xml:space="preserve"> PAGEREF _Toc233913385 \h </w:instrText>
+              <w:instrText xml:space="preserve"> PAGEREF _Toc234000064 \h </w:instrText>
             </w:r>
             <w:r>
               <w:rPr>
@@ -6840,7 +6840,7 @@
               <w14:ligatures w14:val="standardContextual"/>
             </w:rPr>
           </w:pPr>
-          <w:hyperlink w:anchor="_Toc233913386" w:history="1">
+          <w:hyperlink w:anchor="_Toc234000065" w:history="1">
             <w:r>
               <w:rPr>
                 <w:rStyle w:val="Hyperlink"/>
@@ -6888,7 +6888,7 @@
                 <w:noProof/>
                 <w:webHidden/>
               </w:rPr>
-              <w:instrText xml:space="preserve"> PAGEREF _Toc233913386 \h </w:instrText>
+              <w:instrText xml:space="preserve"> PAGEREF _Toc234000065 \h </w:instrText>
             </w:r>
             <w:r>
               <w:rPr>
@@ -6936,7 +6936,7 @@
               <w14:ligatures w14:val="standardContextual"/>
             </w:rPr>
           </w:pPr>
-          <w:hyperlink w:anchor="_Toc233913387" w:history="1">
+          <w:hyperlink w:anchor="_Toc234000066" w:history="1">
             <w:r>
               <w:rPr>
                 <w:rStyle w:val="Hyperlink"/>
@@ -6984,7 +6984,7 @@
                 <w:noProof/>
                 <w:webHidden/>
               </w:rPr>
-              <w:instrText xml:space="preserve"> PAGEREF _Toc233913387 \h </w:instrText>
+              <w:instrText xml:space="preserve"> PAGEREF _Toc234000066 \h </w:instrText>
             </w:r>
             <w:r>
               <w:rPr>
@@ -7032,7 +7032,7 @@
               <w14:ligatures w14:val="standardContextual"/>
             </w:rPr>
           </w:pPr>
-          <w:hyperlink w:anchor="_Toc233913388" w:history="1">
+          <w:hyperlink w:anchor="_Toc234000067" w:history="1">
             <w:r>
               <w:rPr>
                 <w:rStyle w:val="Hyperlink"/>
@@ -7080,7 +7080,7 @@
                 <w:noProof/>
                 <w:webHidden/>
               </w:rPr>
-              <w:instrText xml:space="preserve"> PAGEREF _Toc233913388 \h </w:instrText>
+              <w:instrText xml:space="preserve"> PAGEREF _Toc234000067 \h </w:instrText>
             </w:r>
             <w:r>
               <w:rPr>
@@ -7128,7 +7128,7 @@
               <w14:ligatures w14:val="standardContextual"/>
             </w:rPr>
           </w:pPr>
-          <w:hyperlink w:anchor="_Toc233913389" w:history="1">
+          <w:hyperlink w:anchor="_Toc234000068" w:history="1">
             <w:r>
               <w:rPr>
                 <w:rStyle w:val="Hyperlink"/>
@@ -7176,7 +7176,7 @@
                 <w:noProof/>
                 <w:webHidden/>
               </w:rPr>
-              <w:instrText xml:space="preserve"> PAGEREF _Toc233913389 \h </w:instrText>
+              <w:instrText xml:space="preserve"> PAGEREF _Toc234000068 \h </w:instrText>
             </w:r>
             <w:r>
               <w:rPr>
@@ -7224,7 +7224,7 @@
               <w14:ligatures w14:val="standardContextual"/>
             </w:rPr>
           </w:pPr>
-          <w:hyperlink w:anchor="_Toc233913390" w:history="1">
+          <w:hyperlink w:anchor="_Toc234000069" w:history="1">
             <w:r>
               <w:rPr>
                 <w:rStyle w:val="Hyperlink"/>
@@ -7272,7 +7272,7 @@
                 <w:noProof/>
                 <w:webHidden/>
               </w:rPr>
-              <w:instrText xml:space="preserve"> PAGEREF _Toc233913390 \h </w:instrText>
+              <w:instrText xml:space="preserve"> PAGEREF _Toc234000069 \h </w:instrText>
             </w:r>
             <w:r>
               <w:rPr>
@@ -7320,7 +7320,7 @@
               <w14:ligatures w14:val="standardContextual"/>
             </w:rPr>
           </w:pPr>
-          <w:hyperlink w:anchor="_Toc233913391" w:history="1">
+          <w:hyperlink w:anchor="_Toc234000070" w:history="1">
             <w:r>
               <w:rPr>
                 <w:rStyle w:val="Hyperlink"/>
@@ -7368,7 +7368,7 @@
                 <w:noProof/>
                 <w:webHidden/>
               </w:rPr>
-              <w:instrText xml:space="preserve"> PAGEREF _Toc233913391 \h </w:instrText>
+              <w:instrText xml:space="preserve"> PAGEREF _Toc234000070 \h </w:instrText>
             </w:r>
             <w:r>
               <w:rPr>
@@ -7416,7 +7416,7 @@
               <w14:ligatures w14:val="standardContextual"/>
             </w:rPr>
           </w:pPr>
-          <w:hyperlink w:anchor="_Toc233913392" w:history="1">
+          <w:hyperlink w:anchor="_Toc234000071" w:history="1">
             <w:r>
               <w:rPr>
                 <w:rStyle w:val="Hyperlink"/>
@@ -7464,7 +7464,7 @@
                 <w:noProof/>
                 <w:webHidden/>
               </w:rPr>
-              <w:instrText xml:space="preserve"> PAGEREF _Toc233913392 \h </w:instrText>
+              <w:instrText xml:space="preserve"> PAGEREF _Toc234000071 \h </w:instrText>
             </w:r>
             <w:r>
               <w:rPr>
@@ -7512,7 +7512,7 @@
               <w14:ligatures w14:val="standardContextual"/>
             </w:rPr>
           </w:pPr>
-          <w:hyperlink w:anchor="_Toc233913393" w:history="1">
+          <w:hyperlink w:anchor="_Toc234000072" w:history="1">
             <w:r>
               <w:rPr>
                 <w:rStyle w:val="Hyperlink"/>
@@ -7560,7 +7560,7 @@
                 <w:noProof/>
                 <w:webHidden/>
               </w:rPr>
-              <w:instrText xml:space="preserve"> PAGEREF _Toc233913393 \h </w:instrText>
+              <w:instrText xml:space="preserve"> PAGEREF _Toc234000072 \h </w:instrText>
             </w:r>
             <w:r>
               <w:rPr>
@@ -7608,7 +7608,7 @@
               <w14:ligatures w14:val="standardContextual"/>
             </w:rPr>
           </w:pPr>
-          <w:hyperlink w:anchor="_Toc233913394" w:history="1">
+          <w:hyperlink w:anchor="_Toc234000073" w:history="1">
             <w:r>
               <w:rPr>
                 <w:rStyle w:val="Hyperlink"/>
@@ -7656,7 +7656,7 @@
                 <w:noProof/>
                 <w:webHidden/>
               </w:rPr>
-              <w:instrText xml:space="preserve"> PAGEREF _Toc233913394 \h </w:instrText>
+              <w:instrText xml:space="preserve"> PAGEREF _Toc234000073 \h </w:instrText>
             </w:r>
             <w:r>
               <w:rPr>
@@ -7704,7 +7704,7 @@
               <w14:ligatures w14:val="standardContextual"/>
             </w:rPr>
           </w:pPr>
-          <w:hyperlink w:anchor="_Toc233913395" w:history="1">
+          <w:hyperlink w:anchor="_Toc234000074" w:history="1">
             <w:r>
               <w:rPr>
                 <w:rStyle w:val="Hyperlink"/>
@@ -7752,7 +7752,7 @@
                 <w:noProof/>
                 <w:webHidden/>
               </w:rPr>
-              <w:instrText xml:space="preserve"> PAGEREF _Toc233913395 \h </w:instrText>
+              <w:instrText xml:space="preserve"> PAGEREF _Toc234000074 \h </w:instrText>
             </w:r>
             <w:r>
               <w:rPr>
@@ -7800,7 +7800,7 @@
               <w14:ligatures w14:val="standardContextual"/>
             </w:rPr>
           </w:pPr>
-          <w:hyperlink w:anchor="_Toc233913396" w:history="1">
+          <w:hyperlink w:anchor="_Toc234000075" w:history="1">
             <w:r>
               <w:rPr>
                 <w:rStyle w:val="Hyperlink"/>
@@ -7848,7 +7848,7 @@
                 <w:noProof/>
                 <w:webHidden/>
               </w:rPr>
-              <w:instrText xml:space="preserve"> PAGEREF _Toc233913396 \h </w:instrText>
+              <w:instrText xml:space="preserve"> PAGEREF _Toc234000075 \h </w:instrText>
             </w:r>
             <w:r>
               <w:rPr>
@@ -7896,7 +7896,7 @@
               <w14:ligatures w14:val="standardContextual"/>
             </w:rPr>
           </w:pPr>
-          <w:hyperlink w:anchor="_Toc233913397" w:history="1">
+          <w:hyperlink w:anchor="_Toc234000076" w:history="1">
             <w:r>
               <w:rPr>
                 <w:rStyle w:val="Hyperlink"/>
@@ -7944,7 +7944,7 @@
                 <w:noProof/>
                 <w:webHidden/>
               </w:rPr>
-              <w:instrText xml:space="preserve"> PAGEREF _Toc233913397 \h </w:instrText>
+              <w:instrText xml:space="preserve"> PAGEREF _Toc234000076 \h </w:instrText>
             </w:r>
             <w:r>
               <w:rPr>
@@ -7992,7 +7992,7 @@
               <w14:ligatures w14:val="standardContextual"/>
             </w:rPr>
           </w:pPr>
-          <w:hyperlink w:anchor="_Toc233913398" w:history="1">
+          <w:hyperlink w:anchor="_Toc234000077" w:history="1">
             <w:r>
               <w:rPr>
                 <w:rStyle w:val="Hyperlink"/>
@@ -8040,7 +8040,7 @@
                 <w:noProof/>
                 <w:webHidden/>
               </w:rPr>
-              <w:instrText xml:space="preserve"> PAGEREF _Toc233913398 \h </w:instrText>
+              <w:instrText xml:space="preserve"> PAGEREF _Toc234000077 \h </w:instrText>
             </w:r>
             <w:r>
               <w:rPr>
@@ -8088,7 +8088,7 @@
               <w14:ligatures w14:val="standardContextual"/>
             </w:rPr>
           </w:pPr>
-          <w:hyperlink w:anchor="_Toc233913399" w:history="1">
+          <w:hyperlink w:anchor="_Toc234000078" w:history="1">
             <w:r>
               <w:rPr>
                 <w:rStyle w:val="Hyperlink"/>
@@ -8136,7 +8136,7 @@
                 <w:noProof/>
                 <w:webHidden/>
               </w:rPr>
-              <w:instrText xml:space="preserve"> PAGEREF _Toc233913399 \h </w:instrText>
+              <w:instrText xml:space="preserve"> PAGEREF _Toc234000078 \h </w:instrText>
             </w:r>
             <w:r>
               <w:rPr>
@@ -8184,7 +8184,7 @@
               <w14:ligatures w14:val="standardContextual"/>
             </w:rPr>
           </w:pPr>
-          <w:hyperlink w:anchor="_Toc233913400" w:history="1">
+          <w:hyperlink w:anchor="_Toc234000079" w:history="1">
             <w:r>
               <w:rPr>
                 <w:rStyle w:val="Hyperlink"/>
@@ -8232,7 +8232,7 @@
                 <w:noProof/>
                 <w:webHidden/>
               </w:rPr>
-              <w:instrText xml:space="preserve"> PAGEREF _Toc233913400 \h </w:instrText>
+              <w:instrText xml:space="preserve"> PAGEREF _Toc234000079 \h </w:instrText>
             </w:r>
             <w:r>
               <w:rPr>
@@ -8280,7 +8280,7 @@
               <w14:ligatures w14:val="standardContextual"/>
             </w:rPr>
           </w:pPr>
-          <w:hyperlink w:anchor="_Toc233913401" w:history="1">
+          <w:hyperlink w:anchor="_Toc234000080" w:history="1">
             <w:r>
               <w:rPr>
                 <w:rStyle w:val="Hyperlink"/>
@@ -8328,7 +8328,7 @@
                 <w:noProof/>
                 <w:webHidden/>
               </w:rPr>
-              <w:instrText xml:space="preserve"> PAGEREF _Toc233913401 \h </w:instrText>
+              <w:instrText xml:space="preserve"> PAGEREF _Toc234000080 \h </w:instrText>
             </w:r>
             <w:r>
               <w:rPr>
@@ -8376,7 +8376,7 @@
               <w14:ligatures w14:val="standardContextual"/>
             </w:rPr>
           </w:pPr>
-          <w:hyperlink w:anchor="_Toc233913402" w:history="1">
+          <w:hyperlink w:anchor="_Toc234000081" w:history="1">
             <w:r>
               <w:rPr>
                 <w:rStyle w:val="Hyperlink"/>
@@ -8424,7 +8424,7 @@
                 <w:noProof/>
                 <w:webHidden/>
               </w:rPr>
-              <w:instrText xml:space="preserve"> PAGEREF _Toc233913402 \h </w:instrText>
+              <w:instrText xml:space="preserve"> PAGEREF _Toc234000081 \h </w:instrText>
             </w:r>
             <w:r>
               <w:rPr>
@@ -8472,7 +8472,7 @@
               <w14:ligatures w14:val="standardContextual"/>
             </w:rPr>
           </w:pPr>
-          <w:hyperlink w:anchor="_Toc233913403" w:history="1">
+          <w:hyperlink w:anchor="_Toc234000082" w:history="1">
             <w:r>
               <w:rPr>
                 <w:rStyle w:val="Hyperlink"/>
@@ -8520,7 +8520,7 @@
                 <w:noProof/>
                 <w:webHidden/>
               </w:rPr>
-              <w:instrText xml:space="preserve"> PAGEREF _Toc233913403 \h </w:instrText>
+              <w:instrText xml:space="preserve"> PAGEREF _Toc234000082 \h </w:instrText>
             </w:r>
             <w:r>
               <w:rPr>
@@ -8568,7 +8568,7 @@
               <w14:ligatures w14:val="standardContextual"/>
             </w:rPr>
           </w:pPr>
-          <w:hyperlink w:anchor="_Toc233913404" w:history="1">
+          <w:hyperlink w:anchor="_Toc234000083" w:history="1">
             <w:r>
               <w:rPr>
                 <w:rStyle w:val="Hyperlink"/>
@@ -8616,7 +8616,7 @@
                 <w:noProof/>
                 <w:webHidden/>
               </w:rPr>
-              <w:instrText xml:space="preserve"> PAGEREF _Toc233913404 \h </w:instrText>
+              <w:instrText xml:space="preserve"> PAGEREF _Toc234000083 \h </w:instrText>
             </w:r>
             <w:r>
               <w:rPr>
@@ -8664,7 +8664,7 @@
               <w14:ligatures w14:val="standardContextual"/>
             </w:rPr>
           </w:pPr>
-          <w:hyperlink w:anchor="_Toc233913405" w:history="1">
+          <w:hyperlink w:anchor="_Toc234000084" w:history="1">
             <w:r>
               <w:rPr>
                 <w:rStyle w:val="Hyperlink"/>
@@ -8712,7 +8712,7 @@
                 <w:noProof/>
                 <w:webHidden/>
               </w:rPr>
-              <w:instrText xml:space="preserve"> PAGEREF _Toc233913405 \h </w:instrText>
+              <w:instrText xml:space="preserve"> PAGEREF _Toc234000084 \h </w:instrText>
             </w:r>
             <w:r>
               <w:rPr>
@@ -8760,7 +8760,7 @@
               <w14:ligatures w14:val="standardContextual"/>
             </w:rPr>
           </w:pPr>
-          <w:hyperlink w:anchor="_Toc233913406" w:history="1">
+          <w:hyperlink w:anchor="_Toc234000085" w:history="1">
             <w:r>
               <w:rPr>
                 <w:rStyle w:val="Hyperlink"/>
@@ -8808,7 +8808,7 @@
                 <w:noProof/>
                 <w:webHidden/>
               </w:rPr>
-              <w:instrText xml:space="preserve"> PAGEREF _Toc233913406 \h </w:instrText>
+              <w:instrText xml:space="preserve"> PAGEREF _Toc234000085 \h </w:instrText>
             </w:r>
             <w:r>
               <w:rPr>
@@ -8856,7 +8856,7 @@
               <w14:ligatures w14:val="standardContextual"/>
             </w:rPr>
           </w:pPr>
-          <w:hyperlink w:anchor="_Toc233913407" w:history="1">
+          <w:hyperlink w:anchor="_Toc234000086" w:history="1">
             <w:r>
               <w:rPr>
                 <w:rStyle w:val="Hyperlink"/>
@@ -8904,7 +8904,7 @@
                 <w:noProof/>
                 <w:webHidden/>
               </w:rPr>
-              <w:instrText xml:space="preserve"> PAGEREF _Toc233913407 \h </w:instrText>
+              <w:instrText xml:space="preserve"> PAGEREF _Toc234000086 \h </w:instrText>
             </w:r>
             <w:r>
               <w:rPr>
@@ -8952,7 +8952,7 @@
               <w14:ligatures w14:val="standardContextual"/>
             </w:rPr>
           </w:pPr>
-          <w:hyperlink w:anchor="_Toc233913408" w:history="1">
+          <w:hyperlink w:anchor="_Toc234000087" w:history="1">
             <w:r>
               <w:rPr>
                 <w:rStyle w:val="Hyperlink"/>
@@ -9000,7 +9000,7 @@
                 <w:noProof/>
                 <w:webHidden/>
               </w:rPr>
-              <w:instrText xml:space="preserve"> PAGEREF _Toc233913408 \h </w:instrText>
+              <w:instrText xml:space="preserve"> PAGEREF _Toc234000087 \h </w:instrText>
             </w:r>
             <w:r>
               <w:rPr>
@@ -9048,7 +9048,7 @@
               <w14:ligatures w14:val="standardContextual"/>
             </w:rPr>
           </w:pPr>
-          <w:hyperlink w:anchor="_Toc233913409" w:history="1">
+          <w:hyperlink w:anchor="_Toc234000088" w:history="1">
             <w:r>
               <w:rPr>
                 <w:rStyle w:val="Hyperlink"/>
@@ -9096,7 +9096,7 @@
                 <w:noProof/>
                 <w:webHidden/>
               </w:rPr>
-              <w:instrText xml:space="preserve"> PAGEREF _Toc233913409 \h </w:instrText>
+              <w:instrText xml:space="preserve"> PAGEREF _Toc234000088 \h </w:instrText>
             </w:r>
             <w:r>
               <w:rPr>
@@ -9144,7 +9144,7 @@
               <w14:ligatures w14:val="standardContextual"/>
             </w:rPr>
           </w:pPr>
-          <w:hyperlink w:anchor="_Toc233913410" w:history="1">
+          <w:hyperlink w:anchor="_Toc234000089" w:history="1">
             <w:r>
               <w:rPr>
                 <w:rStyle w:val="Hyperlink"/>
@@ -9192,7 +9192,7 @@
                 <w:noProof/>
                 <w:webHidden/>
               </w:rPr>
-              <w:instrText xml:space="preserve"> PAGEREF _Toc233913410 \h </w:instrText>
+              <w:instrText xml:space="preserve"> PAGEREF _Toc234000089 \h </w:instrText>
             </w:r>
             <w:r>
               <w:rPr>
@@ -9240,7 +9240,7 @@
               <w14:ligatures w14:val="standardContextual"/>
             </w:rPr>
           </w:pPr>
-          <w:hyperlink w:anchor="_Toc233913411" w:history="1">
+          <w:hyperlink w:anchor="_Toc234000090" w:history="1">
             <w:r>
               <w:rPr>
                 <w:rStyle w:val="Hyperlink"/>
@@ -9288,7 +9288,7 @@
                 <w:noProof/>
                 <w:webHidden/>
               </w:rPr>
-              <w:instrText xml:space="preserve"> PAGEREF _Toc233913411 \h </w:instrText>
+              <w:instrText xml:space="preserve"> PAGEREF _Toc234000090 \h </w:instrText>
             </w:r>
             <w:r>
               <w:rPr>
@@ -9308,7 +9308,7 @@
                 <w:noProof/>
                 <w:webHidden/>
               </w:rPr>
-              <w:t>45</w:t>
+              <w:t>46</w:t>
             </w:r>
             <w:r>
               <w:rPr>
@@ -9336,7 +9336,7 @@
               <w14:ligatures w14:val="standardContextual"/>
             </w:rPr>
           </w:pPr>
-          <w:hyperlink w:anchor="_Toc233913412" w:history="1">
+          <w:hyperlink w:anchor="_Toc234000091" w:history="1">
             <w:r>
               <w:rPr>
                 <w:rStyle w:val="Hyperlink"/>
@@ -9384,7 +9384,7 @@
                 <w:noProof/>
                 <w:webHidden/>
               </w:rPr>
-              <w:instrText xml:space="preserve"> PAGEREF _Toc233913412 \h </w:instrText>
+              <w:instrText xml:space="preserve"> PAGEREF _Toc234000091 \h </w:instrText>
             </w:r>
             <w:r>
               <w:rPr>
@@ -9432,7 +9432,7 @@
               <w14:ligatures w14:val="standardContextual"/>
             </w:rPr>
           </w:pPr>
-          <w:hyperlink w:anchor="_Toc233913413" w:history="1">
+          <w:hyperlink w:anchor="_Toc234000092" w:history="1">
             <w:r>
               <w:rPr>
                 <w:rStyle w:val="Hyperlink"/>
@@ -9480,7 +9480,7 @@
                 <w:noProof/>
                 <w:webHidden/>
               </w:rPr>
-              <w:instrText xml:space="preserve"> PAGEREF _Toc233913413 \h </w:instrText>
+              <w:instrText xml:space="preserve"> PAGEREF _Toc234000092 \h </w:instrText>
             </w:r>
             <w:r>
               <w:rPr>
@@ -9528,7 +9528,7 @@
               <w14:ligatures w14:val="standardContextual"/>
             </w:rPr>
           </w:pPr>
-          <w:hyperlink w:anchor="_Toc233913414" w:history="1">
+          <w:hyperlink w:anchor="_Toc234000093" w:history="1">
             <w:r>
               <w:rPr>
                 <w:rStyle w:val="Hyperlink"/>
@@ -9555,23 +9555,7 @@
                 <w:noProof/>
                 <w:lang w:eastAsia="es-ES"/>
               </w:rPr>
-              <w:t>Hito: Infraestructura Docker y CI</w:t>
-            </w:r>
-            <w:r>
-              <w:rPr>
-                <w:rStyle w:val="Hyperlink"/>
-                <w:noProof/>
-                <w:lang w:eastAsia="es-ES"/>
-              </w:rPr>
-              <w:t>/</w:t>
-            </w:r>
-            <w:r>
-              <w:rPr>
-                <w:rStyle w:val="Hyperlink"/>
-                <w:noProof/>
-                <w:lang w:eastAsia="es-ES"/>
-              </w:rPr>
-              <w:t>CD</w:t>
+              <w:t>Hito: Infraestructura Docker y CI/CD</w:t>
             </w:r>
             <w:r>
               <w:rPr>
@@ -9592,7 +9576,7 @@
                 <w:noProof/>
                 <w:webHidden/>
               </w:rPr>
-              <w:instrText xml:space="preserve"> PAGEREF _Toc233913414 \h </w:instrText>
+              <w:instrText xml:space="preserve"> PAGEREF _Toc234000093 \h </w:instrText>
             </w:r>
             <w:r>
               <w:rPr>
@@ -9640,7 +9624,7 @@
               <w14:ligatures w14:val="standardContextual"/>
             </w:rPr>
           </w:pPr>
-          <w:hyperlink w:anchor="_Toc233913415" w:history="1">
+          <w:hyperlink w:anchor="_Toc234000094" w:history="1">
             <w:r>
               <w:rPr>
                 <w:rStyle w:val="Hyperlink"/>
@@ -9667,7 +9651,23 @@
                 <w:noProof/>
                 <w:lang w:eastAsia="es-ES"/>
               </w:rPr>
-              <w:t>Hito: Integración con Supabase</w:t>
+              <w:t>Hito: Integración con Sup</w:t>
+            </w:r>
+            <w:r>
+              <w:rPr>
+                <w:rStyle w:val="Hyperlink"/>
+                <w:noProof/>
+                <w:lang w:eastAsia="es-ES"/>
+              </w:rPr>
+              <w:t>a</w:t>
+            </w:r>
+            <w:r>
+              <w:rPr>
+                <w:rStyle w:val="Hyperlink"/>
+                <w:noProof/>
+                <w:lang w:eastAsia="es-ES"/>
+              </w:rPr>
+              <w:t>base</w:t>
             </w:r>
             <w:r>
               <w:rPr>
@@ -9688,7 +9688,7 @@
                 <w:noProof/>
                 <w:webHidden/>
               </w:rPr>
-              <w:instrText xml:space="preserve"> PAGEREF _Toc233913415 \h </w:instrText>
+              <w:instrText xml:space="preserve"> PAGEREF _Toc234000094 \h </w:instrText>
             </w:r>
             <w:r>
               <w:rPr>
@@ -9736,7 +9736,7 @@
               <w14:ligatures w14:val="standardContextual"/>
             </w:rPr>
           </w:pPr>
-          <w:hyperlink w:anchor="_Toc233913416" w:history="1">
+          <w:hyperlink w:anchor="_Toc234000095" w:history="1">
             <w:r>
               <w:rPr>
                 <w:rStyle w:val="Hyperlink"/>
@@ -9784,7 +9784,7 @@
                 <w:noProof/>
                 <w:webHidden/>
               </w:rPr>
-              <w:instrText xml:space="preserve"> PAGEREF _Toc233913416 \h </w:instrText>
+              <w:instrText xml:space="preserve"> PAGEREF _Toc234000095 \h </w:instrText>
             </w:r>
             <w:r>
               <w:rPr>
@@ -9804,7 +9804,7 @@
                 <w:noProof/>
                 <w:webHidden/>
               </w:rPr>
-              <w:t>54</w:t>
+              <w:t>56</w:t>
             </w:r>
             <w:r>
               <w:rPr>
@@ -9832,7 +9832,7 @@
               <w14:ligatures w14:val="standardContextual"/>
             </w:rPr>
           </w:pPr>
-          <w:hyperlink w:anchor="_Toc233913417" w:history="1">
+          <w:hyperlink w:anchor="_Toc234000096" w:history="1">
             <w:r>
               <w:rPr>
                 <w:rStyle w:val="Hyperlink"/>
@@ -9880,7 +9880,7 @@
                 <w:noProof/>
                 <w:webHidden/>
               </w:rPr>
-              <w:instrText xml:space="preserve"> PAGEREF _Toc233913417 \h </w:instrText>
+              <w:instrText xml:space="preserve"> PAGEREF _Toc234000096 \h </w:instrText>
             </w:r>
             <w:r>
               <w:rPr>
@@ -9900,7 +9900,7 @@
                 <w:noProof/>
                 <w:webHidden/>
               </w:rPr>
-              <w:t>54</w:t>
+              <w:t>56</w:t>
             </w:r>
             <w:r>
               <w:rPr>
@@ -9928,7 +9928,7 @@
               <w14:ligatures w14:val="standardContextual"/>
             </w:rPr>
           </w:pPr>
-          <w:hyperlink w:anchor="_Toc233913418" w:history="1">
+          <w:hyperlink w:anchor="_Toc234000097" w:history="1">
             <w:r>
               <w:rPr>
                 <w:rStyle w:val="Hyperlink"/>
@@ -9976,7 +9976,7 @@
                 <w:noProof/>
                 <w:webHidden/>
               </w:rPr>
-              <w:instrText xml:space="preserve"> PAGEREF _Toc233913418 \h </w:instrText>
+              <w:instrText xml:space="preserve"> PAGEREF _Toc234000097 \h </w:instrText>
             </w:r>
             <w:r>
               <w:rPr>
@@ -9996,7 +9996,7 @@
                 <w:noProof/>
                 <w:webHidden/>
               </w:rPr>
-              <w:t>54</w:t>
+              <w:t>56</w:t>
             </w:r>
             <w:r>
               <w:rPr>
@@ -10024,7 +10024,7 @@
               <w14:ligatures w14:val="standardContextual"/>
             </w:rPr>
           </w:pPr>
-          <w:hyperlink w:anchor="_Toc233913419" w:history="1">
+          <w:hyperlink w:anchor="_Toc234000098" w:history="1">
             <w:r>
               <w:rPr>
                 <w:rStyle w:val="Hyperlink"/>
@@ -10072,7 +10072,7 @@
                 <w:noProof/>
                 <w:webHidden/>
               </w:rPr>
-              <w:instrText xml:space="preserve"> PAGEREF _Toc233913419 \h </w:instrText>
+              <w:instrText xml:space="preserve"> PAGEREF _Toc234000098 \h </w:instrText>
             </w:r>
             <w:r>
               <w:rPr>
@@ -10092,7 +10092,7 @@
                 <w:noProof/>
                 <w:webHidden/>
               </w:rPr>
-              <w:t>54</w:t>
+              <w:t>57</w:t>
             </w:r>
             <w:r>
               <w:rPr>
@@ -10120,7 +10120,7 @@
               <w14:ligatures w14:val="standardContextual"/>
             </w:rPr>
           </w:pPr>
-          <w:hyperlink w:anchor="_Toc233913420" w:history="1">
+          <w:hyperlink w:anchor="_Toc234000099" w:history="1">
             <w:r>
               <w:rPr>
                 <w:rStyle w:val="Hyperlink"/>
@@ -10168,7 +10168,7 @@
                 <w:noProof/>
                 <w:webHidden/>
               </w:rPr>
-              <w:instrText xml:space="preserve"> PAGEREF _Toc233913420 \h </w:instrText>
+              <w:instrText xml:space="preserve"> PAGEREF _Toc234000099 \h </w:instrText>
             </w:r>
             <w:r>
               <w:rPr>
@@ -10188,7 +10188,7 @@
                 <w:noProof/>
                 <w:webHidden/>
               </w:rPr>
-              <w:t>54</w:t>
+              <w:t>57</w:t>
             </w:r>
             <w:r>
               <w:rPr>
@@ -10216,7 +10216,7 @@
               <w14:ligatures w14:val="standardContextual"/>
             </w:rPr>
           </w:pPr>
-          <w:hyperlink w:anchor="_Toc233913421" w:history="1">
+          <w:hyperlink w:anchor="_Toc234000100" w:history="1">
             <w:r>
               <w:rPr>
                 <w:rStyle w:val="Hyperlink"/>
@@ -10264,7 +10264,7 @@
                 <w:noProof/>
                 <w:webHidden/>
               </w:rPr>
-              <w:instrText xml:space="preserve"> PAGEREF _Toc233913421 \h </w:instrText>
+              <w:instrText xml:space="preserve"> PAGEREF _Toc234000100 \h </w:instrText>
             </w:r>
             <w:r>
               <w:rPr>
@@ -10284,7 +10284,7 @@
                 <w:noProof/>
                 <w:webHidden/>
               </w:rPr>
-              <w:t>54</w:t>
+              <w:t>57</w:t>
             </w:r>
             <w:r>
               <w:rPr>
@@ -10312,7 +10312,7 @@
               <w14:ligatures w14:val="standardContextual"/>
             </w:rPr>
           </w:pPr>
-          <w:hyperlink w:anchor="_Toc233913422" w:history="1">
+          <w:hyperlink w:anchor="_Toc234000101" w:history="1">
             <w:r>
               <w:rPr>
                 <w:rStyle w:val="Hyperlink"/>
@@ -10360,7 +10360,7 @@
                 <w:noProof/>
                 <w:webHidden/>
               </w:rPr>
-              <w:instrText xml:space="preserve"> PAGEREF _Toc233913422 \h </w:instrText>
+              <w:instrText xml:space="preserve"> PAGEREF _Toc234000101 \h </w:instrText>
             </w:r>
             <w:r>
               <w:rPr>
@@ -10380,7 +10380,7 @@
                 <w:noProof/>
                 <w:webHidden/>
               </w:rPr>
-              <w:t>54</w:t>
+              <w:t>57</w:t>
             </w:r>
             <w:r>
               <w:rPr>
@@ -10408,7 +10408,7 @@
               <w14:ligatures w14:val="standardContextual"/>
             </w:rPr>
           </w:pPr>
-          <w:hyperlink w:anchor="_Toc233913423" w:history="1">
+          <w:hyperlink w:anchor="_Toc234000102" w:history="1">
             <w:r>
               <w:rPr>
                 <w:rStyle w:val="Hyperlink"/>
@@ -10456,7 +10456,7 @@
                 <w:noProof/>
                 <w:webHidden/>
               </w:rPr>
-              <w:instrText xml:space="preserve"> PAGEREF _Toc233913423 \h </w:instrText>
+              <w:instrText xml:space="preserve"> PAGEREF _Toc234000102 \h </w:instrText>
             </w:r>
             <w:r>
               <w:rPr>
@@ -10476,7 +10476,7 @@
                 <w:noProof/>
                 <w:webHidden/>
               </w:rPr>
-              <w:t>54</w:t>
+              <w:t>57</w:t>
             </w:r>
             <w:r>
               <w:rPr>
@@ -10504,7 +10504,7 @@
               <w14:ligatures w14:val="standardContextual"/>
             </w:rPr>
           </w:pPr>
-          <w:hyperlink w:anchor="_Toc233913424" w:history="1">
+          <w:hyperlink w:anchor="_Toc234000103" w:history="1">
             <w:r>
               <w:rPr>
                 <w:rStyle w:val="Hyperlink"/>
@@ -10552,7 +10552,7 @@
                 <w:noProof/>
                 <w:webHidden/>
               </w:rPr>
-              <w:instrText xml:space="preserve"> PAGEREF _Toc233913424 \h </w:instrText>
+              <w:instrText xml:space="preserve"> PAGEREF _Toc234000103 \h </w:instrText>
             </w:r>
             <w:r>
               <w:rPr>
@@ -10572,7 +10572,7 @@
                 <w:noProof/>
                 <w:webHidden/>
               </w:rPr>
-              <w:t>54</w:t>
+              <w:t>57</w:t>
             </w:r>
             <w:r>
               <w:rPr>
@@ -10599,7 +10599,7 @@
               <w14:ligatures w14:val="standardContextual"/>
             </w:rPr>
           </w:pPr>
-          <w:hyperlink w:anchor="_Toc233913425" w:history="1">
+          <w:hyperlink w:anchor="_Toc234000104" w:history="1">
             <w:r>
               <w:rPr>
                 <w:rStyle w:val="Hyperlink"/>
@@ -10626,7 +10626,7 @@
                 <w:noProof/>
                 <w:webHidden/>
               </w:rPr>
-              <w:instrText xml:space="preserve"> PAGEREF _Toc233913425 \h </w:instrText>
+              <w:instrText xml:space="preserve"> PAGEREF _Toc234000104 \h </w:instrText>
             </w:r>
             <w:r>
               <w:rPr>
@@ -10646,7 +10646,7 @@
                 <w:noProof/>
                 <w:webHidden/>
               </w:rPr>
-              <w:t>54</w:t>
+              <w:t>57</w:t>
             </w:r>
             <w:r>
               <w:rPr>
@@ -10693,7 +10693,7 @@
       <w:pPr>
         <w:pStyle w:val="Heading1"/>
       </w:pPr>
-      <w:bookmarkStart w:id="1" w:name="_Toc233913356"/>
+      <w:bookmarkStart w:id="1" w:name="_Toc234000035"/>
       <w:r>
         <w:lastRenderedPageBreak/>
         <w:t>Índice de Tablas</w:t>
@@ -10738,7 +10738,7 @@
       <w:pPr>
         <w:pStyle w:val="Heading1"/>
       </w:pPr>
-      <w:bookmarkStart w:id="2" w:name="_Toc233913357"/>
+      <w:bookmarkStart w:id="2" w:name="_Toc234000036"/>
       <w:r>
         <w:lastRenderedPageBreak/>
         <w:t>Índice de Figuras</w:t>
@@ -10770,7 +10770,7 @@
       <w:pPr>
         <w:pStyle w:val="Heading1"/>
       </w:pPr>
-      <w:bookmarkStart w:id="3" w:name="_Toc233913358"/>
+      <w:bookmarkStart w:id="3" w:name="_Toc234000037"/>
       <w:r>
         <w:lastRenderedPageBreak/>
         <w:t>Objetivo</w:t>
@@ -10799,7 +10799,7 @@
       <w:pPr>
         <w:pStyle w:val="Heading1"/>
       </w:pPr>
-      <w:bookmarkStart w:id="4" w:name="_Toc233913359"/>
+      <w:bookmarkStart w:id="4" w:name="_Toc234000038"/>
       <w:r>
         <w:lastRenderedPageBreak/>
         <w:t>Resumen</w:t>
@@ -10832,7 +10832,7 @@
           <w:lang w:val="en-GB"/>
         </w:rPr>
       </w:pPr>
-      <w:bookmarkStart w:id="5" w:name="_Toc233913360"/>
+      <w:bookmarkStart w:id="5" w:name="_Toc234000039"/>
       <w:commentRangeStart w:id="6"/>
       <w:r>
         <w:rPr>
@@ -10896,7 +10896,7 @@
           <w:lang w:eastAsia="es-ES"/>
         </w:rPr>
       </w:pPr>
-      <w:bookmarkStart w:id="7" w:name="_Toc233913361"/>
+      <w:bookmarkStart w:id="7" w:name="_Toc234000040"/>
       <w:r>
         <w:rPr>
           <w:lang w:eastAsia="es-ES"/>
@@ -10917,7 +10917,7 @@
           <w:lang w:eastAsia="es-ES"/>
         </w:rPr>
       </w:pPr>
-      <w:bookmarkStart w:id="8" w:name="_Toc233913362"/>
+      <w:bookmarkStart w:id="8" w:name="_Toc234000041"/>
       <w:r>
         <w:rPr>
           <w:lang w:eastAsia="es-ES"/>
@@ -10963,7 +10963,7 @@
           <w:lang w:eastAsia="es-ES"/>
         </w:rPr>
       </w:pPr>
-      <w:bookmarkStart w:id="9" w:name="_Toc233913363"/>
+      <w:bookmarkStart w:id="9" w:name="_Toc234000042"/>
       <w:r>
         <w:rPr>
           <w:lang w:eastAsia="es-ES"/>
@@ -11022,7 +11022,7 @@
           <w:lang w:eastAsia="es-ES"/>
         </w:rPr>
       </w:pPr>
-      <w:bookmarkStart w:id="10" w:name="_Toc233913364"/>
+      <w:bookmarkStart w:id="10" w:name="_Toc234000043"/>
       <w:r>
         <w:rPr>
           <w:lang w:eastAsia="es-ES"/>
@@ -11055,7 +11055,7 @@
           <w:lang w:eastAsia="es-ES"/>
         </w:rPr>
       </w:pPr>
-      <w:bookmarkStart w:id="11" w:name="_Toc233913365"/>
+      <w:bookmarkStart w:id="11" w:name="_Toc234000044"/>
       <w:r>
         <w:rPr>
           <w:lang w:eastAsia="es-ES"/>
@@ -11121,7 +11121,7 @@
           <w:lang w:eastAsia="es-ES"/>
         </w:rPr>
       </w:pPr>
-      <w:bookmarkStart w:id="12" w:name="_Toc233913366"/>
+      <w:bookmarkStart w:id="12" w:name="_Toc234000045"/>
       <w:r>
         <w:rPr>
           <w:lang w:eastAsia="es-ES"/>
@@ -11147,7 +11147,7 @@
           <w:lang w:eastAsia="es-ES"/>
         </w:rPr>
       </w:pPr>
-      <w:bookmarkStart w:id="13" w:name="_Toc233913367"/>
+      <w:bookmarkStart w:id="13" w:name="_Toc234000046"/>
       <w:r>
         <w:rPr>
           <w:lang w:eastAsia="es-ES"/>
@@ -11167,7 +11167,7 @@
           <w:lang w:eastAsia="es-ES"/>
         </w:rPr>
       </w:pPr>
-      <w:bookmarkStart w:id="14" w:name="_Toc233913368"/>
+      <w:bookmarkStart w:id="14" w:name="_Toc234000047"/>
       <w:r>
         <w:rPr>
           <w:lang w:eastAsia="es-ES"/>
@@ -11875,7 +11875,7 @@
           <w:lang w:eastAsia="es-ES"/>
         </w:rPr>
       </w:pPr>
-      <w:bookmarkStart w:id="15" w:name="_Toc233913369"/>
+      <w:bookmarkStart w:id="15" w:name="_Toc234000048"/>
       <w:r>
         <w:rPr>
           <w:lang w:eastAsia="es-ES"/>
@@ -11941,7 +11941,7 @@
           <w:lang w:eastAsia="es-ES"/>
         </w:rPr>
       </w:pPr>
-      <w:bookmarkStart w:id="16" w:name="_Toc233913370"/>
+      <w:bookmarkStart w:id="16" w:name="_Toc234000049"/>
       <w:r>
         <w:rPr>
           <w:lang w:eastAsia="es-ES"/>
@@ -12085,7 +12085,7 @@
           <w:lang w:eastAsia="es-ES"/>
         </w:rPr>
       </w:pPr>
-      <w:bookmarkStart w:id="17" w:name="_Toc233913371"/>
+      <w:bookmarkStart w:id="17" w:name="_Toc234000050"/>
       <w:r>
         <w:rPr>
           <w:lang w:eastAsia="es-ES"/>
@@ -12259,7 +12259,7 @@
           <w:lang w:eastAsia="es-ES"/>
         </w:rPr>
       </w:pPr>
-      <w:bookmarkStart w:id="18" w:name="_Toc233913372"/>
+      <w:bookmarkStart w:id="18" w:name="_Toc234000051"/>
       <w:r>
         <w:rPr>
           <w:lang w:eastAsia="es-ES"/>
@@ -12358,7 +12358,7 @@
           <w:lang w:eastAsia="es-ES"/>
         </w:rPr>
       </w:pPr>
-      <w:bookmarkStart w:id="19" w:name="_Toc233913373"/>
+      <w:bookmarkStart w:id="19" w:name="_Toc234000052"/>
       <w:r>
         <w:rPr>
           <w:lang w:eastAsia="es-ES"/>
@@ -12378,7 +12378,7 @@
           <w:lang w:eastAsia="es-ES"/>
         </w:rPr>
       </w:pPr>
-      <w:bookmarkStart w:id="20" w:name="_Toc233913374"/>
+      <w:bookmarkStart w:id="20" w:name="_Toc234000053"/>
       <w:r>
         <w:rPr>
           <w:lang w:eastAsia="es-ES"/>
@@ -12487,7 +12487,7 @@
           <w:lang w:eastAsia="es-ES"/>
         </w:rPr>
       </w:pPr>
-      <w:bookmarkStart w:id="21" w:name="_Toc233913375"/>
+      <w:bookmarkStart w:id="21" w:name="_Toc234000054"/>
       <w:r>
         <w:rPr>
           <w:lang w:eastAsia="es-ES"/>
@@ -12601,7 +12601,7 @@
           <w:lang w:eastAsia="es-ES"/>
         </w:rPr>
       </w:pPr>
-      <w:bookmarkStart w:id="22" w:name="_Toc233913376"/>
+      <w:bookmarkStart w:id="22" w:name="_Toc234000055"/>
       <w:r>
         <w:rPr>
           <w:lang w:eastAsia="es-ES"/>
@@ -12692,7 +12692,7 @@
           <w:lang w:eastAsia="es-ES"/>
         </w:rPr>
       </w:pPr>
-      <w:bookmarkStart w:id="23" w:name="_Toc233913377"/>
+      <w:bookmarkStart w:id="23" w:name="_Toc234000056"/>
       <w:r>
         <w:rPr>
           <w:lang w:eastAsia="es-ES"/>
@@ -12712,7 +12712,7 @@
           <w:lang w:eastAsia="es-ES"/>
         </w:rPr>
       </w:pPr>
-      <w:bookmarkStart w:id="24" w:name="_Toc233913378"/>
+      <w:bookmarkStart w:id="24" w:name="_Toc234000057"/>
       <w:r>
         <w:rPr>
           <w:lang w:eastAsia="es-ES"/>
@@ -12771,7 +12771,7 @@
           <w:lang w:eastAsia="es-ES"/>
         </w:rPr>
       </w:pPr>
-      <w:bookmarkStart w:id="25" w:name="_Toc233913379"/>
+      <w:bookmarkStart w:id="25" w:name="_Toc234000058"/>
       <w:r>
         <w:rPr>
           <w:lang w:eastAsia="es-ES"/>
@@ -12866,7 +12866,7 @@
           <w:lang w:eastAsia="es-ES"/>
         </w:rPr>
       </w:pPr>
-      <w:bookmarkStart w:id="26" w:name="_Toc233913380"/>
+      <w:bookmarkStart w:id="26" w:name="_Toc234000059"/>
       <w:r>
         <w:rPr>
           <w:lang w:eastAsia="es-ES"/>
@@ -12926,7 +12926,7 @@
           <w:lang w:eastAsia="es-ES"/>
         </w:rPr>
       </w:pPr>
-      <w:bookmarkStart w:id="27" w:name="_Toc233913381"/>
+      <w:bookmarkStart w:id="27" w:name="_Toc234000060"/>
       <w:r>
         <w:rPr>
           <w:lang w:eastAsia="es-ES"/>
@@ -12998,6 +12998,7 @@
       <w:bookmarkStart w:id="54" w:name="_Toc233829512"/>
       <w:bookmarkStart w:id="55" w:name="_Toc233912638"/>
       <w:bookmarkStart w:id="56" w:name="_Toc233913382"/>
+      <w:bookmarkStart w:id="57" w:name="_Toc234000061"/>
       <w:bookmarkEnd w:id="28"/>
       <w:bookmarkEnd w:id="29"/>
       <w:bookmarkEnd w:id="30"/>
@@ -13027,6 +13028,7 @@
       <w:bookmarkEnd w:id="54"/>
       <w:bookmarkEnd w:id="55"/>
       <w:bookmarkEnd w:id="56"/>
+      <w:bookmarkEnd w:id="57"/>
     </w:p>
     <w:p>
       <w:pPr>
@@ -13049,36 +13051,36 @@
           <w:lang w:eastAsia="es-ES"/>
         </w:rPr>
       </w:pPr>
-      <w:bookmarkStart w:id="57" w:name="_Toc168583626"/>
-      <w:bookmarkStart w:id="58" w:name="_Toc168583822"/>
-      <w:bookmarkStart w:id="59" w:name="_Toc168583867"/>
-      <w:bookmarkStart w:id="60" w:name="_Toc168597654"/>
-      <w:bookmarkStart w:id="61" w:name="_Toc168597722"/>
-      <w:bookmarkStart w:id="62" w:name="_Toc168597810"/>
-      <w:bookmarkStart w:id="63" w:name="_Toc176021963"/>
-      <w:bookmarkStart w:id="64" w:name="_Toc176033755"/>
-      <w:bookmarkStart w:id="65" w:name="_Toc176545421"/>
-      <w:bookmarkStart w:id="66" w:name="_Toc176545539"/>
-      <w:bookmarkStart w:id="67" w:name="_Toc178184323"/>
-      <w:bookmarkStart w:id="68" w:name="_Toc180936426"/>
-      <w:bookmarkStart w:id="69" w:name="_Toc199320920"/>
-      <w:bookmarkStart w:id="70" w:name="_Toc199321318"/>
-      <w:bookmarkStart w:id="71" w:name="_Toc199321530"/>
-      <w:bookmarkStart w:id="72" w:name="_Toc199321567"/>
-      <w:bookmarkStart w:id="73" w:name="_Toc231644272"/>
-      <w:bookmarkStart w:id="74" w:name="_Toc232007442"/>
-      <w:bookmarkStart w:id="75" w:name="_Toc232350275"/>
-      <w:bookmarkStart w:id="76" w:name="_Toc232602968"/>
-      <w:bookmarkStart w:id="77" w:name="_Toc232627091"/>
-      <w:bookmarkStart w:id="78" w:name="_Toc232779470"/>
-      <w:bookmarkStart w:id="79" w:name="_Toc232954401"/>
-      <w:bookmarkStart w:id="80" w:name="_Toc233636847"/>
-      <w:bookmarkStart w:id="81" w:name="_Toc233823355"/>
-      <w:bookmarkStart w:id="82" w:name="_Toc233823425"/>
-      <w:bookmarkStart w:id="83" w:name="_Toc233829513"/>
-      <w:bookmarkStart w:id="84" w:name="_Toc233912639"/>
-      <w:bookmarkStart w:id="85" w:name="_Toc233913383"/>
-      <w:bookmarkEnd w:id="57"/>
+      <w:bookmarkStart w:id="58" w:name="_Toc168583626"/>
+      <w:bookmarkStart w:id="59" w:name="_Toc168583822"/>
+      <w:bookmarkStart w:id="60" w:name="_Toc168583867"/>
+      <w:bookmarkStart w:id="61" w:name="_Toc168597654"/>
+      <w:bookmarkStart w:id="62" w:name="_Toc168597722"/>
+      <w:bookmarkStart w:id="63" w:name="_Toc168597810"/>
+      <w:bookmarkStart w:id="64" w:name="_Toc176021963"/>
+      <w:bookmarkStart w:id="65" w:name="_Toc176033755"/>
+      <w:bookmarkStart w:id="66" w:name="_Toc176545421"/>
+      <w:bookmarkStart w:id="67" w:name="_Toc176545539"/>
+      <w:bookmarkStart w:id="68" w:name="_Toc178184323"/>
+      <w:bookmarkStart w:id="69" w:name="_Toc180936426"/>
+      <w:bookmarkStart w:id="70" w:name="_Toc199320920"/>
+      <w:bookmarkStart w:id="71" w:name="_Toc199321318"/>
+      <w:bookmarkStart w:id="72" w:name="_Toc199321530"/>
+      <w:bookmarkStart w:id="73" w:name="_Toc199321567"/>
+      <w:bookmarkStart w:id="74" w:name="_Toc231644272"/>
+      <w:bookmarkStart w:id="75" w:name="_Toc232007442"/>
+      <w:bookmarkStart w:id="76" w:name="_Toc232350275"/>
+      <w:bookmarkStart w:id="77" w:name="_Toc232602968"/>
+      <w:bookmarkStart w:id="78" w:name="_Toc232627091"/>
+      <w:bookmarkStart w:id="79" w:name="_Toc232779470"/>
+      <w:bookmarkStart w:id="80" w:name="_Toc232954401"/>
+      <w:bookmarkStart w:id="81" w:name="_Toc233636847"/>
+      <w:bookmarkStart w:id="82" w:name="_Toc233823355"/>
+      <w:bookmarkStart w:id="83" w:name="_Toc233823425"/>
+      <w:bookmarkStart w:id="84" w:name="_Toc233829513"/>
+      <w:bookmarkStart w:id="85" w:name="_Toc233912639"/>
+      <w:bookmarkStart w:id="86" w:name="_Toc233913383"/>
+      <w:bookmarkStart w:id="87" w:name="_Toc234000062"/>
       <w:bookmarkEnd w:id="58"/>
       <w:bookmarkEnd w:id="59"/>
       <w:bookmarkEnd w:id="60"/>
@@ -13107,6 +13109,8 @@
       <w:bookmarkEnd w:id="83"/>
       <w:bookmarkEnd w:id="84"/>
       <w:bookmarkEnd w:id="85"/>
+      <w:bookmarkEnd w:id="86"/>
+      <w:bookmarkEnd w:id="87"/>
     </w:p>
     <w:p>
       <w:pPr>
@@ -13129,37 +13133,36 @@
           <w:lang w:eastAsia="es-ES"/>
         </w:rPr>
       </w:pPr>
-      <w:bookmarkStart w:id="86" w:name="_Toc168583627"/>
-      <w:bookmarkStart w:id="87" w:name="_Toc168583823"/>
-      <w:bookmarkStart w:id="88" w:name="_Toc168583868"/>
-      <w:bookmarkStart w:id="89" w:name="_Toc168597655"/>
-      <w:bookmarkStart w:id="90" w:name="_Toc168597723"/>
-      <w:bookmarkStart w:id="91" w:name="_Toc168597811"/>
-      <w:bookmarkStart w:id="92" w:name="_Toc176021964"/>
-      <w:bookmarkStart w:id="93" w:name="_Toc176033756"/>
-      <w:bookmarkStart w:id="94" w:name="_Toc176545422"/>
-      <w:bookmarkStart w:id="95" w:name="_Toc176545540"/>
-      <w:bookmarkStart w:id="96" w:name="_Toc178184324"/>
-      <w:bookmarkStart w:id="97" w:name="_Toc180936427"/>
-      <w:bookmarkStart w:id="98" w:name="_Toc199320921"/>
-      <w:bookmarkStart w:id="99" w:name="_Toc199321319"/>
-      <w:bookmarkStart w:id="100" w:name="_Toc199321531"/>
-      <w:bookmarkStart w:id="101" w:name="_Toc199321568"/>
-      <w:bookmarkStart w:id="102" w:name="_Toc231644273"/>
-      <w:bookmarkStart w:id="103" w:name="_Toc232007443"/>
-      <w:bookmarkStart w:id="104" w:name="_Toc232350276"/>
-      <w:bookmarkStart w:id="105" w:name="_Toc232602969"/>
-      <w:bookmarkStart w:id="106" w:name="_Toc232627092"/>
-      <w:bookmarkStart w:id="107" w:name="_Toc232779471"/>
-      <w:bookmarkStart w:id="108" w:name="_Toc232954402"/>
-      <w:bookmarkStart w:id="109" w:name="_Toc233636848"/>
-      <w:bookmarkStart w:id="110" w:name="_Toc233823356"/>
-      <w:bookmarkStart w:id="111" w:name="_Toc233823426"/>
-      <w:bookmarkStart w:id="112" w:name="_Toc233829514"/>
-      <w:bookmarkStart w:id="113" w:name="_Toc233912640"/>
-      <w:bookmarkStart w:id="114" w:name="_Toc233913384"/>
-      <w:bookmarkEnd w:id="86"/>
-      <w:bookmarkEnd w:id="87"/>
+      <w:bookmarkStart w:id="88" w:name="_Toc168583627"/>
+      <w:bookmarkStart w:id="89" w:name="_Toc168583823"/>
+      <w:bookmarkStart w:id="90" w:name="_Toc168583868"/>
+      <w:bookmarkStart w:id="91" w:name="_Toc168597655"/>
+      <w:bookmarkStart w:id="92" w:name="_Toc168597723"/>
+      <w:bookmarkStart w:id="93" w:name="_Toc168597811"/>
+      <w:bookmarkStart w:id="94" w:name="_Toc176021964"/>
+      <w:bookmarkStart w:id="95" w:name="_Toc176033756"/>
+      <w:bookmarkStart w:id="96" w:name="_Toc176545422"/>
+      <w:bookmarkStart w:id="97" w:name="_Toc176545540"/>
+      <w:bookmarkStart w:id="98" w:name="_Toc178184324"/>
+      <w:bookmarkStart w:id="99" w:name="_Toc180936427"/>
+      <w:bookmarkStart w:id="100" w:name="_Toc199320921"/>
+      <w:bookmarkStart w:id="101" w:name="_Toc199321319"/>
+      <w:bookmarkStart w:id="102" w:name="_Toc199321531"/>
+      <w:bookmarkStart w:id="103" w:name="_Toc199321568"/>
+      <w:bookmarkStart w:id="104" w:name="_Toc231644273"/>
+      <w:bookmarkStart w:id="105" w:name="_Toc232007443"/>
+      <w:bookmarkStart w:id="106" w:name="_Toc232350276"/>
+      <w:bookmarkStart w:id="107" w:name="_Toc232602969"/>
+      <w:bookmarkStart w:id="108" w:name="_Toc232627092"/>
+      <w:bookmarkStart w:id="109" w:name="_Toc232779471"/>
+      <w:bookmarkStart w:id="110" w:name="_Toc232954402"/>
+      <w:bookmarkStart w:id="111" w:name="_Toc233636848"/>
+      <w:bookmarkStart w:id="112" w:name="_Toc233823356"/>
+      <w:bookmarkStart w:id="113" w:name="_Toc233823426"/>
+      <w:bookmarkStart w:id="114" w:name="_Toc233829514"/>
+      <w:bookmarkStart w:id="115" w:name="_Toc233912640"/>
+      <w:bookmarkStart w:id="116" w:name="_Toc233913384"/>
+      <w:bookmarkStart w:id="117" w:name="_Toc234000063"/>
       <w:bookmarkEnd w:id="88"/>
       <w:bookmarkEnd w:id="89"/>
       <w:bookmarkEnd w:id="90"/>
@@ -13187,6 +13190,9 @@
       <w:bookmarkEnd w:id="112"/>
       <w:bookmarkEnd w:id="113"/>
       <w:bookmarkEnd w:id="114"/>
+      <w:bookmarkEnd w:id="115"/>
+      <w:bookmarkEnd w:id="116"/>
+      <w:bookmarkEnd w:id="117"/>
     </w:p>
     <w:p>
       <w:pPr>
@@ -13199,14 +13205,14 @@
           <w:lang w:eastAsia="es-ES"/>
         </w:rPr>
       </w:pPr>
-      <w:bookmarkStart w:id="115" w:name="_Toc233913385"/>
+      <w:bookmarkStart w:id="118" w:name="_Toc234000064"/>
       <w:r>
         <w:rPr>
           <w:lang w:eastAsia="es-ES"/>
         </w:rPr>
         <w:t>Especificaciones del sistema</w:t>
       </w:r>
-      <w:bookmarkEnd w:id="115"/>
+      <w:bookmarkEnd w:id="118"/>
     </w:p>
     <w:p>
       <w:pPr>
@@ -13219,14 +13225,14 @@
           <w:lang w:eastAsia="es-ES"/>
         </w:rPr>
       </w:pPr>
-      <w:bookmarkStart w:id="116" w:name="_Toc233913386"/>
+      <w:bookmarkStart w:id="119" w:name="_Toc234000065"/>
       <w:r>
         <w:rPr>
           <w:lang w:eastAsia="es-ES"/>
         </w:rPr>
         <w:t>Visión general</w:t>
       </w:r>
-      <w:bookmarkEnd w:id="116"/>
+      <w:bookmarkEnd w:id="119"/>
     </w:p>
     <w:p>
       <w:pPr>
@@ -13342,7 +13348,7 @@
           <w:lang w:eastAsia="es-ES"/>
         </w:rPr>
       </w:pPr>
-      <w:bookmarkStart w:id="117" w:name="_Toc233913387"/>
+      <w:bookmarkStart w:id="120" w:name="_Toc234000066"/>
       <w:r>
         <w:rPr>
           <w:lang w:eastAsia="es-ES"/>
@@ -13350,7 +13356,7 @@
         <w:lastRenderedPageBreak/>
         <w:t>Algoritmos evaluados</w:t>
       </w:r>
-      <w:bookmarkEnd w:id="117"/>
+      <w:bookmarkEnd w:id="120"/>
     </w:p>
     <w:p>
       <w:pPr>
@@ -14510,14 +14516,14 @@
           <w:lang w:eastAsia="es-ES"/>
         </w:rPr>
       </w:pPr>
-      <w:bookmarkStart w:id="118" w:name="_Toc233913388"/>
+      <w:bookmarkStart w:id="121" w:name="_Toc234000067"/>
       <w:r>
         <w:rPr>
           <w:lang w:eastAsia="es-ES"/>
         </w:rPr>
         <w:t>Arquitectura</w:t>
       </w:r>
-      <w:bookmarkEnd w:id="118"/>
+      <w:bookmarkEnd w:id="121"/>
     </w:p>
     <w:p>
       <w:pPr>
@@ -14648,14 +14654,14 @@
           <w:lang w:eastAsia="es-ES"/>
         </w:rPr>
       </w:pPr>
-      <w:bookmarkStart w:id="119" w:name="_Toc233913389"/>
+      <w:bookmarkStart w:id="122" w:name="_Toc234000068"/>
       <w:r>
         <w:rPr>
           <w:lang w:eastAsia="es-ES"/>
         </w:rPr>
         <w:t>Frameworks</w:t>
       </w:r>
-      <w:bookmarkEnd w:id="119"/>
+      <w:bookmarkEnd w:id="122"/>
     </w:p>
     <w:p>
       <w:pPr>
@@ -17213,14 +17219,14 @@
           <w:lang w:eastAsia="es-ES"/>
         </w:rPr>
       </w:pPr>
-      <w:bookmarkStart w:id="120" w:name="_Toc233913390"/>
+      <w:bookmarkStart w:id="123" w:name="_Toc234000069"/>
       <w:r>
         <w:rPr>
           <w:lang w:eastAsia="es-ES"/>
         </w:rPr>
         <w:t>Imagen de Docker</w:t>
       </w:r>
-      <w:bookmarkEnd w:id="120"/>
+      <w:bookmarkEnd w:id="123"/>
     </w:p>
     <w:p>
       <w:pPr>
@@ -17301,14 +17307,14 @@
           <w:lang w:eastAsia="es-ES"/>
         </w:rPr>
       </w:pPr>
-      <w:bookmarkStart w:id="121" w:name="_Toc233913391"/>
+      <w:bookmarkStart w:id="124" w:name="_Toc234000070"/>
       <w:r>
         <w:rPr>
           <w:lang w:eastAsia="es-ES"/>
         </w:rPr>
         <w:t>Salida de datos</w:t>
       </w:r>
-      <w:bookmarkEnd w:id="121"/>
+      <w:bookmarkEnd w:id="124"/>
     </w:p>
     <w:p>
       <w:pPr>
@@ -19921,14 +19927,14 @@
           <w:lang w:eastAsia="es-ES"/>
         </w:rPr>
       </w:pPr>
-      <w:bookmarkStart w:id="122" w:name="_Toc233913392"/>
+      <w:bookmarkStart w:id="125" w:name="_Toc234000071"/>
       <w:r>
         <w:rPr>
           <w:lang w:eastAsia="es-ES"/>
         </w:rPr>
         <w:t>Requisitos del sistema</w:t>
       </w:r>
-      <w:bookmarkEnd w:id="122"/>
+      <w:bookmarkEnd w:id="125"/>
     </w:p>
     <w:p>
       <w:pPr>
@@ -19941,14 +19947,14 @@
           <w:lang w:eastAsia="es-ES"/>
         </w:rPr>
       </w:pPr>
-      <w:bookmarkStart w:id="123" w:name="_Toc233913393"/>
+      <w:bookmarkStart w:id="126" w:name="_Toc234000072"/>
       <w:r>
         <w:rPr>
           <w:lang w:eastAsia="es-ES"/>
         </w:rPr>
         <w:t>Requisitos funcionales</w:t>
       </w:r>
-      <w:bookmarkEnd w:id="123"/>
+      <w:bookmarkEnd w:id="126"/>
     </w:p>
     <w:tbl>
       <w:tblPr>
@@ -20383,14 +20389,14 @@
           <w:lang w:eastAsia="es-ES"/>
         </w:rPr>
       </w:pPr>
-      <w:bookmarkStart w:id="124" w:name="_Toc233913394"/>
+      <w:bookmarkStart w:id="127" w:name="_Toc234000073"/>
       <w:r>
         <w:rPr>
           <w:lang w:eastAsia="es-ES"/>
         </w:rPr>
         <w:t>Requisitos no funcionales</w:t>
       </w:r>
-      <w:bookmarkEnd w:id="124"/>
+      <w:bookmarkEnd w:id="127"/>
     </w:p>
     <w:tbl>
       <w:tblPr>
@@ -20669,14 +20675,14 @@
           <w:lang w:eastAsia="es-ES"/>
         </w:rPr>
       </w:pPr>
-      <w:bookmarkStart w:id="125" w:name="_Toc233913395"/>
+      <w:bookmarkStart w:id="128" w:name="_Toc234000074"/>
       <w:r>
         <w:rPr>
           <w:lang w:eastAsia="es-ES"/>
         </w:rPr>
         <w:t>Requisitos de entorno</w:t>
       </w:r>
-      <w:bookmarkEnd w:id="125"/>
+      <w:bookmarkEnd w:id="128"/>
     </w:p>
     <w:tbl>
       <w:tblPr>
@@ -21163,14 +21169,14 @@
           <w:lang w:eastAsia="es-ES"/>
         </w:rPr>
       </w:pPr>
-      <w:bookmarkStart w:id="126" w:name="_Toc233913396"/>
+      <w:bookmarkStart w:id="129" w:name="_Toc234000075"/>
       <w:r>
         <w:rPr>
           <w:lang w:eastAsia="es-ES"/>
         </w:rPr>
         <w:t>Especificación de las pruebas</w:t>
       </w:r>
-      <w:bookmarkEnd w:id="126"/>
+      <w:bookmarkEnd w:id="129"/>
     </w:p>
     <w:p>
       <w:r>
@@ -21253,14 +21259,14 @@
           <w:lang w:eastAsia="es-ES"/>
         </w:rPr>
       </w:pPr>
-      <w:bookmarkStart w:id="127" w:name="_Toc233913397"/>
+      <w:bookmarkStart w:id="130" w:name="_Toc234000076"/>
       <w:r>
         <w:rPr>
           <w:lang w:eastAsia="es-ES"/>
         </w:rPr>
         <w:t>Herramientas utilizadas</w:t>
       </w:r>
-      <w:bookmarkEnd w:id="127"/>
+      <w:bookmarkEnd w:id="130"/>
     </w:p>
     <w:p>
       <w:r>
@@ -21278,14 +21284,14 @@
           <w:lang w:eastAsia="es-ES"/>
         </w:rPr>
       </w:pPr>
-      <w:bookmarkStart w:id="128" w:name="_Toc233913398"/>
+      <w:bookmarkStart w:id="131" w:name="_Toc234000077"/>
       <w:r>
         <w:rPr>
           <w:lang w:eastAsia="es-ES"/>
         </w:rPr>
         <w:t>Docker</w:t>
       </w:r>
-      <w:bookmarkEnd w:id="128"/>
+      <w:bookmarkEnd w:id="131"/>
     </w:p>
     <w:p>
       <w:r>
@@ -21303,14 +21309,14 @@
           <w:lang w:eastAsia="es-ES"/>
         </w:rPr>
       </w:pPr>
-      <w:bookmarkStart w:id="129" w:name="_Toc233913399"/>
+      <w:bookmarkStart w:id="132" w:name="_Toc234000078"/>
       <w:r>
         <w:rPr>
           <w:lang w:eastAsia="es-ES"/>
         </w:rPr>
         <w:t>Python y uv</w:t>
       </w:r>
-      <w:bookmarkEnd w:id="129"/>
+      <w:bookmarkEnd w:id="132"/>
     </w:p>
     <w:p>
       <w:r>
@@ -21328,14 +21334,14 @@
           <w:lang w:eastAsia="es-ES"/>
         </w:rPr>
       </w:pPr>
-      <w:bookmarkStart w:id="130" w:name="_Toc233913400"/>
+      <w:bookmarkStart w:id="133" w:name="_Toc234000079"/>
       <w:r>
         <w:rPr>
           <w:lang w:eastAsia="es-ES"/>
         </w:rPr>
         <w:t>Rust y Cargo</w:t>
       </w:r>
-      <w:bookmarkEnd w:id="130"/>
+      <w:bookmarkEnd w:id="133"/>
     </w:p>
     <w:p>
       <w:r>
@@ -21365,7 +21371,7 @@
           <w:lang w:eastAsia="es-ES"/>
         </w:rPr>
       </w:pPr>
-      <w:bookmarkStart w:id="131" w:name="_Toc233913401"/>
+      <w:bookmarkStart w:id="134" w:name="_Toc234000080"/>
       <w:r>
         <w:rPr>
           <w:lang w:eastAsia="es-ES"/>
@@ -21373,7 +21379,7 @@
         <w:lastRenderedPageBreak/>
         <w:t>Supabase</w:t>
       </w:r>
-      <w:bookmarkEnd w:id="131"/>
+      <w:bookmarkEnd w:id="134"/>
     </w:p>
     <w:p>
       <w:r>
@@ -21391,14 +21397,14 @@
           <w:lang w:eastAsia="es-ES"/>
         </w:rPr>
       </w:pPr>
-      <w:bookmarkStart w:id="132" w:name="_Toc233913402"/>
+      <w:bookmarkStart w:id="135" w:name="_Toc234000081"/>
       <w:r>
         <w:rPr>
           <w:lang w:eastAsia="es-ES"/>
         </w:rPr>
         <w:t>Git y GitHub</w:t>
       </w:r>
-      <w:bookmarkEnd w:id="132"/>
+      <w:bookmarkEnd w:id="135"/>
     </w:p>
     <w:p>
       <w:r>
@@ -21416,14 +21422,14 @@
           <w:lang w:eastAsia="es-ES"/>
         </w:rPr>
       </w:pPr>
-      <w:bookmarkStart w:id="133" w:name="_Toc233913403"/>
+      <w:bookmarkStart w:id="136" w:name="_Toc234000082"/>
       <w:r>
         <w:rPr>
           <w:lang w:eastAsia="es-ES"/>
         </w:rPr>
         <w:t>Desarrollo del Proyecto</w:t>
       </w:r>
-      <w:bookmarkEnd w:id="133"/>
+      <w:bookmarkEnd w:id="136"/>
     </w:p>
     <w:p>
       <w:pPr>
@@ -21436,14 +21442,14 @@
           <w:lang w:eastAsia="es-ES"/>
         </w:rPr>
       </w:pPr>
-      <w:bookmarkStart w:id="134" w:name="_Toc233913404"/>
+      <w:bookmarkStart w:id="137" w:name="_Toc234000083"/>
       <w:r>
         <w:rPr>
           <w:lang w:eastAsia="es-ES"/>
         </w:rPr>
         <w:t>Hito: Revisión bibliográfica y definición de alcance</w:t>
       </w:r>
-      <w:bookmarkEnd w:id="134"/>
+      <w:bookmarkEnd w:id="137"/>
     </w:p>
     <w:p>
       <w:pPr>
@@ -21703,14 +21709,14 @@
           <w:lang w:eastAsia="es-ES"/>
         </w:rPr>
       </w:pPr>
-      <w:bookmarkStart w:id="135" w:name="_Toc233913405"/>
+      <w:bookmarkStart w:id="138" w:name="_Toc234000084"/>
       <w:r>
         <w:rPr>
           <w:lang w:eastAsia="es-ES"/>
         </w:rPr>
         <w:t>Hito: Diseño de la arquitectura del sistema</w:t>
       </w:r>
-      <w:bookmarkEnd w:id="135"/>
+      <w:bookmarkEnd w:id="138"/>
     </w:p>
     <w:p>
       <w:pPr>
@@ -21996,14 +22002,14 @@
           <w:lang w:eastAsia="es-ES"/>
         </w:rPr>
       </w:pPr>
-      <w:bookmarkStart w:id="136" w:name="_Toc233913406"/>
+      <w:bookmarkStart w:id="139" w:name="_Toc234000085"/>
       <w:r>
         <w:rPr>
           <w:lang w:eastAsia="es-ES"/>
         </w:rPr>
         <w:t>Hito: Implementación de Qiskit</w:t>
       </w:r>
-      <w:bookmarkEnd w:id="136"/>
+      <w:bookmarkEnd w:id="139"/>
     </w:p>
     <w:p>
       <w:pPr>
@@ -22112,14 +22118,7 @@
             <w:rFonts w:ascii="Cambria Math" w:hAnsi="Cambria Math"/>
             <w:lang w:eastAsia="es-ES"/>
           </w:rPr>
-          <m:t>.</m:t>
-        </m:r>
-        <m:r>
-          <w:rPr>
-            <w:rFonts w:ascii="Cambria Math" w:hAnsi="Cambria Math"/>
-            <w:lang w:eastAsia="es-ES"/>
-          </w:rPr>
-          <m:t>control</m:t>
+          <m:t>.control</m:t>
         </m:r>
         <m:d>
           <m:dPr>
@@ -22322,14 +22321,7 @@
             <w:rFonts w:ascii="Cambria Math" w:hAnsi="Cambria Math"/>
             <w:lang w:eastAsia="es-ES"/>
           </w:rPr>
-          <m:t>build_time</m:t>
-        </m:r>
-        <m:r>
-          <w:rPr>
-            <w:rFonts w:ascii="Cambria Math" w:hAnsi="Cambria Math"/>
-            <w:lang w:eastAsia="es-ES"/>
-          </w:rPr>
-          <m:t xml:space="preserve"> </m:t>
+          <m:t xml:space="preserve">build_time </m:t>
         </m:r>
       </m:oMath>
       <w:r>
@@ -22647,14 +22639,14 @@
           <w:lang w:eastAsia="es-ES"/>
         </w:rPr>
       </w:pPr>
-      <w:bookmarkStart w:id="137" w:name="_Toc233913407"/>
+      <w:bookmarkStart w:id="140" w:name="_Toc234000086"/>
       <w:r>
         <w:rPr>
           <w:lang w:eastAsia="es-ES"/>
         </w:rPr>
         <w:t>Hito: Implementación de Cirq</w:t>
       </w:r>
-      <w:bookmarkEnd w:id="137"/>
+      <w:bookmarkEnd w:id="140"/>
     </w:p>
     <w:p>
       <w:pPr>
@@ -22744,14 +22736,7 @@
             <w:rFonts w:ascii="Cambria Math" w:hAnsi="Cambria Math"/>
             <w:lang w:eastAsia="es-ES"/>
           </w:rPr>
-          <m:t>cirq.LineQubit.</m:t>
-        </m:r>
-        <m:r>
-          <w:rPr>
-            <w:rFonts w:ascii="Cambria Math" w:hAnsi="Cambria Math"/>
-            <w:lang w:eastAsia="es-ES"/>
-          </w:rPr>
-          <m:t>range</m:t>
+          <m:t>cirq.LineQubit.range</m:t>
         </m:r>
         <m:d>
           <m:dPr>
@@ -22894,14 +22879,7 @@
             <w:rFonts w:ascii="Cambria Math" w:hAnsi="Cambria Math"/>
             <w:lang w:eastAsia="es-ES"/>
           </w:rPr>
-          <m:t>cirq.Z.</m:t>
-        </m:r>
-        <m:r>
-          <w:rPr>
-            <w:rFonts w:ascii="Cambria Math" w:hAnsi="Cambria Math"/>
-            <w:lang w:eastAsia="es-ES"/>
-          </w:rPr>
-          <m:t>controlled</m:t>
+          <m:t>cirq.Z.controlled</m:t>
         </m:r>
         <m:d>
           <m:dPr>
@@ -22999,14 +22977,7 @@
             <w:rFonts w:ascii="Cambria Math" w:hAnsi="Cambria Math"/>
             <w:lang w:eastAsia="es-ES"/>
           </w:rPr>
-          <m:t>.</m:t>
-        </m:r>
-        <m:r>
-          <w:rPr>
-            <w:rFonts w:ascii="Cambria Math" w:hAnsi="Cambria Math"/>
-            <w:lang w:eastAsia="es-ES"/>
-          </w:rPr>
-          <m:t>control</m:t>
+          <m:t>.control</m:t>
         </m:r>
         <m:d>
           <m:dPr>
@@ -23390,14 +23361,7 @@
             <w:rFonts w:ascii="Cambria Math" w:hAnsi="Cambria Math"/>
             <w:lang w:eastAsia="es-ES"/>
           </w:rPr>
-          <m:t>cirq.</m:t>
-        </m:r>
-        <m:r>
-          <w:rPr>
-            <w:rFonts w:ascii="Cambria Math" w:hAnsi="Cambria Math"/>
-            <w:lang w:eastAsia="es-ES"/>
-          </w:rPr>
-          <m:t>qft</m:t>
+          <m:t>cirq.qft</m:t>
         </m:r>
         <m:d>
           <m:dPr>
@@ -23744,14 +23708,14 @@
           <w:lang w:eastAsia="es-ES"/>
         </w:rPr>
       </w:pPr>
-      <w:bookmarkStart w:id="138" w:name="_Toc233913408"/>
+      <w:bookmarkStart w:id="141" w:name="_Toc234000087"/>
       <w:r>
         <w:rPr>
           <w:lang w:eastAsia="es-ES"/>
         </w:rPr>
         <w:t>Hito: Implementación de CudaQ</w:t>
       </w:r>
-      <w:bookmarkEnd w:id="138"/>
+      <w:bookmarkEnd w:id="141"/>
     </w:p>
     <w:p>
       <w:pPr>
@@ -23799,14 +23763,7 @@
             <w:rFonts w:ascii="Cambria Math" w:hAnsi="Cambria Math"/>
             <w:lang w:eastAsia="es-ES"/>
           </w:rPr>
-          <m:t>cudaq.make_</m:t>
-        </m:r>
-        <m:r>
-          <w:rPr>
-            <w:rFonts w:ascii="Cambria Math" w:hAnsi="Cambria Math"/>
-            <w:lang w:eastAsia="es-ES"/>
-          </w:rPr>
-          <m:t>kernel</m:t>
+          <m:t>cudaq.make_kernel</m:t>
         </m:r>
         <m:d>
           <m:dPr>
@@ -23841,14 +23798,7 @@
             <w:rFonts w:ascii="Cambria Math" w:hAnsi="Cambria Math"/>
             <w:lang w:eastAsia="es-ES"/>
           </w:rPr>
-          <m:t>kernel.</m:t>
-        </m:r>
-        <m:r>
-          <w:rPr>
-            <w:rFonts w:ascii="Cambria Math" w:hAnsi="Cambria Math"/>
-            <w:lang w:eastAsia="es-ES"/>
-          </w:rPr>
-          <m:t>qalloc</m:t>
+          <m:t>kernel.qalloc</m:t>
         </m:r>
         <m:d>
           <m:dPr>
@@ -24015,14 +23965,7 @@
             <w:rFonts w:ascii="Cambria Math" w:hAnsi="Cambria Math"/>
             <w:lang w:eastAsia="es-ES"/>
           </w:rPr>
-          <m:t>cudaq.</m:t>
-        </m:r>
-        <m:r>
-          <w:rPr>
-            <w:rFonts w:ascii="Cambria Math" w:hAnsi="Cambria Math"/>
-            <w:lang w:eastAsia="es-ES"/>
-          </w:rPr>
-          <m:t>sample</m:t>
+          <m:t>cudaq.sample</m:t>
         </m:r>
         <m:d>
           <m:dPr>
@@ -24272,21 +24215,7 @@
                 <w:rFonts w:ascii="Cambria Math" w:hAnsi="Cambria Math"/>
                 <w:lang w:eastAsia="es-ES"/>
               </w:rPr>
-              <m:t>*y</m:t>
-            </m:r>
-            <m:r>
-              <w:rPr>
-                <w:rFonts w:ascii="Cambria Math" w:hAnsi="Cambria Math"/>
-                <w:lang w:eastAsia="es-ES"/>
-              </w:rPr>
-              <m:t xml:space="preserve"> mod </m:t>
-            </m:r>
-            <m:r>
-              <w:rPr>
-                <w:rFonts w:ascii="Cambria Math" w:hAnsi="Cambria Math"/>
-                <w:lang w:eastAsia="es-ES"/>
-              </w:rPr>
-              <m:t>N</m:t>
+              <m:t>*y mod N</m:t>
             </m:r>
           </m:e>
         </m:d>
@@ -24509,14 +24438,7 @@
                 <w:rFonts w:ascii="Cambria Math" w:eastAsiaTheme="minorEastAsia" w:hAnsi="Cambria Math"/>
                 <w:lang w:eastAsia="es-ES"/>
               </w:rPr>
-              <m:t>…</m:t>
-            </m:r>
-            <m:r>
-              <w:rPr>
-                <w:rFonts w:ascii="Cambria Math" w:eastAsiaTheme="minorEastAsia" w:hAnsi="Cambria Math"/>
-                <w:lang w:eastAsia="es-ES"/>
-              </w:rPr>
-              <m:t>, inverse=True</m:t>
+              <m:t>…, inverse=True</m:t>
             </m:r>
           </m:e>
         </m:d>
@@ -25029,14 +24951,14 @@
           <w:lang w:eastAsia="es-ES"/>
         </w:rPr>
       </w:pPr>
-      <w:bookmarkStart w:id="139" w:name="_Toc233913409"/>
+      <w:bookmarkStart w:id="142" w:name="_Toc234000088"/>
       <w:r>
         <w:rPr>
           <w:lang w:eastAsia="es-ES"/>
         </w:rPr>
         <w:t>Hito: Implementación de QDisLib y circuit cutting</w:t>
       </w:r>
-      <w:bookmarkEnd w:id="139"/>
+      <w:bookmarkEnd w:id="142"/>
     </w:p>
     <w:p>
       <w:pPr>
@@ -25697,14 +25619,14 @@
           <w:lang w:eastAsia="es-ES"/>
         </w:rPr>
       </w:pPr>
-      <w:bookmarkStart w:id="140" w:name="_Toc233913410"/>
+      <w:bookmarkStart w:id="143" w:name="_Toc234000089"/>
       <w:r>
         <w:rPr>
           <w:lang w:eastAsia="es-ES"/>
         </w:rPr>
         <w:t>Hito: Implementación de q1tsim</w:t>
       </w:r>
-      <w:bookmarkEnd w:id="140"/>
+      <w:bookmarkEnd w:id="143"/>
     </w:p>
     <w:p>
       <w:pPr>
@@ -26235,21 +26157,7 @@
                 <w:rFonts w:ascii="Cambria Math" w:hAnsi="Cambria Math"/>
                 <w:lang w:eastAsia="es-ES"/>
               </w:rPr>
-              <m:t>0</m:t>
-            </m:r>
-            <m:r>
-              <w:rPr>
-                <w:rFonts w:ascii="Cambria Math" w:hAnsi="Cambria Math"/>
-                <w:lang w:eastAsia="es-ES"/>
-              </w:rPr>
-              <m:t>…</m:t>
-            </m:r>
-            <m:r>
-              <w:rPr>
-                <w:rFonts w:ascii="Cambria Math" w:hAnsi="Cambria Math"/>
-                <w:lang w:eastAsia="es-ES"/>
-              </w:rPr>
-              <m:t>m</m:t>
+              <m:t>0…m</m:t>
             </m:r>
           </m:e>
         </m:d>
@@ -26340,21 +26248,7 @@
                 <w:rFonts w:ascii="Cambria Math" w:hAnsi="Cambria Math"/>
                 <w:lang w:eastAsia="es-ES"/>
               </w:rPr>
-              <m:t>m</m:t>
-            </m:r>
-            <m:r>
-              <w:rPr>
-                <w:rFonts w:ascii="Cambria Math" w:hAnsi="Cambria Math"/>
-                <w:lang w:eastAsia="es-ES"/>
-              </w:rPr>
-              <m:t>…</m:t>
-            </m:r>
-            <m:r>
-              <w:rPr>
-                <w:rFonts w:ascii="Cambria Math" w:hAnsi="Cambria Math"/>
-                <w:lang w:eastAsia="es-ES"/>
-              </w:rPr>
-              <m:t>m+w</m:t>
+              <m:t>m…m+w</m:t>
             </m:r>
           </m:e>
         </m:d>
@@ -26438,21 +26332,7 @@
                 <w:rFonts w:ascii="Cambria Math" w:hAnsi="Cambria Math"/>
                 <w:lang w:eastAsia="es-ES"/>
               </w:rPr>
-              <m:t>m+w</m:t>
-            </m:r>
-            <m:r>
-              <w:rPr>
-                <w:rFonts w:ascii="Cambria Math" w:hAnsi="Cambria Math"/>
-                <w:lang w:eastAsia="es-ES"/>
-              </w:rPr>
-              <m:t>…</m:t>
-            </m:r>
-            <m:r>
-              <w:rPr>
-                <w:rFonts w:ascii="Cambria Math" w:hAnsi="Cambria Math"/>
-                <w:lang w:eastAsia="es-ES"/>
-              </w:rPr>
-              <m:t>total</m:t>
+              <m:t>m+w…total</m:t>
             </m:r>
           </m:e>
         </m:d>
@@ -27053,7 +26933,7 @@
           <w:lang w:eastAsia="es-ES"/>
         </w:rPr>
       </w:pPr>
-      <w:bookmarkStart w:id="141" w:name="_Toc233913411"/>
+      <w:bookmarkStart w:id="144" w:name="_Toc234000090"/>
       <w:r>
         <w:rPr>
           <w:lang w:eastAsia="es-ES"/>
@@ -27061,7 +26941,7 @@
         <w:lastRenderedPageBreak/>
         <w:t>Hito: Implementación de quantr</w:t>
       </w:r>
-      <w:bookmarkEnd w:id="141"/>
+      <w:bookmarkEnd w:id="144"/>
     </w:p>
     <w:p>
       <w:pPr>
@@ -27409,21 +27289,7 @@
             <w:rFonts w:ascii="Cambria Math" w:hAnsi="Cambria Math"/>
             <w:lang w:eastAsia="es-ES"/>
           </w:rPr>
-          <m:t>n</m:t>
-        </m:r>
-        <m:r>
-          <w:rPr>
-            <w:rFonts w:ascii="Cambria Math" w:hAnsi="Cambria Math"/>
-            <w:lang w:eastAsia="es-ES"/>
-          </w:rPr>
-          <m:t>-</m:t>
-        </m:r>
-        <m:r>
-          <w:rPr>
-            <w:rFonts w:ascii="Cambria Math" w:hAnsi="Cambria Math"/>
-            <w:lang w:eastAsia="es-ES"/>
-          </w:rPr>
-          <m:t>2</m:t>
+          <m:t>n-2</m:t>
         </m:r>
       </m:oMath>
       <w:r>
@@ -27501,21 +27367,7 @@
             <w:rFonts w:ascii="Cambria Math" w:hAnsi="Cambria Math"/>
             <w:lang w:eastAsia="es-ES"/>
           </w:rPr>
-          <m:t>circuit.</m:t>
-        </m:r>
-        <m:r>
-          <w:rPr>
-            <w:rFonts w:ascii="Cambria Math" w:hAnsi="Cambria Math"/>
-            <w:lang w:eastAsia="es-ES"/>
-          </w:rPr>
-          <m:t>measur</m:t>
-        </m:r>
-        <m:r>
-          <w:rPr>
-            <w:rFonts w:ascii="Cambria Math" w:hAnsi="Cambria Math"/>
-            <w:lang w:eastAsia="es-ES"/>
-          </w:rPr>
-          <m:t>e_all</m:t>
+          <m:t>circuit.measure_all</m:t>
         </m:r>
         <m:d>
           <m:dPr>
@@ -28073,14 +27925,14 @@
           <w:lang w:eastAsia="es-ES"/>
         </w:rPr>
       </w:pPr>
-      <w:bookmarkStart w:id="142" w:name="_Toc233913412"/>
+      <w:bookmarkStart w:id="145" w:name="_Toc234000091"/>
       <w:r>
         <w:rPr>
           <w:lang w:eastAsia="es-ES"/>
         </w:rPr>
         <w:t>Hito: Implementación de quantrs2</w:t>
       </w:r>
-      <w:bookmarkEnd w:id="142"/>
+      <w:bookmarkEnd w:id="145"/>
     </w:p>
     <w:p>
       <w:pPr>
@@ -29023,14 +28875,14 @@
           <w:lang w:eastAsia="es-ES"/>
         </w:rPr>
       </w:pPr>
-      <w:bookmarkStart w:id="143" w:name="_Toc233913413"/>
+      <w:bookmarkStart w:id="146" w:name="_Toc234000092"/>
       <w:r>
         <w:rPr>
           <w:lang w:eastAsia="es-ES"/>
         </w:rPr>
         <w:t>Hito: Implementación de qcgpu</w:t>
       </w:r>
-      <w:bookmarkEnd w:id="143"/>
+      <w:bookmarkEnd w:id="146"/>
     </w:p>
     <w:p>
       <w:pPr>
@@ -29960,14 +29812,14 @@
           <w:lang w:eastAsia="es-ES"/>
         </w:rPr>
       </w:pPr>
-      <w:bookmarkStart w:id="144" w:name="_Toc233913414"/>
+      <w:bookmarkStart w:id="147" w:name="_Toc234000093"/>
       <w:r>
         <w:rPr>
           <w:lang w:eastAsia="es-ES"/>
         </w:rPr>
         <w:t>Hito: Infraestructura Docker y CI/CD</w:t>
       </w:r>
-      <w:bookmarkEnd w:id="144"/>
+      <w:bookmarkEnd w:id="147"/>
     </w:p>
     <w:p>
       <w:pPr>
@@ -30105,14 +29957,1082 @@
           <w:lang w:eastAsia="es-ES"/>
         </w:rPr>
       </w:pPr>
-      <w:bookmarkStart w:id="145" w:name="_Toc233913415"/>
+      <w:bookmarkStart w:id="148" w:name="_Toc234000094"/>
       <w:r>
         <w:rPr>
           <w:lang w:eastAsia="es-ES"/>
         </w:rPr>
         <w:t>Hito: Integración con Supabase</w:t>
       </w:r>
-      <w:bookmarkEnd w:id="145"/>
+      <w:bookmarkEnd w:id="148"/>
+    </w:p>
+    <w:p>
+      <w:pPr>
+        <w:rPr>
+          <w:lang w:eastAsia="es-ES"/>
+        </w:rPr>
+      </w:pPr>
+      <w:r>
+        <w:rPr>
+          <w:lang w:eastAsia="es-ES"/>
+        </w:rPr>
+        <w:t xml:space="preserve">La integración con Supabase parte de una decisión que, si bien podría parecer contraintuitiva a primera vista, resulta plenamente justificada una vez se analiza el contexto de ejecución del benchmark: se descartó el uso del SDK oficial de Supabase para Python y, en su lugar, se optó por realizar las peticiones HTTP directamente mediante urllib, que forma parte de la biblioteca estándar del lenguaje. El razonamiento es sencillo. El benchmark ya arrastra un conjunto de dependencias considerable, y añadir el SDK únicamente para efectuar peticiones POST resultaba difícil de defender, sobre todo si se tiene en cuenta que dicho SDK, internamente, no hace mucho más que envolver el propio urllib alrededor de la API PostgREST que Supabase expone. En este sentido, prescindir de una capa de abstracción que no aportaba valor real permitió mantener el entorno más ligero y con menos superficie de posibles conflictos de versiones. Las peticiones se dirigen al endpoint /rest/v1/benchmark_runs y, en cada una de ellas, se incluyen las cabeceras necesarias para que PostgREST las acepte: la cabecera apikey, la cabecera Authorization con el token Bearer, el Content-Type fijado a application/json y, por último, la cabecera Prefer con el valor </w:t>
+      </w:r>
+      <m:oMath>
+        <m:r>
+          <w:rPr>
+            <w:rFonts w:ascii="Cambria Math" w:hAnsi="Cambria Math"/>
+            <w:lang w:eastAsia="es-ES"/>
+          </w:rPr>
+          <m:t>return=minimal</m:t>
+        </m:r>
+      </m:oMath>
+      <w:r>
+        <w:rPr>
+          <w:lang w:eastAsia="es-ES"/>
+        </w:rPr>
+        <w:t>, que evita que el servidor devuelva la fila insertada y reduce así el tráfico de respuesta.</w:t>
+      </w:r>
+    </w:p>
+    <w:p>
+      <w:pPr>
+        <w:rPr>
+          <w:lang w:eastAsia="es-ES"/>
+        </w:rPr>
+      </w:pPr>
+      <w:r>
+        <w:rPr>
+          <w:lang w:eastAsia="es-ES"/>
+        </w:rPr>
+        <w:t xml:space="preserve">La configuración del cliente se apoya en dos variables, SUPABASE_URL y SUPABASE_KEY, que se cargan desde un fichero .env mediante os.getenv. Cabe mencionar que la activación de la persistencia remota no solo depende de que estas variables estén presentes. Existe un flag interno, USE_SUPABASE, que solo toma el valor True cuando se cumplen dos condiciones de forma simultánea: que las dos variables estén efectivamente definidas y que la ejecución no se encuentre en modo desarrollo, ya que el flag --dev desactiva por completo la escritura contra Supabase. De esta manera, se consigue que un desarrollador pueda ejecutar la evaluación de referencia en local y probar cambios sin arriesgarse a contaminar el conjunto de datos de producción con mediciones espurias o de prueba. Al arranque, además, se invoca una función auxiliar denominada </w:t>
+      </w:r>
+      <m:oMath>
+        <m:r>
+          <w:rPr>
+            <w:rFonts w:ascii="Cambria Math" w:hAnsi="Cambria Math"/>
+            <w:lang w:eastAsia="es-ES"/>
+          </w:rPr>
+          <m:t>_supabase_ping</m:t>
+        </m:r>
+        <m:d>
+          <m:dPr>
+            <m:ctrlPr>
+              <w:rPr>
+                <w:rFonts w:ascii="Cambria Math" w:hAnsi="Cambria Math"/>
+                <w:i/>
+                <w:lang w:eastAsia="es-ES"/>
+              </w:rPr>
+            </m:ctrlPr>
+          </m:dPr>
+          <m:e>
+            <m:r>
+              <w:rPr>
+                <w:rFonts w:ascii="Cambria Math" w:hAnsi="Cambria Math"/>
+                <w:lang w:eastAsia="es-ES"/>
+              </w:rPr>
+              <m:t xml:space="preserve"> </m:t>
+            </m:r>
+          </m:e>
+        </m:d>
+      </m:oMath>
+      <w:r>
+        <w:rPr>
+          <w:lang w:eastAsia="es-ES"/>
+        </w:rPr>
+        <w:t xml:space="preserve">, que lanza una petición GET a /rest/v1/benchmark_runs?limit=0 con el único objetivo de comprobar que el servicio es alcanzable; hay que tener en cuenta que esta comprobación es deliberadamente laxa, puesto que acepta como válido incluso un código de error HTTP, entendiendo que, si el servidor responde algo, por muy erróneo que sea, es que está disponible, y solo captura los fallos de red propiamente dichos. Existe también un smoke test en </w:t>
+      </w:r>
+      <m:oMath>
+        <m:r>
+          <w:rPr>
+            <w:rFonts w:ascii="Cambria Math" w:hAnsi="Cambria Math"/>
+            <w:lang w:eastAsia="es-ES"/>
+          </w:rPr>
+          <m:t>smoke_test.py</m:t>
+        </m:r>
+      </m:oMath>
+      <w:r>
+        <w:rPr>
+          <w:lang w:eastAsia="es-ES"/>
+        </w:rPr>
+        <w:t xml:space="preserve"> que realiza un ping muy similar, esta vez con un timeout de 10 segundos, y que igualmente interpreta los errores HTTP como señal de que el servicio responde.</w:t>
+      </w:r>
+    </w:p>
+    <w:p>
+      <w:pPr>
+        <w:rPr>
+          <w:lang w:eastAsia="es-ES"/>
+        </w:rPr>
+      </w:pPr>
+      <w:r>
+        <w:rPr>
+          <w:lang w:eastAsia="es-ES"/>
+        </w:rPr>
+        <w:t xml:space="preserve">El esquema de la tabla </w:t>
+      </w:r>
+      <m:oMath>
+        <m:r>
+          <w:rPr>
+            <w:rFonts w:ascii="Cambria Math" w:hAnsi="Cambria Math"/>
+            <w:lang w:eastAsia="es-ES"/>
+          </w:rPr>
+          <m:t>benchmark_runs</m:t>
+        </m:r>
+      </m:oMath>
+      <w:r>
+        <w:rPr>
+          <w:lang w:eastAsia="es-ES"/>
+        </w:rPr>
+        <w:t xml:space="preserve"> merece una explicación detenida, ya que su diseño condiciona gran parte de la lógica posterior. La decisión de fondo fue almacenar una fila por cada repetición del benchmark y no una fila por cada configuración medida. Esto tiene consecuencias directas en la estructura de columnas, que se puede agrupar conceptualmente en varios bloques. Por un lado, están las columnas de identidad de la ejecución, que son </w:t>
+      </w:r>
+      <w:r>
+        <w:rPr>
+          <w:lang w:eastAsia="es-ES"/>
+        </w:rPr>
+        <w:lastRenderedPageBreak/>
+        <w:t xml:space="preserve">idénticas en todas las filas pertenecientes a una misma ejecución: </w:t>
+      </w:r>
+      <m:oMath>
+        <m:r>
+          <w:rPr>
+            <w:rFonts w:ascii="Cambria Math" w:hAnsi="Cambria Math"/>
+            <w:lang w:eastAsia="es-ES"/>
+          </w:rPr>
+          <m:t>run_id</m:t>
+        </m:r>
+      </m:oMath>
+      <w:r>
+        <w:rPr>
+          <w:lang w:eastAsia="es-ES"/>
+        </w:rPr>
+        <w:t xml:space="preserve">, que se genera a partir de una marca temporal con el formato YYYYMMDD_HHMMSS, junto con las columnas </w:t>
+      </w:r>
+      <m:oMath>
+        <m:r>
+          <w:rPr>
+            <w:rFonts w:ascii="Cambria Math" w:hAnsi="Cambria Math"/>
+            <w:lang w:eastAsia="es-ES"/>
+          </w:rPr>
+          <m:t>contributor</m:t>
+        </m:r>
+      </m:oMath>
+      <w:r>
+        <w:rPr>
+          <w:lang w:eastAsia="es-ES"/>
+        </w:rPr>
+        <w:t xml:space="preserve">, </w:t>
+      </w:r>
+      <m:oMath>
+        <m:r>
+          <w:rPr>
+            <w:rFonts w:ascii="Cambria Math" w:hAnsi="Cambria Math"/>
+            <w:lang w:eastAsia="es-ES"/>
+          </w:rPr>
+          <m:t>platform_id</m:t>
+        </m:r>
+      </m:oMath>
+      <w:r>
+        <w:rPr>
+          <w:lang w:eastAsia="es-ES"/>
+        </w:rPr>
+        <w:t xml:space="preserve">, </w:t>
+      </w:r>
+      <m:oMath>
+        <m:r>
+          <w:rPr>
+            <w:rFonts w:ascii="Cambria Math" w:hAnsi="Cambria Math"/>
+            <w:lang w:eastAsia="es-ES"/>
+          </w:rPr>
+          <m:t>benchmark_image</m:t>
+        </m:r>
+      </m:oMath>
+      <w:r>
+        <w:rPr>
+          <w:lang w:eastAsia="es-ES"/>
+        </w:rPr>
+        <w:t xml:space="preserve">, </w:t>
+      </w:r>
+      <m:oMath>
+        <m:r>
+          <w:rPr>
+            <w:rFonts w:ascii="Cambria Math" w:hAnsi="Cambria Math"/>
+            <w:lang w:eastAsia="es-ES"/>
+          </w:rPr>
+          <m:t>gpu_enabled</m:t>
+        </m:r>
+      </m:oMath>
+      <w:r>
+        <w:rPr>
+          <w:lang w:eastAsia="es-ES"/>
+        </w:rPr>
+        <w:t xml:space="preserve"> y </w:t>
+      </w:r>
+      <m:oMath>
+        <m:r>
+          <w:rPr>
+            <w:rFonts w:ascii="Cambria Math" w:hAnsi="Cambria Math"/>
+            <w:lang w:eastAsia="es-ES"/>
+          </w:rPr>
+          <m:t>emulated</m:t>
+        </m:r>
+      </m:oMath>
+      <w:r>
+        <w:rPr>
+          <w:lang w:eastAsia="es-ES"/>
+        </w:rPr>
+        <w:t xml:space="preserve">. Por otro lado, se encuentra el bloque de hardware, también constante a lo largo de toda la ejecución y que incluye </w:t>
+      </w:r>
+      <m:oMath>
+        <m:r>
+          <w:rPr>
+            <w:rFonts w:ascii="Cambria Math" w:hAnsi="Cambria Math"/>
+            <w:lang w:eastAsia="es-ES"/>
+          </w:rPr>
+          <m:t>cpu_model</m:t>
+        </m:r>
+      </m:oMath>
+      <w:r>
+        <w:rPr>
+          <w:lang w:eastAsia="es-ES"/>
+        </w:rPr>
+        <w:t xml:space="preserve">, </w:t>
+      </w:r>
+      <m:oMath>
+        <m:r>
+          <w:rPr>
+            <w:rFonts w:ascii="Cambria Math" w:hAnsi="Cambria Math"/>
+            <w:lang w:eastAsia="es-ES"/>
+          </w:rPr>
+          <m:t>cpu_physical_cores</m:t>
+        </m:r>
+      </m:oMath>
+      <w:r>
+        <w:rPr>
+          <w:lang w:eastAsia="es-ES"/>
+        </w:rPr>
+        <w:t xml:space="preserve">, </w:t>
+      </w:r>
+      <m:oMath>
+        <m:r>
+          <w:rPr>
+            <w:rFonts w:ascii="Cambria Math" w:hAnsi="Cambria Math"/>
+            <w:lang w:eastAsia="es-ES"/>
+          </w:rPr>
+          <m:t>cpu_logical_cores</m:t>
+        </m:r>
+      </m:oMath>
+      <w:r>
+        <w:rPr>
+          <w:lang w:eastAsia="es-ES"/>
+        </w:rPr>
+        <w:t xml:space="preserve">, </w:t>
+      </w:r>
+      <m:oMath>
+        <m:r>
+          <w:rPr>
+            <w:rFonts w:ascii="Cambria Math" w:hAnsi="Cambria Math"/>
+            <w:lang w:eastAsia="es-ES"/>
+          </w:rPr>
+          <m:t>cpu_gflops</m:t>
+        </m:r>
+      </m:oMath>
+      <w:r>
+        <w:rPr>
+          <w:lang w:eastAsia="es-ES"/>
+        </w:rPr>
+        <w:t xml:space="preserve">, </w:t>
+      </w:r>
+      <m:oMath>
+        <m:r>
+          <w:rPr>
+            <w:rFonts w:ascii="Cambria Math" w:hAnsi="Cambria Math"/>
+            <w:lang w:eastAsia="es-ES"/>
+          </w:rPr>
+          <m:t>ram_total_gb</m:t>
+        </m:r>
+      </m:oMath>
+      <w:r>
+        <w:rPr>
+          <w:lang w:eastAsia="es-ES"/>
+        </w:rPr>
+        <w:t xml:space="preserve">, </w:t>
+      </w:r>
+      <m:oMath>
+        <m:r>
+          <w:rPr>
+            <w:rFonts w:ascii="Cambria Math" w:hAnsi="Cambria Math"/>
+            <w:lang w:eastAsia="es-ES"/>
+          </w:rPr>
+          <m:t>gpu_model</m:t>
+        </m:r>
+      </m:oMath>
+      <w:r>
+        <w:rPr>
+          <w:lang w:eastAsia="es-ES"/>
+        </w:rPr>
+        <w:t xml:space="preserve">, </w:t>
+      </w:r>
+      <m:oMath>
+        <m:r>
+          <w:rPr>
+            <w:rFonts w:ascii="Cambria Math" w:hAnsi="Cambria Math"/>
+            <w:lang w:eastAsia="es-ES"/>
+          </w:rPr>
+          <m:t>gpu_vram_gb</m:t>
+        </m:r>
+      </m:oMath>
+      <w:r>
+        <w:rPr>
+          <w:lang w:eastAsia="es-ES"/>
+        </w:rPr>
+        <w:t xml:space="preserve">, </w:t>
+      </w:r>
+      <m:oMath>
+        <m:r>
+          <w:rPr>
+            <w:rFonts w:ascii="Cambria Math" w:hAnsi="Cambria Math"/>
+            <w:lang w:eastAsia="es-ES"/>
+          </w:rPr>
+          <m:t>os</m:t>
+        </m:r>
+      </m:oMath>
+      <w:r>
+        <w:rPr>
+          <w:lang w:eastAsia="es-ES"/>
+        </w:rPr>
+        <w:t xml:space="preserve"> y </w:t>
+      </w:r>
+      <m:oMath>
+        <m:r>
+          <w:rPr>
+            <w:rFonts w:ascii="Cambria Math" w:hAnsi="Cambria Math"/>
+            <w:lang w:eastAsia="es-ES"/>
+          </w:rPr>
+          <m:t>os_version</m:t>
+        </m:r>
+      </m:oMath>
+      <w:r>
+        <w:rPr>
+          <w:lang w:eastAsia="es-ES"/>
+        </w:rPr>
+        <w:t xml:space="preserve">. A este respecto conviene detenerse en el campo </w:t>
+      </w:r>
+      <m:oMath>
+        <m:r>
+          <w:rPr>
+            <w:rFonts w:ascii="Cambria Math" w:hAnsi="Cambria Math"/>
+            <w:lang w:eastAsia="es-ES"/>
+          </w:rPr>
+          <m:t>cpu_gflops</m:t>
+        </m:r>
+      </m:oMath>
+      <w:r>
+        <w:rPr>
+          <w:lang w:eastAsia="es-ES"/>
+        </w:rPr>
+        <w:t xml:space="preserve"> no es un dato proporcionado por el sistema operativo, sino que se calcula al inicio de la ejecución mediante un microbenchmark de estilo Linpack. El objetivo es disponer de una métrica que permita normalizar el rendimiento entre máquinas heterogéneas, algo especialmente útil cuando los resultados provienen de contribuidores con equipos muy distintos entre sí.</w:t>
+      </w:r>
+    </w:p>
+    <w:p>
+      <w:pPr>
+        <w:rPr>
+          <w:lang w:eastAsia="es-ES"/>
+        </w:rPr>
+      </w:pPr>
+      <w:r>
+        <w:rPr>
+          <w:lang w:eastAsia="es-ES"/>
+        </w:rPr>
+        <w:t xml:space="preserve">El resto de las columnas se reparten entre las específicas de cada repetición y las que corresponden a estadísticas agregadas. Las primeras son </w:t>
+      </w:r>
+      <m:oMath>
+        <m:r>
+          <w:rPr>
+            <w:rFonts w:ascii="Cambria Math" w:hAnsi="Cambria Math"/>
+            <w:lang w:eastAsia="es-ES"/>
+          </w:rPr>
+          <m:t>repetition_index</m:t>
+        </m:r>
+      </m:oMath>
+      <w:r>
+        <w:rPr>
+          <w:lang w:eastAsia="es-ES"/>
+        </w:rPr>
+        <w:t xml:space="preserve">, </w:t>
+      </w:r>
+      <m:oMath>
+        <m:r>
+          <w:rPr>
+            <w:rFonts w:ascii="Cambria Math" w:eastAsiaTheme="minorEastAsia" w:hAnsi="Cambria Math"/>
+            <w:lang w:eastAsia="es-ES"/>
+          </w:rPr>
+          <m:t>wall_time_ms</m:t>
+        </m:r>
+      </m:oMath>
+      <w:r>
+        <w:rPr>
+          <w:lang w:eastAsia="es-ES"/>
+        </w:rPr>
+        <w:t xml:space="preserve"> y </w:t>
+      </w:r>
+      <m:oMath>
+        <m:r>
+          <w:rPr>
+            <w:rFonts w:ascii="Cambria Math" w:hAnsi="Cambria Math"/>
+            <w:lang w:eastAsia="es-ES"/>
+          </w:rPr>
+          <m:t>timestamp</m:t>
+        </m:r>
+      </m:oMath>
+      <w:r>
+        <w:rPr>
+          <w:lang w:eastAsia="es-ES"/>
+        </w:rPr>
+        <w:t xml:space="preserve">, y describen el resultado puntual de una única ejecución del algoritmo. Las segundas, en cambio, resumen el comportamiento del conjunto de repeticiones de una misma configuración y aquí se incluye una batería relativamente amplia de métricas: </w:t>
+      </w:r>
+      <m:oMath>
+        <m:r>
+          <w:rPr>
+            <w:rFonts w:ascii="Cambria Math" w:hAnsi="Cambria Math"/>
+            <w:lang w:eastAsia="es-ES"/>
+          </w:rPr>
+          <m:t>wall_time_median_ms</m:t>
+        </m:r>
+      </m:oMath>
+      <w:r>
+        <w:rPr>
+          <w:lang w:eastAsia="es-ES"/>
+        </w:rPr>
+        <w:t xml:space="preserve">, </w:t>
+      </w:r>
+      <m:oMath>
+        <m:r>
+          <w:rPr>
+            <w:rFonts w:ascii="Cambria Math" w:hAnsi="Cambria Math"/>
+            <w:lang w:eastAsia="es-ES"/>
+          </w:rPr>
+          <m:t>wall_time_iqr_ms</m:t>
+        </m:r>
+      </m:oMath>
+      <w:r>
+        <w:rPr>
+          <w:lang w:eastAsia="es-ES"/>
+        </w:rPr>
+        <w:t xml:space="preserve">, </w:t>
+      </w:r>
+      <m:oMath>
+        <m:r>
+          <w:rPr>
+            <w:rFonts w:ascii="Cambria Math" w:hAnsi="Cambria Math"/>
+            <w:lang w:eastAsia="es-ES"/>
+          </w:rPr>
+          <m:t>wall_time_mean_ms</m:t>
+        </m:r>
+      </m:oMath>
+      <w:r>
+        <w:rPr>
+          <w:lang w:eastAsia="es-ES"/>
+        </w:rPr>
+        <w:t xml:space="preserve">, </w:t>
+      </w:r>
+      <m:oMath>
+        <m:r>
+          <w:rPr>
+            <w:rFonts w:ascii="Cambria Math" w:hAnsi="Cambria Math"/>
+            <w:lang w:eastAsia="es-ES"/>
+          </w:rPr>
+          <m:t>wall_time_std_ms</m:t>
+        </m:r>
+      </m:oMath>
+      <w:r>
+        <w:rPr>
+          <w:lang w:eastAsia="es-ES"/>
+        </w:rPr>
+        <w:t xml:space="preserve">, </w:t>
+      </w:r>
+      <m:oMath>
+        <m:r>
+          <w:rPr>
+            <w:rFonts w:ascii="Cambria Math" w:hAnsi="Cambria Math"/>
+            <w:lang w:eastAsia="es-ES"/>
+          </w:rPr>
+          <m:t>build_time_ms</m:t>
+        </m:r>
+      </m:oMath>
+      <w:r>
+        <w:rPr>
+          <w:lang w:eastAsia="es-ES"/>
+        </w:rPr>
+        <w:t xml:space="preserve">, </w:t>
+      </w:r>
+      <m:oMath>
+        <m:r>
+          <w:rPr>
+            <w:rFonts w:ascii="Cambria Math" w:hAnsi="Cambria Math"/>
+            <w:lang w:eastAsia="es-ES"/>
+          </w:rPr>
+          <m:t>simulation_time_ms</m:t>
+        </m:r>
+      </m:oMath>
+      <w:r>
+        <w:rPr>
+          <w:lang w:eastAsia="es-ES"/>
+        </w:rPr>
+        <w:t xml:space="preserve">, </w:t>
+      </w:r>
+      <m:oMath>
+        <m:r>
+          <w:rPr>
+            <w:rFonts w:ascii="Cambria Math" w:hAnsi="Cambria Math"/>
+            <w:lang w:eastAsia="es-ES"/>
+          </w:rPr>
+          <m:t>startup_time_ms</m:t>
+        </m:r>
+      </m:oMath>
+      <w:r>
+        <w:rPr>
+          <w:lang w:eastAsia="es-ES"/>
+        </w:rPr>
+        <w:t xml:space="preserve">, </w:t>
+      </w:r>
+      <m:oMath>
+        <m:r>
+          <w:rPr>
+            <w:rFonts w:ascii="Cambria Math" w:hAnsi="Cambria Math"/>
+            <w:lang w:eastAsia="es-ES"/>
+          </w:rPr>
+          <m:t>subprocess_wall_time_ms</m:t>
+        </m:r>
+      </m:oMath>
+      <w:r>
+        <w:rPr>
+          <w:lang w:eastAsia="es-ES"/>
+        </w:rPr>
+        <w:t xml:space="preserve">, </w:t>
+      </w:r>
+      <m:oMath>
+        <m:r>
+          <w:rPr>
+            <w:rFonts w:ascii="Cambria Math" w:hAnsi="Cambria Math"/>
+            <w:lang w:eastAsia="es-ES"/>
+          </w:rPr>
+          <m:t>peak_memory_rss_mb</m:t>
+        </m:r>
+      </m:oMath>
+      <w:r>
+        <w:rPr>
+          <w:lang w:eastAsia="es-ES"/>
+        </w:rPr>
+        <w:t xml:space="preserve">, </w:t>
+      </w:r>
+      <m:oMath>
+        <m:r>
+          <w:rPr>
+            <w:rFonts w:ascii="Cambria Math" w:hAnsi="Cambria Math"/>
+            <w:lang w:eastAsia="es-ES"/>
+          </w:rPr>
+          <m:t>cpu_percent_mean</m:t>
+        </m:r>
+      </m:oMath>
+      <w:r>
+        <w:rPr>
+          <w:lang w:eastAsia="es-ES"/>
+        </w:rPr>
+        <w:t xml:space="preserve">, el </w:t>
+      </w:r>
+      <m:oMath>
+        <m:r>
+          <w:rPr>
+            <w:rFonts w:ascii="Cambria Math" w:hAnsi="Cambria Math"/>
+            <w:lang w:eastAsia="es-ES"/>
+          </w:rPr>
+          <m:t>jsd</m:t>
+        </m:r>
+      </m:oMath>
+      <w:r>
+        <w:rPr>
+          <w:lang w:eastAsia="es-ES"/>
+        </w:rPr>
+        <w:t xml:space="preserve"> o distancia de Jensen-Shannon, que se emplea en el caso de Grover, y el </w:t>
+      </w:r>
+      <m:oMath>
+        <m:r>
+          <w:rPr>
+            <w:rFonts w:ascii="Cambria Math" w:hAnsi="Cambria Math"/>
+            <w:lang w:eastAsia="es-ES"/>
+          </w:rPr>
+          <m:t>cv</m:t>
+        </m:r>
+      </m:oMath>
+      <w:r>
+        <w:rPr>
+          <w:lang w:eastAsia="es-ES"/>
+        </w:rPr>
+        <w:t xml:space="preserve"> o coeficiente de variación. A todo lo anterior se suman las columnas de </w:t>
+      </w:r>
+      <m:oMath>
+        <m:r>
+          <w:rPr>
+            <w:rFonts w:ascii="Cambria Math" w:hAnsi="Cambria Math"/>
+            <w:lang w:eastAsia="es-ES"/>
+          </w:rPr>
+          <m:t>estado</m:t>
+        </m:r>
+      </m:oMath>
+      <w:r>
+        <w:rPr>
+          <w:lang w:eastAsia="es-ES"/>
+        </w:rPr>
+        <w:t xml:space="preserve">, </w:t>
+      </w:r>
+      <m:oMath>
+        <m:r>
+          <w:rPr>
+            <w:rFonts w:ascii="Cambria Math" w:hAnsi="Cambria Math"/>
+            <w:lang w:eastAsia="es-ES"/>
+          </w:rPr>
+          <m:t>status</m:t>
+        </m:r>
+      </m:oMath>
+      <w:r>
+        <w:rPr>
+          <w:lang w:eastAsia="es-ES"/>
+        </w:rPr>
+        <w:t xml:space="preserve">, que toma los valores 'ok' o 'error', y </w:t>
+      </w:r>
+      <m:oMath>
+        <m:r>
+          <w:rPr>
+            <w:rFonts w:ascii="Cambria Math" w:hAnsi="Cambria Math"/>
+            <w:lang w:eastAsia="es-ES"/>
+          </w:rPr>
+          <m:t>error</m:t>
+        </m:r>
+      </m:oMath>
+      <w:r>
+        <w:rPr>
+          <w:lang w:eastAsia="es-ES"/>
+        </w:rPr>
+        <w:t xml:space="preserve">, que almacena el texto del fallo, si lo hay. Además, existen tres columnas propias del algoritmo de Shor: </w:t>
+      </w:r>
+      <m:oMath>
+        <m:r>
+          <w:rPr>
+            <w:rFonts w:ascii="Cambria Math" w:hAnsi="Cambria Math"/>
+            <w:lang w:eastAsia="es-ES"/>
+          </w:rPr>
+          <m:t>n_to_factor</m:t>
+        </m:r>
+      </m:oMath>
+      <w:r>
+        <w:rPr>
+          <w:lang w:eastAsia="es-ES"/>
+        </w:rPr>
+        <w:t xml:space="preserve">, </w:t>
+      </w:r>
+      <m:oMath>
+        <m:r>
+          <w:rPr>
+            <w:rFonts w:ascii="Cambria Math" w:hAnsi="Cambria Math"/>
+            <w:lang w:eastAsia="es-ES"/>
+          </w:rPr>
+          <m:t>factor_found</m:t>
+        </m:r>
+      </m:oMath>
+      <w:r>
+        <w:rPr>
+          <w:lang w:eastAsia="es-ES"/>
+        </w:rPr>
+        <w:t xml:space="preserve"> y </w:t>
+      </w:r>
+      <m:oMath>
+        <m:r>
+          <w:rPr>
+            <w:rFonts w:ascii="Cambria Math" w:hAnsi="Cambria Math"/>
+            <w:lang w:eastAsia="es-ES"/>
+          </w:rPr>
+          <m:t>success_rate</m:t>
+        </m:r>
+      </m:oMath>
+      <w:r>
+        <w:rPr>
+          <w:lang w:eastAsia="es-ES"/>
+        </w:rPr>
+        <w:t xml:space="preserve">, que quedan a NULL en las filas correspondientes a Grover, ya que no tienen sentido en ese contexto. Con el fin de acelerar las consultas más frecuentes, se definieron índices sobre </w:t>
+      </w:r>
+      <m:oMath>
+        <m:r>
+          <w:rPr>
+            <w:rFonts w:ascii="Cambria Math" w:hAnsi="Cambria Math"/>
+            <w:lang w:eastAsia="es-ES"/>
+          </w:rPr>
+          <m:t>run_id</m:t>
+        </m:r>
+      </m:oMath>
+      <w:r>
+        <w:rPr>
+          <w:lang w:eastAsia="es-ES"/>
+        </w:rPr>
+        <w:t>, sobre la pareja (</w:t>
+      </w:r>
+      <m:oMath>
+        <m:r>
+          <w:rPr>
+            <w:rFonts w:ascii="Cambria Math" w:hAnsi="Cambria Math"/>
+            <w:lang w:eastAsia="es-ES"/>
+          </w:rPr>
+          <m:t>framework</m:t>
+        </m:r>
+      </m:oMath>
+      <w:r>
+        <w:rPr>
+          <w:lang w:eastAsia="es-ES"/>
+        </w:rPr>
+        <w:t xml:space="preserve">, </w:t>
+      </w:r>
+      <m:oMath>
+        <m:r>
+          <w:rPr>
+            <w:rFonts w:ascii="Cambria Math" w:hAnsi="Cambria Math"/>
+            <w:lang w:eastAsia="es-ES"/>
+          </w:rPr>
+          <m:t>algorithm</m:t>
+        </m:r>
+      </m:oMath>
+      <w:r>
+        <w:rPr>
+          <w:lang w:eastAsia="es-ES"/>
+        </w:rPr>
+        <w:t xml:space="preserve">) y sobre </w:t>
+      </w:r>
+      <m:oMath>
+        <m:r>
+          <w:rPr>
+            <w:rFonts w:ascii="Cambria Math" w:hAnsi="Cambria Math"/>
+            <w:lang w:eastAsia="es-ES"/>
+          </w:rPr>
+          <m:t>contributor</m:t>
+        </m:r>
+      </m:oMath>
+      <w:r>
+        <w:rPr>
+          <w:lang w:eastAsia="es-ES"/>
+        </w:rPr>
+        <w:t>.</w:t>
+      </w:r>
+    </w:p>
+    <w:p>
+      <w:pPr>
+        <w:rPr>
+          <w:lang w:eastAsia="es-ES"/>
+        </w:rPr>
+      </w:pPr>
+      <w:r>
+        <w:rPr>
+          <w:lang w:eastAsia="es-ES"/>
+        </w:rPr>
+        <w:t>Puede resultar llamativo que los estadísticos agregados se dupliquen en todas las filas de una misma configuración. De hecho, se trata de una decisión que rompe deliberadamente con la normalización que cabría esperar en un diseño relacional ortodoxo. La justificación es de índole práctica. Al almacenar una fila por repetición, se gana la posibilidad de realizar consultas a nivel de repetición individual, lo que abre la puerta a análisis de valores atípicos, a estudios de dispersión y, en general, a una reproducibilidad más fiel, porque no se pierde la información granular que una agregación prematura habría descartado sin remedio. Ahora bien, mantener los agregados en cada fila, incluso si eso implica repetirlos, simplifica enormemente el trabajo de análisis posterior: una única sentencia SELECT devuelve simultáneamente tanto el dato en bruto de la repetición como el resumen estadístico de su configuración, sin necesidad de recurrir a joins ni a subconsultas. En cualquier caso, se trata de una denormalización consciente, asumida como el precio razonable a pagar por la comodidad de consulta, teniendo en cuenta, además, que el volumen de datos no es tan elevado como para que la redundancia suponga un problema grave de almacenamiento.</w:t>
+      </w:r>
+    </w:p>
+    <w:p>
+      <w:pPr>
+        <w:rPr>
+          <w:lang w:eastAsia="es-ES"/>
+        </w:rPr>
+      </w:pPr>
+      <w:r>
+        <w:rPr>
+          <w:lang w:eastAsia="es-ES"/>
+        </w:rPr>
+        <w:t xml:space="preserve">La construcción de las filas a partir de los resultados en bruto recae sobre una función, </w:t>
+      </w:r>
+      <m:oMath>
+        <m:r>
+          <w:rPr>
+            <w:rFonts w:ascii="Cambria Math" w:hAnsi="Cambria Math"/>
+            <w:lang w:eastAsia="es-ES"/>
+          </w:rPr>
+          <m:t>_expand_result_to_rows</m:t>
+        </m:r>
+      </m:oMath>
+      <w:r>
+        <w:rPr>
+          <w:lang w:eastAsia="es-ES"/>
+        </w:rPr>
+        <w:t xml:space="preserve">, que contempla varios escenarios según el estado del resultado. Cuando el estado es 'skip', la función devuelve una lista vacía y, por tanto, no se inserta nada, ya que se entiende que esa configuración no llegó a ejecutarse. Si el estado es 'error', se devuelve una sola fila con </w:t>
+      </w:r>
+      <m:oMath>
+        <m:r>
+          <w:rPr>
+            <w:rFonts w:ascii="Cambria Math" w:hAnsi="Cambria Math"/>
+            <w:lang w:eastAsia="es-ES"/>
+          </w:rPr>
+          <m:t>repetition_index</m:t>
+        </m:r>
+      </m:oMath>
+      <w:r>
+        <w:rPr>
+          <w:lang w:eastAsia="es-ES"/>
+        </w:rPr>
+        <w:t xml:space="preserve"> igual a 0 y </w:t>
+      </w:r>
+      <m:oMath>
+        <m:r>
+          <w:rPr>
+            <w:rFonts w:ascii="Cambria Math" w:hAnsi="Cambria Math"/>
+            <w:lang w:eastAsia="es-ES"/>
+          </w:rPr>
+          <m:t>wall_time_ms</m:t>
+        </m:r>
+      </m:oMath>
+      <w:r>
+        <w:rPr>
+          <w:lang w:eastAsia="es-ES"/>
+        </w:rPr>
+        <w:t xml:space="preserve"> a None, de modo que quede constancia del fallo sin fingir una medición que no existió. En el caso de un estado 'ok' que no </w:t>
+      </w:r>
+      <w:r>
+        <w:rPr>
+          <w:lang w:eastAsia="es-ES"/>
+        </w:rPr>
+        <w:lastRenderedPageBreak/>
+        <w:t xml:space="preserve">disponga de </w:t>
+      </w:r>
+      <m:oMath>
+        <m:r>
+          <w:rPr>
+            <w:rFonts w:ascii="Cambria Math" w:hAnsi="Cambria Math"/>
+            <w:lang w:eastAsia="es-ES"/>
+          </w:rPr>
+          <m:t>raw_times,</m:t>
+        </m:r>
+      </m:oMath>
+      <w:r>
+        <w:rPr>
+          <w:lang w:eastAsia="es-ES"/>
+        </w:rPr>
+        <w:t xml:space="preserve"> es decir, sin la serie de tiempos individuales, se genera igualmente una única fila con los datos agregados disponibles. Finalmente, cuando el estado es 'ok' y sí existen </w:t>
+      </w:r>
+      <m:oMath>
+        <m:r>
+          <w:rPr>
+            <w:rFonts w:ascii="Cambria Math" w:hAnsi="Cambria Math"/>
+            <w:lang w:eastAsia="es-ES"/>
+          </w:rPr>
+          <m:t>raw_times</m:t>
+        </m:r>
+      </m:oMath>
+      <w:r>
+        <w:rPr>
+          <w:lang w:eastAsia="es-ES"/>
+        </w:rPr>
+        <w:t xml:space="preserve">, se produce el caso general y más frecuente: una fila por cada repetición, con </w:t>
+      </w:r>
+      <m:oMath>
+        <m:r>
+          <w:rPr>
+            <w:rFonts w:ascii="Cambria Math" w:hAnsi="Cambria Math"/>
+            <w:lang w:eastAsia="es-ES"/>
+          </w:rPr>
+          <m:t>repetition_index</m:t>
+        </m:r>
+      </m:oMath>
+      <w:r>
+        <w:rPr>
+          <w:lang w:eastAsia="es-ES"/>
+        </w:rPr>
+        <w:t xml:space="preserve"> recorriendo el rango de </w:t>
+      </w:r>
+      <m:oMath>
+        <m:r>
+          <w:rPr>
+            <w:rFonts w:ascii="Cambria Math" w:hAnsi="Cambria Math"/>
+            <w:lang w:eastAsia="es-ES"/>
+          </w:rPr>
+          <m:t>0</m:t>
+        </m:r>
+      </m:oMath>
+      <w:r>
+        <w:rPr>
+          <w:lang w:eastAsia="es-ES"/>
+        </w:rPr>
+        <w:t xml:space="preserve"> a </w:t>
+      </w:r>
+      <m:oMath>
+        <m:r>
+          <w:rPr>
+            <w:rFonts w:ascii="Cambria Math" w:hAnsi="Cambria Math"/>
+            <w:lang w:eastAsia="es-ES"/>
+          </w:rPr>
+          <m:t>N-1</m:t>
+        </m:r>
+      </m:oMath>
+      <w:r>
+        <w:rPr>
+          <w:lang w:eastAsia="es-ES"/>
+        </w:rPr>
+        <w:t>, y todas ellas comparten los mismos estadísticos agregados calculados sobre el conjunto completo.</w:t>
+      </w:r>
+    </w:p>
+    <w:p>
+      <w:pPr>
+        <w:rPr>
+          <w:lang w:eastAsia="es-ES"/>
+        </w:rPr>
+      </w:pPr>
+      <w:r>
+        <w:rPr>
+          <w:lang w:eastAsia="es-ES"/>
+        </w:rPr>
+        <w:t xml:space="preserve">En cuanto al momento de la inserción, se tomó la decisión de escribir en Supabase de forma incremental y no al final de la ejecución completa. Concretamente, las filas se insertan cada vez que se completa un valor de </w:t>
+      </w:r>
+      <m:oMath>
+        <m:r>
+          <w:rPr>
+            <w:rFonts w:ascii="Cambria Math" w:hAnsi="Cambria Math"/>
+            <w:lang w:eastAsia="es-ES"/>
+          </w:rPr>
+          <m:t>n</m:t>
+        </m:r>
+      </m:oMath>
+      <w:r>
+        <w:rPr>
+          <w:lang w:eastAsia="es-ES"/>
+        </w:rPr>
+        <w:t xml:space="preserve"> qubits en el caso de Grover o un valor de </w:t>
+      </w:r>
+      <m:oMath>
+        <m:r>
+          <w:rPr>
+            <w:rFonts w:ascii="Cambria Math" w:hAnsi="Cambria Math"/>
+            <w:lang w:eastAsia="es-ES"/>
+          </w:rPr>
+          <m:t>N</m:t>
+        </m:r>
+      </m:oMath>
+      <w:r>
+        <w:rPr>
+          <w:lang w:eastAsia="es-ES"/>
+        </w:rPr>
+        <w:t xml:space="preserve"> en el caso de Shor, en lugar de acumularlas todas hasta el cierre del benchmark. Este enfoque incremental convive con una salvaguarda importante: la constante </w:t>
+      </w:r>
+      <m:oMath>
+        <m:r>
+          <w:rPr>
+            <w:rFonts w:ascii="Cambria Math" w:hAnsi="Cambria Math"/>
+            <w:lang w:eastAsia="es-ES"/>
+          </w:rPr>
+          <m:t>MIN_REPS_FOR_SAVE</m:t>
+        </m:r>
+      </m:oMath>
+      <w:r>
+        <w:rPr>
+          <w:lang w:eastAsia="es-ES"/>
+        </w:rPr>
+        <w:t xml:space="preserve">, fijada en 5, que hace que las filas solo se inserten si se han completado al menos cinco repeticiones para esa configuración. De este modo, se evita que los datos parciales o ruidosos, procedentes de ejecuciones que apenas llegaron a arrancar, terminen contaminando el conjunto de datos y distorsionando los análisis estadísticos que se basan en él. Conviene subrayar, por otra parte, que la escritura es un INSERT puro, sin ningún tipo de upsert ni gestión de conflictos mediante </w:t>
+      </w:r>
+      <m:oMath>
+        <m:r>
+          <w:rPr>
+            <w:rFonts w:ascii="Cambria Math" w:hAnsi="Cambria Math"/>
+            <w:lang w:eastAsia="es-ES"/>
+          </w:rPr>
+          <m:t>on_conflict</m:t>
+        </m:r>
+      </m:oMath>
+      <w:r>
+        <w:rPr>
+          <w:lang w:eastAsia="es-ES"/>
+        </w:rPr>
+        <w:t xml:space="preserve">, y esto es posible precisamente porque el </w:t>
+      </w:r>
+      <m:oMath>
+        <m:r>
+          <w:rPr>
+            <w:rFonts w:ascii="Cambria Math" w:hAnsi="Cambria Math"/>
+            <w:lang w:eastAsia="es-ES"/>
+          </w:rPr>
+          <m:t>run_id</m:t>
+        </m:r>
+      </m:oMath>
+      <w:r>
+        <w:rPr>
+          <w:lang w:eastAsia="es-ES"/>
+        </w:rPr>
+        <w:t xml:space="preserve"> se deriva de una marca temporal y, por construcción, es único en cada ejecución, de manera que dos ejecuciones distintas del mismo framework y del mismo n generarán </w:t>
+      </w:r>
+      <m:oMath>
+        <m:r>
+          <w:rPr>
+            <w:rFonts w:ascii="Cambria Math" w:hAnsi="Cambria Math"/>
+            <w:lang w:eastAsia="es-ES"/>
+          </w:rPr>
+          <m:t>run_id</m:t>
+        </m:r>
+      </m:oMath>
+      <w:r>
+        <w:rPr>
+          <w:lang w:eastAsia="es-ES"/>
+        </w:rPr>
+        <w:t xml:space="preserve"> diferentes y no podrán colisionar entre sí.</w:t>
+      </w:r>
+    </w:p>
+    <w:p>
+      <w:pPr>
+        <w:rPr>
+          <w:lang w:eastAsia="es-ES"/>
+        </w:rPr>
+      </w:pPr>
+      <w:r>
+        <w:rPr>
+          <w:lang w:eastAsia="es-ES"/>
+        </w:rPr>
+        <w:t xml:space="preserve">El tratamiento de errores sigue una filosofía deliberadamente permisiva que podría resumirse como un diseño del tipo fire-and-forget. La función </w:t>
+      </w:r>
+      <m:oMath>
+        <m:r>
+          <w:rPr>
+            <w:rFonts w:ascii="Cambria Math" w:hAnsi="Cambria Math"/>
+            <w:lang w:eastAsia="es-ES"/>
+          </w:rPr>
+          <m:t>_supabase_insert</m:t>
+        </m:r>
+      </m:oMath>
+      <w:r>
+        <w:rPr>
+          <w:lang w:eastAsia="es-ES"/>
+        </w:rPr>
+        <w:t xml:space="preserve"> captura tanto los errores HTTP como cualquier excepción general, imprime un aviso por consola y devuelve False, sin más consecuencias. No hay lógica de reintentos. Los fallos se registran y la ejecución continúa sin interrupción, asumiendo que las filas que no lograron insertarse simplemente se pierden. La ausencia de reintentos, que en otro contexto podría considerarse una carencia, aquí responde a una razón de peso: la ejecución del benchmark es crítica en el tiempo y un reintento HTTP que quedara pendiente de respuesta introduciría una latencia impredecible que falsearía las mediciones de las configuraciones siguientes, echando a perder precisamente aquello que el benchmark pretende medir con precisión. Además, cada petición dispone de un timeout de 30 segundos como límite de seguridad. Por último, en el modo de desarrollo existe una alternativa para la vía de escape: en lugar de escribir en la base de datos remota, los resultados se guardan en ficheros JSON locales, del tipo </w:t>
+      </w:r>
+      <m:oMath>
+        <m:r>
+          <w:rPr>
+            <w:rFonts w:ascii="Cambria Math" w:hAnsi="Cambria Math"/>
+            <w:lang w:eastAsia="es-ES"/>
+          </w:rPr>
+          <m:t>grover_TIMESTAMP.json</m:t>
+        </m:r>
+      </m:oMath>
+      <w:r>
+        <w:rPr>
+          <w:lang w:eastAsia="es-ES"/>
+        </w:rPr>
+        <w:t xml:space="preserve"> o </w:t>
+      </w:r>
+      <m:oMath>
+        <m:r>
+          <w:rPr>
+            <w:rFonts w:ascii="Cambria Math" w:hAnsi="Cambria Math"/>
+            <w:lang w:eastAsia="es-ES"/>
+          </w:rPr>
+          <m:t>shor_TIMESTAMP.json</m:t>
+        </m:r>
+      </m:oMath>
+      <w:r>
+        <w:rPr>
+          <w:lang w:eastAsia="es-ES"/>
+        </w:rPr>
+        <w:t>, que además incorporan checkpoints parciales. lo que permite trabajar en local sin conexión y conservar de todos modos un registro persistente de las mediciones realizadas.</w:t>
+      </w:r>
     </w:p>
     <w:p>
       <w:pPr>
@@ -30125,14 +31045,14 @@
           <w:lang w:eastAsia="es-ES"/>
         </w:rPr>
       </w:pPr>
-      <w:bookmarkStart w:id="146" w:name="_Toc233913416"/>
+      <w:bookmarkStart w:id="149" w:name="_Toc234000095"/>
       <w:r>
         <w:rPr>
           <w:lang w:eastAsia="es-ES"/>
         </w:rPr>
         <w:t>Hito: Ejecución del benchmark y recogida de datos</w:t>
       </w:r>
-      <w:bookmarkEnd w:id="146"/>
+      <w:bookmarkEnd w:id="149"/>
     </w:p>
     <w:p>
       <w:pPr>
@@ -30145,14 +31065,14 @@
           <w:lang w:eastAsia="es-ES"/>
         </w:rPr>
       </w:pPr>
-      <w:bookmarkStart w:id="147" w:name="_Toc233913417"/>
+      <w:bookmarkStart w:id="150" w:name="_Toc234000096"/>
       <w:r>
         <w:rPr>
           <w:lang w:eastAsia="es-ES"/>
         </w:rPr>
         <w:t>Hito: Redacción de la memoria TFG</w:t>
       </w:r>
-      <w:bookmarkEnd w:id="147"/>
+      <w:bookmarkEnd w:id="150"/>
       <w:r>
         <w:rPr>
           <w:lang w:eastAsia="es-ES"/>
@@ -30171,7 +31091,7 @@
           <w:lang w:eastAsia="es-ES"/>
         </w:rPr>
       </w:pPr>
-      <w:bookmarkStart w:id="148" w:name="_Toc233913418"/>
+      <w:bookmarkStart w:id="151" w:name="_Toc234000097"/>
       <w:r>
         <w:rPr>
           <w:lang w:eastAsia="es-ES"/>
@@ -30184,7 +31104,7 @@
         </w:rPr>
         <w:t>alidación del proyecto</w:t>
       </w:r>
-      <w:bookmarkEnd w:id="148"/>
+      <w:bookmarkEnd w:id="151"/>
     </w:p>
     <w:p>
       <w:pPr>
@@ -30204,11 +31124,12 @@
           <w:lang w:eastAsia="es-ES"/>
         </w:rPr>
       </w:pPr>
-      <w:bookmarkStart w:id="149" w:name="_Toc233913419"/>
-      <w:r>
-        <w:rPr>
-          <w:lang w:eastAsia="es-ES"/>
-        </w:rPr>
+      <w:bookmarkStart w:id="152" w:name="_Toc234000098"/>
+      <w:r>
+        <w:rPr>
+          <w:lang w:eastAsia="es-ES"/>
+        </w:rPr>
+        <w:lastRenderedPageBreak/>
         <w:t>Planificación</w:t>
       </w:r>
       <w:r>
@@ -30253,7 +31174,7 @@
         </w:rPr>
         <w:t xml:space="preserve"> proyecto</w:t>
       </w:r>
-      <w:bookmarkEnd w:id="149"/>
+      <w:bookmarkEnd w:id="152"/>
     </w:p>
     <w:p>
       <w:pPr>
@@ -30266,14 +31187,14 @@
           <w:lang w:eastAsia="es-ES"/>
         </w:rPr>
       </w:pPr>
-      <w:bookmarkStart w:id="150" w:name="_Toc233913420"/>
+      <w:bookmarkStart w:id="153" w:name="_Toc234000099"/>
       <w:r>
         <w:rPr>
           <w:lang w:eastAsia="es-ES"/>
         </w:rPr>
         <w:t>Impacto social y medioambiental</w:t>
       </w:r>
-      <w:bookmarkEnd w:id="150"/>
+      <w:bookmarkEnd w:id="153"/>
     </w:p>
     <w:p>
       <w:pPr>
@@ -30286,14 +31207,14 @@
           <w:lang w:eastAsia="es-ES"/>
         </w:rPr>
       </w:pPr>
-      <w:bookmarkStart w:id="151" w:name="_Toc233913421"/>
+      <w:bookmarkStart w:id="154" w:name="_Toc234000100"/>
       <w:r>
         <w:rPr>
           <w:lang w:eastAsia="es-ES"/>
         </w:rPr>
         <w:t>Conclusiones</w:t>
       </w:r>
-      <w:bookmarkEnd w:id="151"/>
+      <w:bookmarkEnd w:id="154"/>
     </w:p>
     <w:p>
       <w:pPr>
@@ -30306,14 +31227,14 @@
           <w:lang w:eastAsia="es-ES"/>
         </w:rPr>
       </w:pPr>
-      <w:bookmarkStart w:id="152" w:name="_Toc233913422"/>
+      <w:bookmarkStart w:id="155" w:name="_Toc234000101"/>
       <w:r>
         <w:rPr>
           <w:lang w:eastAsia="es-ES"/>
         </w:rPr>
         <w:t>Líneas futuras</w:t>
       </w:r>
-      <w:bookmarkEnd w:id="152"/>
+      <w:bookmarkEnd w:id="155"/>
     </w:p>
     <w:p>
       <w:pPr>
@@ -30326,14 +31247,14 @@
           <w:lang w:eastAsia="es-ES"/>
         </w:rPr>
       </w:pPr>
-      <w:bookmarkStart w:id="153" w:name="_Toc233913423"/>
+      <w:bookmarkStart w:id="156" w:name="_Toc234000102"/>
       <w:r>
         <w:rPr>
           <w:lang w:eastAsia="es-ES"/>
         </w:rPr>
         <w:t>Glosario de términos</w:t>
       </w:r>
-      <w:bookmarkEnd w:id="153"/>
+      <w:bookmarkEnd w:id="156"/>
     </w:p>
     <w:p>
       <w:pPr>
@@ -30346,16 +31267,16 @@
           <w:lang w:eastAsia="es-ES"/>
         </w:rPr>
       </w:pPr>
-      <w:bookmarkStart w:id="154" w:name="_Toc233913424"/>
+      <w:bookmarkStart w:id="157" w:name="_Toc234000103"/>
       <w:r>
         <w:rPr>
           <w:lang w:eastAsia="es-ES"/>
         </w:rPr>
         <w:t>Anexos</w:t>
       </w:r>
-      <w:bookmarkEnd w:id="154"/>
+      <w:bookmarkEnd w:id="157"/>
     </w:p>
-    <w:bookmarkStart w:id="155" w:name="_Toc233913425" w:displacedByCustomXml="next"/>
+    <w:bookmarkStart w:id="158" w:name="_Toc234000104" w:displacedByCustomXml="next"/>
     <w:sdt>
       <w:sdtPr>
         <w:rPr>
@@ -30379,7 +31300,7 @@
           <w:r>
             <w:t>Bibliografía</w:t>
           </w:r>
-          <w:bookmarkEnd w:id="155"/>
+          <w:bookmarkEnd w:id="158"/>
         </w:p>
         <w:sdt>
           <w:sdtPr>
@@ -30387,7 +31308,7 @@
             <w:bibliography/>
           </w:sdtPr>
           <w:sdtContent>
-            <w:commentRangeStart w:id="156" w:displacedByCustomXml="prev"/>
+            <w:commentRangeStart w:id="159" w:displacedByCustomXml="prev"/>
             <w:p>
               <w:pPr>
                 <w:rPr>
@@ -30595,7 +31516,6 @@
                       <w:rPr>
                         <w:noProof/>
                       </w:rPr>
-                      <w:lastRenderedPageBreak/>
                       <w:t xml:space="preserve">[4] </w:t>
                     </w:r>
                   </w:p>
@@ -30646,14 +31566,14 @@
                 </w:rPr>
                 <w:fldChar w:fldCharType="end"/>
               </w:r>
-              <w:commentRangeEnd w:id="156"/>
+              <w:commentRangeEnd w:id="159"/>
               <w:r>
                 <w:rPr>
                   <w:rStyle w:val="CommentReference"/>
                   <w:sz w:val="22"/>
                   <w:szCs w:val="22"/>
                 </w:rPr>
-                <w:commentReference w:id="156"/>
+                <w:commentReference w:id="159"/>
               </w:r>
             </w:p>
           </w:sdtContent>
@@ -30689,7 +31609,7 @@
       </w:r>
     </w:p>
   </w:comment>
-  <w:comment w:id="156" w:author="SERGIO GIL BORRAS" w:date="2024-09-07T10:27:00Z" w:initials="SGB">
+  <w:comment w:id="159" w:author="SERGIO GIL BORRAS" w:date="2024-09-07T10:27:00Z" w:initials="SGB">
     <w:p>
       <w:pPr>
         <w:pStyle w:val="CommentText"/>

</xml_diff>